<commit_message>
Fix all approach naming and consistency issues
Major fixes:
- Reordered approaches to 1, 2, 3 sequence in Summary doc (was 3, 2, 1)
- Fixed Section 8.6 to describe correct approach (Enrichment Hook, not Pre-Compute)
- Corrected Approach 3 header from "Approach 1: Inline Compute" to "Approach 3: Pre-Compute"
- Updated comparison tables: TDS entity creation and Payment ID response clarity
- Synchronized all approach references across both documents
- Regenerated DOCX with all fixes

Co-Authored-By: Claude Sonnet 4.5 <noreply@anthropic.com>
</commit_message>
<xml_diff>
--- a/TDS_Payout_Integration_Tech_Spec_Summary.docx
+++ b/TDS_Payout_Integration_Tech_Spec_Summary.docx
@@ -2903,7 +2903,7 @@
           <w:color w:val="0F172A"/>
           <w:sz w:val="24"/>
         </w:rPr>
-        <w:t>Selected: Enrichment Hook Pattern (Minimal Inline Compute)</w:t>
+        <w:t>Selected: Enrichment Hook Pattern</w:t>
       </w:r>
     </w:p>
     <w:p>
@@ -3271,7 +3271,7 @@
                 <w:i w:val="0"/>
                 <w:sz w:val="22"/>
               </w:rPr>
-              <w:t>Alternative (breaks one-stop requirement)</w:t>
+              <w:t>Not Recommended (breaks one-stop requirement)</w:t>
             </w:r>
           </w:p>
         </w:tc>
@@ -3290,7 +3290,7 @@
         <w:pStyle w:val="Heading3"/>
       </w:pPr>
       <w:r>
-        <w:t>Approach 1: Inline Compute Pattern (Not Recommended)</w:t>
+        <w:t>Approach 1: Enrichment Hook Pattern — SELECTED</w:t>
       </w:r>
     </w:p>
     <w:p>
@@ -3299,12 +3299,17 @@
           <w:i/>
           <w:sz w:val="20"/>
         </w:rPr>
-        <w:t>Not Recommended — Payout API accepts TDS inputs; Payouts calls Tax-Compliance internally (S2S); async TDS entity creation</w:t>
+        <w:t>RECOMMENDED - All Channels — Payouts accepts optional TDS fields; makes lightweight sync enrichment call if present; single API for merchants</w:t>
       </w:r>
     </w:p>
     <w:p>
       <w:pPr>
-        <w:spacing w:before="160" w:after="40"/>
+        <w:shd w:val="clear" w:color="auto" w:fill="F0FDF4"/>
+        <w:pBdr>
+          <w:left w:val="single" w:sz="18" w:space="6" w:color="1A73E8"/>
+        </w:pBdr>
+        <w:spacing w:before="80" w:after="40"/>
+        <w:ind w:left="120"/>
       </w:pPr>
       <w:r>
         <w:rPr>
@@ -3313,17 +3318,78 @@
           <w:color w:val="0F172A"/>
           <w:sz w:val="24"/>
         </w:rPr>
-        <w:t>How It Works</w:t>
+        <w:t>Core Principle: Single API Call with Minimal Payouts Changes</w:t>
       </w:r>
     </w:p>
     <w:p>
+      <w:pPr>
+        <w:shd w:val="clear" w:color="auto" w:fill="F0FDF4"/>
+        <w:pBdr>
+          <w:left w:val="single" w:sz="18" w:space="6" w:color="1A73E8"/>
+        </w:pBdr>
+        <w:spacing w:before="0" w:after="40"/>
+        <w:ind w:left="120"/>
+      </w:pPr>
       <w:r>
         <w:rPr>
           <w:b w:val="0"/>
           <w:i w:val="0"/>
           <w:sz w:val="22"/>
         </w:rPr>
-        <w:t xml:space="preserve"> The Payouts service accepts TDS computation inputs (gross amount, category, contact details) and internally calls the Tax-Compliance service to compute TDS before creating the payout. </w:t>
+        <w:t xml:space="preserve"> Payouts API accepts optional TDS fields (category_id, gross_amount, apply_ldc). If these fields are present, Payouts makes a </w:t>
+      </w:r>
+      <w:r>
+        <w:rPr>
+          <w:b/>
+          <w:i w:val="0"/>
+          <w:sz w:val="22"/>
+        </w:rPr>
+        <w:t>lightweight synchronous call (~50-100ms)</w:t>
+      </w:r>
+      <w:r>
+        <w:rPr>
+          <w:b w:val="0"/>
+          <w:i w:val="0"/>
+          <w:sz w:val="22"/>
+        </w:rPr>
+        <w:t xml:space="preserve"> to Tax-Compliance enrichment endpoint. Tax-Compliance computes TDS, creates tds_payments entity, and returns enriched data. Payouts uses the enriched net_amount for payout creation. </w:t>
+      </w:r>
+      <w:r>
+        <w:rPr>
+          <w:b/>
+          <w:i w:val="0"/>
+          <w:sz w:val="22"/>
+        </w:rPr>
+        <w:t>Merchants make ONE API call; zero domain leak to Payouts.</w:t>
+      </w:r>
+    </w:p>
+    <w:p>
+      <w:pPr>
+        <w:spacing w:before="0" w:after="80"/>
+      </w:pPr>
+    </w:p>
+    <w:p>
+      <w:pPr>
+        <w:spacing w:before="160" w:after="40"/>
+      </w:pPr>
+      <w:r>
+        <w:rPr>
+          <w:b/>
+          <w:i w:val="0"/>
+          <w:color w:val="0F172A"/>
+          <w:sz w:val="24"/>
+        </w:rPr>
+        <w:t>How It Works</w:t>
+      </w:r>
+    </w:p>
+    <w:p>
+      <w:r>
+        <w:rPr>
+          <w:b w:val="0"/>
+          <w:i w:val="0"/>
+          <w:sz w:val="22"/>
+        </w:rPr>
+        <w:t xml:space="preserve"> This approach adds a minimal, optional enrichment hook in Payouts. When TDS fields are absent, Payouts behaves exactly as before (zero impact). When TDS fields are present, Payouts delegates computation to Tax-Compliance and uses the enriched response. </w:t>
       </w:r>
     </w:p>
     <w:p>
@@ -3366,7 +3432,7 @@
           <w:i w:val="0"/>
           <w:sz w:val="22"/>
         </w:rPr>
-        <w:t>Preview (UI only):</w:t>
+        <w:t>API Request:</w:t>
       </w:r>
       <w:r>
         <w:rPr>
@@ -3374,7 +3440,7 @@
           <w:i w:val="0"/>
           <w:sz w:val="22"/>
         </w:rPr>
-        <w:t xml:space="preserve"> Tax-Compliance (BFF) computes TDS to show breakdown to merchant</w:t>
+        <w:t xml:space="preserve"> Merchant calls Payouts API with optional TDS fields: </w:t>
       </w:r>
     </w:p>
     <w:p>
@@ -3398,7 +3464,7 @@
           <w:i w:val="0"/>
           <w:sz w:val="22"/>
         </w:rPr>
-        <w:t>Create Payout:</w:t>
+        <w:t>Enrichment Hook (if TDS fields present):</w:t>
       </w:r>
       <w:r>
         <w:rPr>
@@ -3406,7 +3472,7 @@
           <w:i w:val="0"/>
           <w:sz w:val="22"/>
         </w:rPr>
-        <w:t xml:space="preserve"> Tax-Compliance sends TDS inputs to Payouts API with gross amount</w:t>
+        <w:t xml:space="preserve"> Payouts calls Tax-Compliance internal enrichment API: </w:t>
       </w:r>
     </w:p>
     <w:p>
@@ -3430,7 +3496,7 @@
           <w:i w:val="0"/>
           <w:sz w:val="22"/>
         </w:rPr>
-        <w:t>Inline Compute:</w:t>
+        <w:t>Payout Creation:</w:t>
       </w:r>
       <w:r>
         <w:rPr>
@@ -3438,7 +3504,7 @@
           <w:i w:val="0"/>
           <w:sz w:val="22"/>
         </w:rPr>
-        <w:t xml:space="preserve"> Payouts makes S2S call to Tax-Compliance compute API</w:t>
+        <w:t xml:space="preserve"> Payouts creates payout with: </w:t>
       </w:r>
     </w:p>
     <w:p>
@@ -3462,7 +3528,7 @@
           <w:i w:val="0"/>
           <w:sz w:val="22"/>
         </w:rPr>
-        <w:t>Amount Derivation:</w:t>
+        <w:t>Event Emission:</w:t>
       </w:r>
       <w:r>
         <w:rPr>
@@ -3470,7 +3536,7 @@
           <w:i w:val="0"/>
           <w:sz w:val="22"/>
         </w:rPr>
-        <w:t xml:space="preserve"> Payouts derives net amount (gross - TDS) and stores payout with net amount</w:t>
+        <w:t xml:space="preserve"> Payouts emits status change events (existing mechanism)</w:t>
       </w:r>
     </w:p>
     <w:p>
@@ -3494,7 +3560,7 @@
           <w:i w:val="0"/>
           <w:sz w:val="22"/>
         </w:rPr>
-        <w:t>Async TDS Entity:</w:t>
+        <w:t>TDS Entity Update:</w:t>
       </w:r>
       <w:r>
         <w:rPr>
@@ -3502,7 +3568,7 @@
           <w:i w:val="0"/>
           <w:sz w:val="22"/>
         </w:rPr>
-        <w:t xml:space="preserve"> When payout reaches terminal state, Payouts publishes to Kafka; Tax-Compliance creates TDS Payment entity</w:t>
+        <w:t xml:space="preserve"> Tax-Compliance listens to payout events and updates tds_payments entity (PENDING → SUCCESS/FAILED)</w:t>
       </w:r>
     </w:p>
     <w:p>
@@ -3531,7 +3597,7 @@
       <w:r>
         <w:drawing>
           <wp:inline xmlns:a="http://schemas.openxmlformats.org/drawingml/2006/main" xmlns:pic="http://schemas.openxmlformats.org/drawingml/2006/picture">
-            <wp:extent cx="5486400" cy="4307196"/>
+            <wp:extent cx="5486400" cy="3667944"/>
             <wp:docPr id="1" name="Picture 1"/>
             <wp:cNvGraphicFramePr>
               <a:graphicFrameLocks noChangeAspect="1"/>
@@ -3545,1519 +3611,6 @@
                   </pic:nvPicPr>
                   <pic:blipFill>
                     <a:blip r:embed="rId11"/>
-                    <a:stretch>
-                      <a:fillRect/>
-                    </a:stretch>
-                  </pic:blipFill>
-                  <pic:spPr>
-                    <a:xfrm>
-                      <a:off x="0" y="0"/>
-                      <a:ext cx="5486400" cy="4307196"/>
-                    </a:xfrm>
-                    <a:prstGeom prst="rect"/>
-                  </pic:spPr>
-                </pic:pic>
-              </a:graphicData>
-            </a:graphic>
-          </wp:inline>
-        </w:drawing>
-      </w:r>
-    </w:p>
-    <w:p/>
-    <w:p>
-      <w:pPr>
-        <w:spacing w:before="160" w:after="40"/>
-      </w:pPr>
-      <w:r>
-        <w:rPr>
-          <w:b/>
-          <w:i w:val="0"/>
-          <w:color w:val="0F172A"/>
-          <w:sz w:val="24"/>
-        </w:rPr>
-        <w:t>Payout Type Considerations</w:t>
-      </w:r>
-    </w:p>
-    <w:tbl>
-      <w:tblPr>
-        <w:tblStyle w:val="TableGrid"/>
-        <w:tblW w:type="auto" w:w="0"/>
-        <w:tblLook w:firstColumn="1" w:firstRow="1" w:lastColumn="0" w:lastRow="0" w:noHBand="0" w:noVBand="1" w:val="04A0"/>
-        <w:tblBorders>
-          <w:top w:val="single" w:sz="4" w:color="CCCCCC"/>
-          <w:left w:val="single" w:sz="4" w:color="CCCCCC"/>
-          <w:bottom w:val="single" w:sz="4" w:color="CCCCCC"/>
-          <w:right w:val="single" w:sz="4" w:color="CCCCCC"/>
-          <w:insideH w:val="single" w:sz="4" w:color="CCCCCC"/>
-          <w:insideV w:val="single" w:sz="4" w:color="CCCCCC"/>
-        </w:tblBorders>
-      </w:tblPr>
-      <w:tblGrid>
-        <w:gridCol w:w="4703"/>
-        <w:gridCol w:w="4703"/>
-      </w:tblGrid>
-      <w:tr>
-        <w:tc>
-          <w:tcPr>
-            <w:tcW w:type="dxa" w:w="4703"/>
-            <w:shd w:val="clear" w:color="auto" w:fill="1A73E8"/>
-          </w:tcPr>
-          <w:p>
-            <w:r>
-              <w:rPr>
-                <w:b/>
-                <w:i w:val="0"/>
-                <w:color w:val="FFFFFF"/>
-                <w:sz w:val="22"/>
-              </w:rPr>
-              <w:t>Payout Type</w:t>
-            </w:r>
-          </w:p>
-        </w:tc>
-        <w:tc>
-          <w:tcPr>
-            <w:tcW w:type="dxa" w:w="4703"/>
-            <w:shd w:val="clear" w:color="auto" w:fill="1A73E8"/>
-          </w:tcPr>
-          <w:p>
-            <w:r>
-              <w:rPr>
-                <w:b/>
-                <w:i w:val="0"/>
-                <w:color w:val="FFFFFF"/>
-                <w:sz w:val="22"/>
-              </w:rPr>
-              <w:t>Impact</w:t>
-            </w:r>
-          </w:p>
-        </w:tc>
-      </w:tr>
-      <w:tr>
-        <w:tc>
-          <w:tcPr>
-            <w:tcW w:type="dxa" w:w="4703"/>
-            <w:shd w:val="clear" w:color="auto" w:fill="FFFFFF"/>
-          </w:tcPr>
-          <w:p>
-            <w:r>
-              <w:rPr>
-                <w:b/>
-                <w:i w:val="0"/>
-                <w:sz w:val="22"/>
-              </w:rPr>
-              <w:t>Single Payout (UI)</w:t>
-            </w:r>
-          </w:p>
-        </w:tc>
-        <w:tc>
-          <w:tcPr>
-            <w:tcW w:type="dxa" w:w="4703"/>
-            <w:shd w:val="clear" w:color="auto" w:fill="FFFFFF"/>
-          </w:tcPr>
-          <w:p>
-            <w:r>
-              <w:rPr>
-                <w:b w:val="0"/>
-                <w:i w:val="0"/>
-                <w:sz w:val="22"/>
-              </w:rPr>
-              <w:t>One S2S call per payout (+50-200ms latency)</w:t>
-            </w:r>
-          </w:p>
-        </w:tc>
-      </w:tr>
-      <w:tr>
-        <w:tc>
-          <w:tcPr>
-            <w:tcW w:type="dxa" w:w="4703"/>
-            <w:shd w:val="clear" w:color="auto" w:fill="F8FAFC"/>
-          </w:tcPr>
-          <w:p>
-            <w:r>
-              <w:rPr>
-                <w:b/>
-                <w:i w:val="0"/>
-                <w:sz w:val="22"/>
-              </w:rPr>
-              <w:t>Bulk Payout (CSV)</w:t>
-            </w:r>
-          </w:p>
-        </w:tc>
-        <w:tc>
-          <w:tcPr>
-            <w:tcW w:type="dxa" w:w="4703"/>
-            <w:shd w:val="clear" w:color="auto" w:fill="F8FAFC"/>
-          </w:tcPr>
-          <w:p>
-            <w:r>
-              <w:rPr>
-                <w:b w:val="0"/>
-                <w:i w:val="0"/>
-                <w:sz w:val="22"/>
-              </w:rPr>
-              <w:t>S2S call for every row during payout creation (high latency for bulk operations)</w:t>
-            </w:r>
-          </w:p>
-        </w:tc>
-      </w:tr>
-      <w:tr>
-        <w:tc>
-          <w:tcPr>
-            <w:tcW w:type="dxa" w:w="4703"/>
-            <w:shd w:val="clear" w:color="auto" w:fill="FFFFFF"/>
-          </w:tcPr>
-          <w:p>
-            <w:r>
-              <w:rPr>
-                <w:b/>
-                <w:i w:val="0"/>
-                <w:sz w:val="22"/>
-              </w:rPr>
-              <w:t>API Payouts</w:t>
-            </w:r>
-          </w:p>
-        </w:tc>
-        <w:tc>
-          <w:tcPr>
-            <w:tcW w:type="dxa" w:w="4703"/>
-            <w:shd w:val="clear" w:color="auto" w:fill="FFFFFF"/>
-          </w:tcPr>
-          <w:p>
-            <w:r>
-              <w:rPr>
-                <w:b w:val="0"/>
-                <w:i w:val="0"/>
-                <w:sz w:val="22"/>
-              </w:rPr>
-              <w:t>External API users pay latency cost; service coupling creates reliability risk</w:t>
-            </w:r>
-          </w:p>
-        </w:tc>
-      </w:tr>
-    </w:tbl>
-    <w:p/>
-    <w:p>
-      <w:pPr>
-        <w:spacing w:before="160" w:after="40"/>
-      </w:pPr>
-      <w:r>
-        <w:rPr>
-          <w:b/>
-          <w:i w:val="0"/>
-          <w:color w:val="0F172A"/>
-          <w:sz w:val="24"/>
-        </w:rPr>
-        <w:t>Pros and Cons</w:t>
-      </w:r>
-    </w:p>
-    <w:tbl>
-      <w:tblPr>
-        <w:tblStyle w:val="TableGrid"/>
-        <w:tblW w:type="auto" w:w="0"/>
-        <w:tblLook w:firstColumn="1" w:firstRow="1" w:lastColumn="0" w:lastRow="0" w:noHBand="0" w:noVBand="1" w:val="04A0"/>
-        <w:tblBorders>
-          <w:top w:val="single" w:sz="4" w:color="CCCCCC"/>
-          <w:left w:val="single" w:sz="4" w:color="CCCCCC"/>
-          <w:bottom w:val="single" w:sz="4" w:color="CCCCCC"/>
-          <w:right w:val="single" w:sz="4" w:color="CCCCCC"/>
-          <w:insideH w:val="single" w:sz="4" w:color="CCCCCC"/>
-          <w:insideV w:val="single" w:sz="4" w:color="CCCCCC"/>
-        </w:tblBorders>
-      </w:tblPr>
-      <w:tblGrid>
-        <w:gridCol w:w="4703"/>
-        <w:gridCol w:w="4703"/>
-      </w:tblGrid>
-      <w:tr>
-        <w:tc>
-          <w:tcPr>
-            <w:tcW w:type="dxa" w:w="4703"/>
-            <w:shd w:val="clear" w:color="auto" w:fill="1A73E8"/>
-          </w:tcPr>
-          <w:p>
-            <w:r>
-              <w:rPr>
-                <w:b/>
-                <w:i w:val="0"/>
-                <w:color w:val="FFFFFF"/>
-                <w:sz w:val="22"/>
-              </w:rPr>
-              <w:t>Pros</w:t>
-            </w:r>
-          </w:p>
-        </w:tc>
-        <w:tc>
-          <w:tcPr>
-            <w:tcW w:type="dxa" w:w="4703"/>
-            <w:shd w:val="clear" w:color="auto" w:fill="1A73E8"/>
-          </w:tcPr>
-          <w:p>
-            <w:r>
-              <w:rPr>
-                <w:b/>
-                <w:i w:val="0"/>
-                <w:color w:val="FFFFFF"/>
-                <w:sz w:val="22"/>
-              </w:rPr>
-              <w:t>Cons</w:t>
-            </w:r>
-          </w:p>
-        </w:tc>
-      </w:tr>
-      <w:tr>
-        <w:tc>
-          <w:tcPr>
-            <w:tcW w:type="dxa" w:w="4703"/>
-            <w:shd w:val="clear" w:color="auto" w:fill="FFFFFF"/>
-          </w:tcPr>
-          <w:p>
-            <w:r>
-              <w:rPr>
-                <w:b w:val="0"/>
-                <w:i w:val="0"/>
-                <w:sz w:val="22"/>
-              </w:rPr>
-              <w:t>Single API call for merchant/caller</w:t>
-            </w:r>
-          </w:p>
-        </w:tc>
-        <w:tc>
-          <w:tcPr>
-            <w:tcW w:type="dxa" w:w="4703"/>
-            <w:shd w:val="clear" w:color="auto" w:fill="FFFFFF"/>
-          </w:tcPr>
-          <w:p>
-            <w:r>
-              <w:rPr>
-                <w:b w:val="0"/>
-                <w:i w:val="0"/>
-                <w:sz w:val="22"/>
-              </w:rPr>
-              <w:t>S2S call adds 50-200ms latency to every payout</w:t>
-            </w:r>
-          </w:p>
-        </w:tc>
-      </w:tr>
-      <w:tr>
-        <w:tc>
-          <w:tcPr>
-            <w:tcW w:type="dxa" w:w="4703"/>
-            <w:shd w:val="clear" w:color="auto" w:fill="F8FAFC"/>
-          </w:tcPr>
-          <w:p>
-            <w:r>
-              <w:rPr>
-                <w:b w:val="0"/>
-                <w:i w:val="0"/>
-                <w:sz w:val="22"/>
-              </w:rPr>
-              <w:t>Payout and TDS data stored atomically</w:t>
-            </w:r>
-          </w:p>
-        </w:tc>
-        <w:tc>
-          <w:tcPr>
-            <w:tcW w:type="dxa" w:w="4703"/>
-            <w:shd w:val="clear" w:color="auto" w:fill="F8FAFC"/>
-          </w:tcPr>
-          <w:p>
-            <w:r>
-              <w:rPr>
-                <w:b w:val="0"/>
-                <w:i w:val="0"/>
-                <w:sz w:val="22"/>
-              </w:rPr>
-              <w:t>Payouts fails if Tax-Compliance is down (tight coupling)</w:t>
-            </w:r>
-          </w:p>
-        </w:tc>
-      </w:tr>
-      <w:tr>
-        <w:tc>
-          <w:tcPr>
-            <w:tcW w:type="dxa" w:w="4703"/>
-            <w:shd w:val="clear" w:color="auto" w:fill="FFFFFF"/>
-          </w:tcPr>
-          <w:p>
-            <w:r>
-              <w:rPr>
-                <w:b w:val="0"/>
-                <w:i w:val="0"/>
-                <w:sz w:val="22"/>
-              </w:rPr>
-              <w:t>Simple integration for frontend</w:t>
-            </w:r>
-          </w:p>
-        </w:tc>
-        <w:tc>
-          <w:tcPr>
-            <w:tcW w:type="dxa" w:w="4703"/>
-            <w:shd w:val="clear" w:color="auto" w:fill="FFFFFF"/>
-          </w:tcPr>
-          <w:p>
-            <w:r>
-              <w:rPr>
-                <w:b w:val="0"/>
-                <w:i w:val="0"/>
-                <w:sz w:val="22"/>
-              </w:rPr>
-              <w:t>Domain leakage - Payouts must understand TDS computation</w:t>
-            </w:r>
-          </w:p>
-        </w:tc>
-      </w:tr>
-      <w:tr>
-        <w:tc>
-          <w:tcPr>
-            <w:tcW w:type="dxa" w:w="4703"/>
-            <w:shd w:val="clear" w:color="auto" w:fill="F8FAFC"/>
-          </w:tcPr>
-          <w:p/>
-        </w:tc>
-        <w:tc>
-          <w:tcPr>
-            <w:tcW w:type="dxa" w:w="4703"/>
-            <w:shd w:val="clear" w:color="auto" w:fill="F8FAFC"/>
-          </w:tcPr>
-          <w:p>
-            <w:r>
-              <w:rPr>
-                <w:b w:val="0"/>
-                <w:i w:val="0"/>
-                <w:sz w:val="22"/>
-              </w:rPr>
-              <w:t>Amount mutation (gross→net) is risky and error-prone</w:t>
-            </w:r>
-          </w:p>
-        </w:tc>
-      </w:tr>
-      <w:tr>
-        <w:tc>
-          <w:tcPr>
-            <w:tcW w:type="dxa" w:w="4703"/>
-            <w:shd w:val="clear" w:color="auto" w:fill="FFFFFF"/>
-          </w:tcPr>
-          <w:p/>
-        </w:tc>
-        <w:tc>
-          <w:tcPr>
-            <w:tcW w:type="dxa" w:w="4703"/>
-            <w:shd w:val="clear" w:color="auto" w:fill="FFFFFF"/>
-          </w:tcPr>
-          <w:p>
-            <w:r>
-              <w:rPr>
-                <w:b w:val="0"/>
-                <w:i w:val="0"/>
-                <w:sz w:val="22"/>
-              </w:rPr>
-              <w:t>TDS Payment entity created asynchronously (not in API response)</w:t>
-            </w:r>
-          </w:p>
-        </w:tc>
-      </w:tr>
-      <w:tr>
-        <w:tc>
-          <w:tcPr>
-            <w:tcW w:type="dxa" w:w="4703"/>
-            <w:shd w:val="clear" w:color="auto" w:fill="F8FAFC"/>
-          </w:tcPr>
-          <w:p/>
-        </w:tc>
-        <w:tc>
-          <w:tcPr>
-            <w:tcW w:type="dxa" w:w="4703"/>
-            <w:shd w:val="clear" w:color="auto" w:fill="F8FAFC"/>
-          </w:tcPr>
-          <w:p>
-            <w:r>
-              <w:rPr>
-                <w:b w:val="0"/>
-                <w:i w:val="0"/>
-                <w:sz w:val="22"/>
-              </w:rPr>
-              <w:t>High testing complexity (must mock Tax-Compliance in all tests)</w:t>
-            </w:r>
-          </w:p>
-        </w:tc>
-      </w:tr>
-    </w:tbl>
-    <w:p/>
-    <w:p>
-      <w:pPr>
-        <w:shd w:val="clear" w:color="auto" w:fill="FFFBEB"/>
-        <w:pBdr>
-          <w:left w:val="single" w:sz="18" w:space="6" w:color="1A73E8"/>
-        </w:pBdr>
-        <w:spacing w:before="80" w:after="40"/>
-        <w:ind w:left="120"/>
-      </w:pPr>
-      <w:r>
-        <w:rPr>
-          <w:b/>
-          <w:i w:val="0"/>
-          <w:color w:val="0F172A"/>
-          <w:sz w:val="24"/>
-        </w:rPr>
-        <w:t>Why Not Recommended</w:t>
-      </w:r>
-    </w:p>
-    <w:p>
-      <w:pPr>
-        <w:shd w:val="clear" w:color="auto" w:fill="FFFBEB"/>
-        <w:pBdr>
-          <w:left w:val="single" w:sz="18" w:space="6" w:color="1A73E8"/>
-        </w:pBdr>
-        <w:spacing w:before="0" w:after="40"/>
-        <w:ind w:left="120"/>
-      </w:pPr>
-      <w:r>
-        <w:rPr>
-          <w:b w:val="0"/>
-          <w:i w:val="0"/>
-          <w:sz w:val="22"/>
-        </w:rPr>
-        <w:t xml:space="preserve"> This approach introduces significant technical debt: latency overhead, service coupling, domain leakage, and risky amount mutation. The synchronous S2S call in the critical path makes payouts dependent on Tax-Compliance availability. </w:t>
-      </w:r>
-    </w:p>
-    <w:p>
-      <w:pPr>
-        <w:spacing w:before="0" w:after="80"/>
-      </w:pPr>
-    </w:p>
-    <w:p>
-      <w:pPr>
-        <w:pBdr>
-          <w:bottom w:val="single" w:sz="6" w:color="E2E8F0"/>
-        </w:pBdr>
-      </w:pPr>
-    </w:p>
-    <w:p>
-      <w:pPr>
-        <w:pStyle w:val="Heading3"/>
-      </w:pPr>
-      <w:r>
-        <w:t>Approach 2: Tax-Compliance Orchestrated (Alternative)</w:t>
-      </w:r>
-    </w:p>
-    <w:p>
-      <w:r>
-        <w:rPr>
-          <w:i/>
-          <w:sz w:val="20"/>
-        </w:rPr>
-        <w:t>Alternative — Tax-Compliance orchestrates both TDS computation and payout creation</w:t>
-      </w:r>
-    </w:p>
-    <w:p>
-      <w:pPr>
-        <w:spacing w:before="160" w:after="40"/>
-      </w:pPr>
-      <w:r>
-        <w:rPr>
-          <w:b/>
-          <w:i w:val="0"/>
-          <w:color w:val="0F172A"/>
-          <w:sz w:val="24"/>
-        </w:rPr>
-        <w:t>How It Works</w:t>
-      </w:r>
-    </w:p>
-    <w:p>
-      <w:r>
-        <w:rPr>
-          <w:b w:val="0"/>
-          <w:i w:val="0"/>
-          <w:sz w:val="22"/>
-        </w:rPr>
-        <w:t xml:space="preserve"> Tax-Compliance becomes the orchestrator. It exposes a single API endpoint that creates both the TDS Payment entity and the payout. </w:t>
-      </w:r>
-    </w:p>
-    <w:p>
-      <w:pPr>
-        <w:shd w:val="clear" w:color="auto" w:fill="EFF6FF"/>
-        <w:pBdr>
-          <w:left w:val="single" w:sz="18" w:space="6" w:color="1A73E8"/>
-        </w:pBdr>
-        <w:spacing w:before="80" w:after="40"/>
-        <w:ind w:left="120"/>
-      </w:pPr>
-      <w:r>
-        <w:rPr>
-          <w:b/>
-          <w:i w:val="0"/>
-          <w:color w:val="0F172A"/>
-          <w:sz w:val="24"/>
-        </w:rPr>
-        <w:t>Flow Summary</w:t>
-      </w:r>
-    </w:p>
-    <w:p>
-      <w:pPr>
-        <w:shd w:val="clear" w:color="auto" w:fill="EFF6FF"/>
-        <w:pBdr>
-          <w:left w:val="single" w:sz="18" w:space="6" w:color="1A73E8"/>
-        </w:pBdr>
-        <w:spacing w:before="0" w:after="40"/>
-        <w:ind w:left="300" w:hanging="180"/>
-      </w:pPr>
-      <w:r>
-        <w:rPr>
-          <w:sz w:val="22"/>
-        </w:rPr>
-        <w:t xml:space="preserve">•  </w:t>
-      </w:r>
-      <w:r>
-        <w:rPr>
-          <w:b/>
-          <w:i w:val="0"/>
-          <w:sz w:val="22"/>
-        </w:rPr>
-        <w:t>Preview (UI only):</w:t>
-      </w:r>
-      <w:r>
-        <w:rPr>
-          <w:b w:val="0"/>
-          <w:i w:val="0"/>
-          <w:sz w:val="22"/>
-        </w:rPr>
-        <w:t xml:space="preserve"> Tax-Compliance (BFF) computes TDS to show breakdown</w:t>
-      </w:r>
-    </w:p>
-    <w:p>
-      <w:pPr>
-        <w:shd w:val="clear" w:color="auto" w:fill="EFF6FF"/>
-        <w:pBdr>
-          <w:left w:val="single" w:sz="18" w:space="6" w:color="1A73E8"/>
-        </w:pBdr>
-        <w:spacing w:before="0" w:after="40"/>
-        <w:ind w:left="300" w:hanging="180"/>
-      </w:pPr>
-      <w:r>
-        <w:rPr>
-          <w:sz w:val="22"/>
-        </w:rPr>
-        <w:t xml:space="preserve">•  </w:t>
-      </w:r>
-      <w:r>
-        <w:rPr>
-          <w:b/>
-          <w:i w:val="0"/>
-          <w:sz w:val="22"/>
-        </w:rPr>
-        <w:t>Single API Call:</w:t>
-      </w:r>
-      <w:r>
-        <w:rPr>
-          <w:b w:val="0"/>
-          <w:i w:val="0"/>
-          <w:sz w:val="22"/>
-        </w:rPr>
-        <w:t xml:space="preserve"> UI calls Tax-Compliance payout creation API (not Payouts directly)</w:t>
-      </w:r>
-    </w:p>
-    <w:p>
-      <w:pPr>
-        <w:shd w:val="clear" w:color="auto" w:fill="EFF6FF"/>
-        <w:pBdr>
-          <w:left w:val="single" w:sz="18" w:space="6" w:color="1A73E8"/>
-        </w:pBdr>
-        <w:spacing w:before="0" w:after="40"/>
-        <w:ind w:left="300" w:hanging="180"/>
-      </w:pPr>
-      <w:r>
-        <w:rPr>
-          <w:sz w:val="22"/>
-        </w:rPr>
-        <w:t xml:space="preserve">•  </w:t>
-      </w:r>
-      <w:r>
-        <w:rPr>
-          <w:b/>
-          <w:i w:val="0"/>
-          <w:sz w:val="22"/>
-        </w:rPr>
-        <w:t>Tax-Compliance Orchestration:</w:t>
-      </w:r>
-    </w:p>
-    <w:p>
-      <w:pPr>
-        <w:shd w:val="clear" w:color="auto" w:fill="EFF6FF"/>
-        <w:pBdr>
-          <w:left w:val="single" w:sz="18" w:space="6" w:color="1A73E8"/>
-        </w:pBdr>
-        <w:spacing w:before="0" w:after="40"/>
-        <w:ind w:left="300" w:hanging="180"/>
-      </w:pPr>
-      <w:r>
-        <w:rPr>
-          <w:sz w:val="22"/>
-        </w:rPr>
-        <w:t xml:space="preserve">•  </w:t>
-      </w:r>
-      <w:r>
-        <w:rPr>
-          <w:b/>
-          <w:i w:val="0"/>
-          <w:sz w:val="22"/>
-        </w:rPr>
-        <w:t>Status Sync:</w:t>
-      </w:r>
-      <w:r>
-        <w:rPr>
-          <w:b w:val="0"/>
-          <w:i w:val="0"/>
-          <w:sz w:val="22"/>
-        </w:rPr>
-        <w:t xml:space="preserve"> Tax-Compliance listens to payout status updates via existing Kafka topic</w:t>
-      </w:r>
-    </w:p>
-    <w:p>
-      <w:pPr>
-        <w:spacing w:before="0" w:after="80"/>
-      </w:pPr>
-    </w:p>
-    <w:p>
-      <w:pPr>
-        <w:spacing w:before="160" w:after="40"/>
-      </w:pPr>
-      <w:r>
-        <w:rPr>
-          <w:b/>
-          <w:i w:val="0"/>
-          <w:color w:val="0F172A"/>
-          <w:sz w:val="24"/>
-        </w:rPr>
-        <w:t>Flow Diagram</w:t>
-      </w:r>
-    </w:p>
-    <w:p>
-      <w:pPr>
-        <w:jc w:val="center"/>
-      </w:pPr>
-      <w:r>
-        <w:drawing>
-          <wp:inline xmlns:a="http://schemas.openxmlformats.org/drawingml/2006/main" xmlns:pic="http://schemas.openxmlformats.org/drawingml/2006/picture">
-            <wp:extent cx="5486400" cy="6065798"/>
-            <wp:docPr id="2" name="Picture 2"/>
-            <wp:cNvGraphicFramePr>
-              <a:graphicFrameLocks noChangeAspect="1"/>
-            </wp:cNvGraphicFramePr>
-            <a:graphic>
-              <a:graphicData uri="http://schemas.openxmlformats.org/drawingml/2006/picture">
-                <pic:pic>
-                  <pic:nvPicPr>
-                    <pic:cNvPr id="0" name="diagram_1.png"/>
-                    <pic:cNvPicPr/>
-                  </pic:nvPicPr>
-                  <pic:blipFill>
-                    <a:blip r:embed="rId12"/>
-                    <a:stretch>
-                      <a:fillRect/>
-                    </a:stretch>
-                  </pic:blipFill>
-                  <pic:spPr>
-                    <a:xfrm>
-                      <a:off x="0" y="0"/>
-                      <a:ext cx="5486400" cy="6065798"/>
-                    </a:xfrm>
-                    <a:prstGeom prst="rect"/>
-                  </pic:spPr>
-                </pic:pic>
-              </a:graphicData>
-            </a:graphic>
-          </wp:inline>
-        </w:drawing>
-      </w:r>
-    </w:p>
-    <w:p/>
-    <w:p>
-      <w:pPr>
-        <w:spacing w:before="160" w:after="40"/>
-      </w:pPr>
-      <w:r>
-        <w:rPr>
-          <w:b/>
-          <w:i w:val="0"/>
-          <w:color w:val="0F172A"/>
-          <w:sz w:val="24"/>
-        </w:rPr>
-        <w:t>Payout Type Considerations</w:t>
-      </w:r>
-    </w:p>
-    <w:tbl>
-      <w:tblPr>
-        <w:tblStyle w:val="TableGrid"/>
-        <w:tblW w:type="auto" w:w="0"/>
-        <w:tblLook w:firstColumn="1" w:firstRow="1" w:lastColumn="0" w:lastRow="0" w:noHBand="0" w:noVBand="1" w:val="04A0"/>
-        <w:tblBorders>
-          <w:top w:val="single" w:sz="4" w:color="CCCCCC"/>
-          <w:left w:val="single" w:sz="4" w:color="CCCCCC"/>
-          <w:bottom w:val="single" w:sz="4" w:color="CCCCCC"/>
-          <w:right w:val="single" w:sz="4" w:color="CCCCCC"/>
-          <w:insideH w:val="single" w:sz="4" w:color="CCCCCC"/>
-          <w:insideV w:val="single" w:sz="4" w:color="CCCCCC"/>
-        </w:tblBorders>
-      </w:tblPr>
-      <w:tblGrid>
-        <w:gridCol w:w="4703"/>
-        <w:gridCol w:w="4703"/>
-      </w:tblGrid>
-      <w:tr>
-        <w:tc>
-          <w:tcPr>
-            <w:tcW w:type="dxa" w:w="4703"/>
-            <w:shd w:val="clear" w:color="auto" w:fill="1A73E8"/>
-          </w:tcPr>
-          <w:p>
-            <w:r>
-              <w:rPr>
-                <w:b/>
-                <w:i w:val="0"/>
-                <w:color w:val="FFFFFF"/>
-                <w:sz w:val="22"/>
-              </w:rPr>
-              <w:t>Payout Type</w:t>
-            </w:r>
-          </w:p>
-        </w:tc>
-        <w:tc>
-          <w:tcPr>
-            <w:tcW w:type="dxa" w:w="4703"/>
-            <w:shd w:val="clear" w:color="auto" w:fill="1A73E8"/>
-          </w:tcPr>
-          <w:p>
-            <w:r>
-              <w:rPr>
-                <w:b/>
-                <w:i w:val="0"/>
-                <w:color w:val="FFFFFF"/>
-                <w:sz w:val="22"/>
-              </w:rPr>
-              <w:t>Impact</w:t>
-            </w:r>
-          </w:p>
-        </w:tc>
-      </w:tr>
-      <w:tr>
-        <w:tc>
-          <w:tcPr>
-            <w:tcW w:type="dxa" w:w="4703"/>
-            <w:shd w:val="clear" w:color="auto" w:fill="FFFFFF"/>
-          </w:tcPr>
-          <w:p>
-            <w:r>
-              <w:rPr>
-                <w:b/>
-                <w:i w:val="0"/>
-                <w:sz w:val="22"/>
-              </w:rPr>
-              <w:t>Single Payout (UI)</w:t>
-            </w:r>
-          </w:p>
-        </w:tc>
-        <w:tc>
-          <w:tcPr>
-            <w:tcW w:type="dxa" w:w="4703"/>
-            <w:shd w:val="clear" w:color="auto" w:fill="FFFFFF"/>
-          </w:tcPr>
-          <w:p>
-            <w:r>
-              <w:rPr>
-                <w:b w:val="0"/>
-                <w:i w:val="0"/>
-                <w:sz w:val="22"/>
-              </w:rPr>
-              <w:t>One orchestrated call via Tax-Compliance</w:t>
-            </w:r>
-          </w:p>
-        </w:tc>
-      </w:tr>
-      <w:tr>
-        <w:tc>
-          <w:tcPr>
-            <w:tcW w:type="dxa" w:w="4703"/>
-            <w:shd w:val="clear" w:color="auto" w:fill="F8FAFC"/>
-          </w:tcPr>
-          <w:p>
-            <w:r>
-              <w:rPr>
-                <w:b/>
-                <w:i w:val="0"/>
-                <w:sz w:val="22"/>
-              </w:rPr>
-              <w:t>Bulk Payout (CSV)</w:t>
-            </w:r>
-          </w:p>
-        </w:tc>
-        <w:tc>
-          <w:tcPr>
-            <w:tcW w:type="dxa" w:w="4703"/>
-            <w:shd w:val="clear" w:color="auto" w:fill="F8FAFC"/>
-          </w:tcPr>
-          <w:p>
-            <w:r>
-              <w:rPr>
-                <w:b w:val="0"/>
-                <w:i w:val="0"/>
-                <w:sz w:val="22"/>
-              </w:rPr>
-              <w:t>Would require new bulk orchestration API in Tax-Compliance; complex error handling</w:t>
-            </w:r>
-          </w:p>
-        </w:tc>
-      </w:tr>
-      <w:tr>
-        <w:tc>
-          <w:tcPr>
-            <w:tcW w:type="dxa" w:w="4703"/>
-            <w:shd w:val="clear" w:color="auto" w:fill="FFFFFF"/>
-          </w:tcPr>
-          <w:p>
-            <w:r>
-              <w:rPr>
-                <w:b/>
-                <w:i w:val="0"/>
-                <w:sz w:val="22"/>
-              </w:rPr>
-              <w:t>API Payouts</w:t>
-            </w:r>
-          </w:p>
-        </w:tc>
-        <w:tc>
-          <w:tcPr>
-            <w:tcW w:type="dxa" w:w="4703"/>
-            <w:shd w:val="clear" w:color="auto" w:fill="FFFFFF"/>
-          </w:tcPr>
-          <w:p>
-            <w:r>
-              <w:rPr>
-                <w:b w:val="0"/>
-                <w:i w:val="0"/>
-                <w:sz w:val="22"/>
-              </w:rPr>
-              <w:t>External users call Tax-Compliance instead of Payouts (API surface change)</w:t>
-            </w:r>
-          </w:p>
-        </w:tc>
-      </w:tr>
-    </w:tbl>
-    <w:p/>
-    <w:p>
-      <w:pPr>
-        <w:spacing w:before="160" w:after="40"/>
-      </w:pPr>
-      <w:r>
-        <w:rPr>
-          <w:b/>
-          <w:i w:val="0"/>
-          <w:color w:val="0F172A"/>
-          <w:sz w:val="24"/>
-        </w:rPr>
-        <w:t>Pros and Cons</w:t>
-      </w:r>
-    </w:p>
-    <w:tbl>
-      <w:tblPr>
-        <w:tblStyle w:val="TableGrid"/>
-        <w:tblW w:type="auto" w:w="0"/>
-        <w:tblLook w:firstColumn="1" w:firstRow="1" w:lastColumn="0" w:lastRow="0" w:noHBand="0" w:noVBand="1" w:val="04A0"/>
-        <w:tblBorders>
-          <w:top w:val="single" w:sz="4" w:color="CCCCCC"/>
-          <w:left w:val="single" w:sz="4" w:color="CCCCCC"/>
-          <w:bottom w:val="single" w:sz="4" w:color="CCCCCC"/>
-          <w:right w:val="single" w:sz="4" w:color="CCCCCC"/>
-          <w:insideH w:val="single" w:sz="4" w:color="CCCCCC"/>
-          <w:insideV w:val="single" w:sz="4" w:color="CCCCCC"/>
-        </w:tblBorders>
-      </w:tblPr>
-      <w:tblGrid>
-        <w:gridCol w:w="4703"/>
-        <w:gridCol w:w="4703"/>
-      </w:tblGrid>
-      <w:tr>
-        <w:tc>
-          <w:tcPr>
-            <w:tcW w:type="dxa" w:w="4703"/>
-            <w:shd w:val="clear" w:color="auto" w:fill="1A73E8"/>
-          </w:tcPr>
-          <w:p>
-            <w:r>
-              <w:rPr>
-                <w:b/>
-                <w:i w:val="0"/>
-                <w:color w:val="FFFFFF"/>
-                <w:sz w:val="22"/>
-              </w:rPr>
-              <w:t>Pros</w:t>
-            </w:r>
-          </w:p>
-        </w:tc>
-        <w:tc>
-          <w:tcPr>
-            <w:tcW w:type="dxa" w:w="4703"/>
-            <w:shd w:val="clear" w:color="auto" w:fill="1A73E8"/>
-          </w:tcPr>
-          <w:p>
-            <w:r>
-              <w:rPr>
-                <w:b/>
-                <w:i w:val="0"/>
-                <w:color w:val="FFFFFF"/>
-                <w:sz w:val="22"/>
-              </w:rPr>
-              <w:t>Cons</w:t>
-            </w:r>
-          </w:p>
-        </w:tc>
-      </w:tr>
-      <w:tr>
-        <w:tc>
-          <w:tcPr>
-            <w:tcW w:type="dxa" w:w="4703"/>
-            <w:shd w:val="clear" w:color="auto" w:fill="FFFFFF"/>
-          </w:tcPr>
-          <w:p>
-            <w:r>
-              <w:rPr>
-                <w:b w:val="0"/>
-                <w:i w:val="0"/>
-                <w:sz w:val="22"/>
-              </w:rPr>
-              <w:t>Single API call returns both TDS Payment ID and Payout ID</w:t>
-            </w:r>
-          </w:p>
-        </w:tc>
-        <w:tc>
-          <w:tcPr>
-            <w:tcW w:type="dxa" w:w="4703"/>
-            <w:shd w:val="clear" w:color="auto" w:fill="FFFFFF"/>
-          </w:tcPr>
-          <w:p>
-            <w:r>
-              <w:rPr>
-                <w:b w:val="0"/>
-                <w:i w:val="0"/>
-                <w:sz w:val="22"/>
-              </w:rPr>
-              <w:t>Reversed S2S call (Tax-Compliance → Payouts adds latency)</w:t>
-            </w:r>
-          </w:p>
-        </w:tc>
-      </w:tr>
-      <w:tr>
-        <w:tc>
-          <w:tcPr>
-            <w:tcW w:type="dxa" w:w="4703"/>
-            <w:shd w:val="clear" w:color="auto" w:fill="F8FAFC"/>
-          </w:tcPr>
-          <w:p>
-            <w:r>
-              <w:rPr>
-                <w:b w:val="0"/>
-                <w:i w:val="0"/>
-                <w:sz w:val="22"/>
-              </w:rPr>
-              <w:t>TDS Payment entity available synchronously</w:t>
-            </w:r>
-          </w:p>
-        </w:tc>
-        <w:tc>
-          <w:tcPr>
-            <w:tcW w:type="dxa" w:w="4703"/>
-            <w:shd w:val="clear" w:color="auto" w:fill="F8FAFC"/>
-          </w:tcPr>
-          <w:p>
-            <w:r>
-              <w:rPr>
-                <w:b w:val="0"/>
-                <w:i w:val="0"/>
-                <w:sz w:val="22"/>
-              </w:rPr>
-              <w:t>Tax-Compliance depends on Payouts (tight coupling)</w:t>
-            </w:r>
-          </w:p>
-        </w:tc>
-      </w:tr>
-      <w:tr>
-        <w:tc>
-          <w:tcPr>
-            <w:tcW w:type="dxa" w:w="4703"/>
-            <w:shd w:val="clear" w:color="auto" w:fill="FFFFFF"/>
-          </w:tcPr>
-          <w:p>
-            <w:r>
-              <w:rPr>
-                <w:b w:val="0"/>
-                <w:i w:val="0"/>
-                <w:sz w:val="22"/>
-              </w:rPr>
-              <w:t>Tax-Compliance owns all TDS data</w:t>
-            </w:r>
-          </w:p>
-        </w:tc>
-        <w:tc>
-          <w:tcPr>
-            <w:tcW w:type="dxa" w:w="4703"/>
-            <w:shd w:val="clear" w:color="auto" w:fill="FFFFFF"/>
-          </w:tcPr>
-          <w:p>
-            <w:r>
-              <w:rPr>
-                <w:b w:val="0"/>
-                <w:i w:val="0"/>
-                <w:sz w:val="22"/>
-              </w:rPr>
-              <w:t>Domain leakage - Tax-Compliance must understand payout creation</w:t>
-            </w:r>
-          </w:p>
-        </w:tc>
-      </w:tr>
-      <w:tr>
-        <w:tc>
-          <w:tcPr>
-            <w:tcW w:type="dxa" w:w="4703"/>
-            <w:shd w:val="clear" w:color="auto" w:fill="F8FAFC"/>
-          </w:tcPr>
-          <w:p>
-            <w:r>
-              <w:rPr>
-                <w:b w:val="0"/>
-                <w:i w:val="0"/>
-                <w:sz w:val="22"/>
-              </w:rPr>
-              <w:t>No new Kafka topic needed</w:t>
-            </w:r>
-          </w:p>
-        </w:tc>
-        <w:tc>
-          <w:tcPr>
-            <w:tcW w:type="dxa" w:w="4703"/>
-            <w:shd w:val="clear" w:color="auto" w:fill="F8FAFC"/>
-          </w:tcPr>
-          <w:p>
-            <w:r>
-              <w:rPr>
-                <w:b w:val="0"/>
-                <w:i w:val="0"/>
-                <w:sz w:val="22"/>
-              </w:rPr>
-              <w:t>Complex orchestration logic in Tax-Compliance</w:t>
-            </w:r>
-          </w:p>
-        </w:tc>
-      </w:tr>
-      <w:tr>
-        <w:tc>
-          <w:tcPr>
-            <w:tcW w:type="dxa" w:w="4703"/>
-            <w:shd w:val="clear" w:color="auto" w:fill="FFFFFF"/>
-          </w:tcPr>
-          <w:p>
-            <w:r>
-              <w:rPr>
-                <w:b w:val="0"/>
-                <w:i w:val="0"/>
-                <w:sz w:val="22"/>
-              </w:rPr>
-              <w:t>Minimal Payouts changes</w:t>
-            </w:r>
-          </w:p>
-        </w:tc>
-        <w:tc>
-          <w:tcPr>
-            <w:tcW w:type="dxa" w:w="4703"/>
-            <w:shd w:val="clear" w:color="auto" w:fill="FFFFFF"/>
-          </w:tcPr>
-          <w:p>
-            <w:r>
-              <w:rPr>
-                <w:b w:val="0"/>
-                <w:i w:val="0"/>
-                <w:sz w:val="22"/>
-              </w:rPr>
-              <w:t>Bulk payout support requires significant Tax-Compliance work</w:t>
-            </w:r>
-          </w:p>
-        </w:tc>
-      </w:tr>
-    </w:tbl>
-    <w:p/>
-    <w:p>
-      <w:pPr>
-        <w:shd w:val="clear" w:color="auto" w:fill="FFFBEB"/>
-        <w:pBdr>
-          <w:left w:val="single" w:sz="18" w:space="6" w:color="1A73E8"/>
-        </w:pBdr>
-        <w:spacing w:before="80" w:after="40"/>
-        <w:ind w:left="120"/>
-      </w:pPr>
-      <w:r>
-        <w:rPr>
-          <w:b/>
-          <w:i w:val="0"/>
-          <w:color w:val="0F172A"/>
-          <w:sz w:val="24"/>
-        </w:rPr>
-        <w:t>When to Consider</w:t>
-      </w:r>
-    </w:p>
-    <w:p>
-      <w:pPr>
-        <w:shd w:val="clear" w:color="auto" w:fill="FFFBEB"/>
-        <w:pBdr>
-          <w:left w:val="single" w:sz="18" w:space="6" w:color="1A73E8"/>
-        </w:pBdr>
-        <w:spacing w:before="0" w:after="40"/>
-        <w:ind w:left="120"/>
-      </w:pPr>
-      <w:r>
-        <w:rPr>
-          <w:b w:val="0"/>
-          <w:i w:val="0"/>
-          <w:sz w:val="22"/>
-        </w:rPr>
-        <w:t xml:space="preserve"> This approach is viable if having the TDS Payment ID synchronously in the API response is a hard requirement. However, it introduces orchestration complexity and reverses the natural dependency direction (Tax-Compliance calling Payouts). </w:t>
-      </w:r>
-    </w:p>
-    <w:p>
-      <w:pPr>
-        <w:spacing w:before="0" w:after="80"/>
-      </w:pPr>
-    </w:p>
-    <w:p>
-      <w:pPr>
-        <w:pBdr>
-          <w:bottom w:val="single" w:sz="6" w:color="E2E8F0"/>
-        </w:pBdr>
-      </w:pPr>
-    </w:p>
-    <w:p>
-      <w:pPr>
-        <w:pStyle w:val="Heading3"/>
-      </w:pPr>
-      <w:r>
-        <w:t>Approach 1: Enrichment Hook Pattern — SELECTED</w:t>
-      </w:r>
-    </w:p>
-    <w:p>
-      <w:r>
-        <w:rPr>
-          <w:i/>
-          <w:sz w:val="20"/>
-        </w:rPr>
-        <w:t>RECOMMENDED - All Channels — Payouts accepts optional TDS fields; makes lightweight sync enrichment call if present; single API for merchants</w:t>
-      </w:r>
-    </w:p>
-    <w:p>
-      <w:pPr>
-        <w:shd w:val="clear" w:color="auto" w:fill="F0FDF4"/>
-        <w:pBdr>
-          <w:left w:val="single" w:sz="18" w:space="6" w:color="1A73E8"/>
-        </w:pBdr>
-        <w:spacing w:before="80" w:after="40"/>
-        <w:ind w:left="120"/>
-      </w:pPr>
-      <w:r>
-        <w:rPr>
-          <w:b/>
-          <w:i w:val="0"/>
-          <w:color w:val="0F172A"/>
-          <w:sz w:val="24"/>
-        </w:rPr>
-        <w:t>Core Principle: Single API Call with Minimal Payouts Changes</w:t>
-      </w:r>
-    </w:p>
-    <w:p>
-      <w:pPr>
-        <w:shd w:val="clear" w:color="auto" w:fill="F0FDF4"/>
-        <w:pBdr>
-          <w:left w:val="single" w:sz="18" w:space="6" w:color="1A73E8"/>
-        </w:pBdr>
-        <w:spacing w:before="0" w:after="40"/>
-        <w:ind w:left="120"/>
-      </w:pPr>
-      <w:r>
-        <w:rPr>
-          <w:b w:val="0"/>
-          <w:i w:val="0"/>
-          <w:sz w:val="22"/>
-        </w:rPr>
-        <w:t xml:space="preserve"> Payouts API accepts optional TDS fields (category_id, gross_amount, apply_ldc). If these fields are present, Payouts makes a </w:t>
-      </w:r>
-      <w:r>
-        <w:rPr>
-          <w:b/>
-          <w:i w:val="0"/>
-          <w:sz w:val="22"/>
-        </w:rPr>
-        <w:t>lightweight synchronous call (~50-100ms)</w:t>
-      </w:r>
-      <w:r>
-        <w:rPr>
-          <w:b w:val="0"/>
-          <w:i w:val="0"/>
-          <w:sz w:val="22"/>
-        </w:rPr>
-        <w:t xml:space="preserve"> to Tax-Compliance enrichment endpoint. Tax-Compliance computes TDS, creates tds_payments entity, and returns enriched data. Payouts uses the enriched net_amount for payout creation. </w:t>
-      </w:r>
-      <w:r>
-        <w:rPr>
-          <w:b/>
-          <w:i w:val="0"/>
-          <w:sz w:val="22"/>
-        </w:rPr>
-        <w:t>Merchants make ONE API call; zero domain leak to Payouts.</w:t>
-      </w:r>
-    </w:p>
-    <w:p>
-      <w:pPr>
-        <w:spacing w:before="0" w:after="80"/>
-      </w:pPr>
-    </w:p>
-    <w:p>
-      <w:pPr>
-        <w:spacing w:before="160" w:after="40"/>
-      </w:pPr>
-      <w:r>
-        <w:rPr>
-          <w:b/>
-          <w:i w:val="0"/>
-          <w:color w:val="0F172A"/>
-          <w:sz w:val="24"/>
-        </w:rPr>
-        <w:t>How It Works</w:t>
-      </w:r>
-    </w:p>
-    <w:p>
-      <w:r>
-        <w:rPr>
-          <w:b w:val="0"/>
-          <w:i w:val="0"/>
-          <w:sz w:val="22"/>
-        </w:rPr>
-        <w:t xml:space="preserve"> This approach adds a minimal, optional enrichment hook in Payouts. When TDS fields are absent, Payouts behaves exactly as before (zero impact). When TDS fields are present, Payouts delegates computation to Tax-Compliance and uses the enriched response. </w:t>
-      </w:r>
-    </w:p>
-    <w:p>
-      <w:pPr>
-        <w:shd w:val="clear" w:color="auto" w:fill="EFF6FF"/>
-        <w:pBdr>
-          <w:left w:val="single" w:sz="18" w:space="6" w:color="1A73E8"/>
-        </w:pBdr>
-        <w:spacing w:before="80" w:after="40"/>
-        <w:ind w:left="120"/>
-      </w:pPr>
-      <w:r>
-        <w:rPr>
-          <w:b/>
-          <w:i w:val="0"/>
-          <w:color w:val="0F172A"/>
-          <w:sz w:val="24"/>
-        </w:rPr>
-        <w:t>Flow Summary</w:t>
-      </w:r>
-    </w:p>
-    <w:p>
-      <w:pPr>
-        <w:shd w:val="clear" w:color="auto" w:fill="EFF6FF"/>
-        <w:pBdr>
-          <w:left w:val="single" w:sz="18" w:space="6" w:color="1A73E8"/>
-        </w:pBdr>
-        <w:spacing w:before="0" w:after="40"/>
-        <w:ind w:left="300" w:hanging="180"/>
-      </w:pPr>
-      <w:r>
-        <w:rPr>
-          <w:sz w:val="22"/>
-        </w:rPr>
-        <w:t xml:space="preserve">•  </w:t>
-      </w:r>
-      <w:r>
-        <w:rPr>
-          <w:b/>
-          <w:i w:val="0"/>
-          <w:sz w:val="22"/>
-        </w:rPr>
-        <w:t>API Request:</w:t>
-      </w:r>
-      <w:r>
-        <w:rPr>
-          <w:b w:val="0"/>
-          <w:i w:val="0"/>
-          <w:sz w:val="22"/>
-        </w:rPr>
-        <w:t xml:space="preserve"> Merchant calls Payouts API with optional TDS fields: </w:t>
-      </w:r>
-    </w:p>
-    <w:p>
-      <w:pPr>
-        <w:shd w:val="clear" w:color="auto" w:fill="EFF6FF"/>
-        <w:pBdr>
-          <w:left w:val="single" w:sz="18" w:space="6" w:color="1A73E8"/>
-        </w:pBdr>
-        <w:spacing w:before="0" w:after="40"/>
-        <w:ind w:left="300" w:hanging="180"/>
-      </w:pPr>
-      <w:r>
-        <w:rPr>
-          <w:sz w:val="22"/>
-        </w:rPr>
-        <w:t xml:space="preserve">•  </w:t>
-      </w:r>
-      <w:r>
-        <w:rPr>
-          <w:b/>
-          <w:i w:val="0"/>
-          <w:sz w:val="22"/>
-        </w:rPr>
-        <w:t>Enrichment Hook (if TDS fields present):</w:t>
-      </w:r>
-      <w:r>
-        <w:rPr>
-          <w:b w:val="0"/>
-          <w:i w:val="0"/>
-          <w:sz w:val="22"/>
-        </w:rPr>
-        <w:t xml:space="preserve"> Payouts calls Tax-Compliance internal enrichment API: </w:t>
-      </w:r>
-    </w:p>
-    <w:p>
-      <w:pPr>
-        <w:shd w:val="clear" w:color="auto" w:fill="EFF6FF"/>
-        <w:pBdr>
-          <w:left w:val="single" w:sz="18" w:space="6" w:color="1A73E8"/>
-        </w:pBdr>
-        <w:spacing w:before="0" w:after="40"/>
-        <w:ind w:left="300" w:hanging="180"/>
-      </w:pPr>
-      <w:r>
-        <w:rPr>
-          <w:sz w:val="22"/>
-        </w:rPr>
-        <w:t xml:space="preserve">•  </w:t>
-      </w:r>
-      <w:r>
-        <w:rPr>
-          <w:b/>
-          <w:i w:val="0"/>
-          <w:sz w:val="22"/>
-        </w:rPr>
-        <w:t>Payout Creation:</w:t>
-      </w:r>
-      <w:r>
-        <w:rPr>
-          <w:b w:val="0"/>
-          <w:i w:val="0"/>
-          <w:sz w:val="22"/>
-        </w:rPr>
-        <w:t xml:space="preserve"> Payouts creates payout with: </w:t>
-      </w:r>
-    </w:p>
-    <w:p>
-      <w:pPr>
-        <w:shd w:val="clear" w:color="auto" w:fill="EFF6FF"/>
-        <w:pBdr>
-          <w:left w:val="single" w:sz="18" w:space="6" w:color="1A73E8"/>
-        </w:pBdr>
-        <w:spacing w:before="0" w:after="40"/>
-        <w:ind w:left="300" w:hanging="180"/>
-      </w:pPr>
-      <w:r>
-        <w:rPr>
-          <w:sz w:val="22"/>
-        </w:rPr>
-        <w:t xml:space="preserve">•  </w:t>
-      </w:r>
-      <w:r>
-        <w:rPr>
-          <w:b/>
-          <w:i w:val="0"/>
-          <w:sz w:val="22"/>
-        </w:rPr>
-        <w:t>Event Emission:</w:t>
-      </w:r>
-      <w:r>
-        <w:rPr>
-          <w:b w:val="0"/>
-          <w:i w:val="0"/>
-          <w:sz w:val="22"/>
-        </w:rPr>
-        <w:t xml:space="preserve"> Payouts emits status change events (existing mechanism)</w:t>
-      </w:r>
-    </w:p>
-    <w:p>
-      <w:pPr>
-        <w:shd w:val="clear" w:color="auto" w:fill="EFF6FF"/>
-        <w:pBdr>
-          <w:left w:val="single" w:sz="18" w:space="6" w:color="1A73E8"/>
-        </w:pBdr>
-        <w:spacing w:before="0" w:after="40"/>
-        <w:ind w:left="300" w:hanging="180"/>
-      </w:pPr>
-      <w:r>
-        <w:rPr>
-          <w:sz w:val="22"/>
-        </w:rPr>
-        <w:t xml:space="preserve">•  </w:t>
-      </w:r>
-      <w:r>
-        <w:rPr>
-          <w:b/>
-          <w:i w:val="0"/>
-          <w:sz w:val="22"/>
-        </w:rPr>
-        <w:t>TDS Entity Update:</w:t>
-      </w:r>
-      <w:r>
-        <w:rPr>
-          <w:b w:val="0"/>
-          <w:i w:val="0"/>
-          <w:sz w:val="22"/>
-        </w:rPr>
-        <w:t xml:space="preserve"> Tax-Compliance listens to payout events and updates tds_payments entity (PENDING → SUCCESS/FAILED)</w:t>
-      </w:r>
-    </w:p>
-    <w:p>
-      <w:pPr>
-        <w:spacing w:before="0" w:after="80"/>
-      </w:pPr>
-    </w:p>
-    <w:p>
-      <w:pPr>
-        <w:spacing w:before="160" w:after="40"/>
-      </w:pPr>
-      <w:r>
-        <w:rPr>
-          <w:b/>
-          <w:i w:val="0"/>
-          <w:color w:val="0F172A"/>
-          <w:sz w:val="24"/>
-        </w:rPr>
-        <w:t>Flow Diagram</w:t>
-      </w:r>
-    </w:p>
-    <w:p>
-      <w:pPr>
-        <w:jc w:val="center"/>
-      </w:pPr>
-      <w:r>
-        <w:drawing>
-          <wp:inline xmlns:a="http://schemas.openxmlformats.org/drawingml/2006/main" xmlns:pic="http://schemas.openxmlformats.org/drawingml/2006/picture">
-            <wp:extent cx="5486400" cy="3667944"/>
-            <wp:docPr id="3" name="Picture 3"/>
-            <wp:cNvGraphicFramePr>
-              <a:graphicFrameLocks noChangeAspect="1"/>
-            </wp:cNvGraphicFramePr>
-            <a:graphic>
-              <a:graphicData uri="http://schemas.openxmlformats.org/drawingml/2006/picture">
-                <pic:pic>
-                  <pic:nvPicPr>
-                    <pic:cNvPr id="0" name="diagram_2.png"/>
-                    <pic:cNvPicPr/>
-                  </pic:nvPicPr>
-                  <pic:blipFill>
-                    <a:blip r:embed="rId13"/>
                     <a:stretch>
                       <a:fillRect/>
                     </a:stretch>
@@ -6124,7 +4677,7 @@
         <w:drawing>
           <wp:inline xmlns:a="http://schemas.openxmlformats.org/drawingml/2006/main" xmlns:pic="http://schemas.openxmlformats.org/drawingml/2006/picture">
             <wp:extent cx="5486400" cy="2792851"/>
-            <wp:docPr id="4" name="Picture 4"/>
+            <wp:docPr id="2" name="Picture 2"/>
             <wp:cNvGraphicFramePr>
               <a:graphicFrameLocks noChangeAspect="1"/>
             </wp:cNvGraphicFramePr>
@@ -6132,11 +4685,11 @@
               <a:graphicData uri="http://schemas.openxmlformats.org/drawingml/2006/picture">
                 <pic:pic>
                   <pic:nvPicPr>
-                    <pic:cNvPr id="0" name="diagram_3.png"/>
+                    <pic:cNvPr id="0" name="diagram_1.png"/>
                     <pic:cNvPicPr/>
                   </pic:nvPicPr>
                   <pic:blipFill>
-                    <a:blip r:embed="rId14"/>
+                    <a:blip r:embed="rId12"/>
                     <a:stretch>
                       <a:fillRect/>
                     </a:stretch>
@@ -6178,7 +4731,7 @@
         <w:drawing>
           <wp:inline xmlns:a="http://schemas.openxmlformats.org/drawingml/2006/main" xmlns:pic="http://schemas.openxmlformats.org/drawingml/2006/picture">
             <wp:extent cx="5486400" cy="3320389"/>
-            <wp:docPr id="5" name="Picture 5"/>
+            <wp:docPr id="3" name="Picture 3"/>
             <wp:cNvGraphicFramePr>
               <a:graphicFrameLocks noChangeAspect="1"/>
             </wp:cNvGraphicFramePr>
@@ -6186,11 +4739,11 @@
               <a:graphicData uri="http://schemas.openxmlformats.org/drawingml/2006/picture">
                 <pic:pic>
                   <pic:nvPicPr>
-                    <pic:cNvPr id="0" name="diagram_4.png"/>
+                    <pic:cNvPr id="0" name="diagram_2.png"/>
                     <pic:cNvPicPr/>
                   </pic:nvPicPr>
                   <pic:blipFill>
-                    <a:blip r:embed="rId15"/>
+                    <a:blip r:embed="rId13"/>
                     <a:stretch>
                       <a:fillRect/>
                     </a:stretch>
@@ -6232,7 +4785,7 @@
         <w:drawing>
           <wp:inline xmlns:a="http://schemas.openxmlformats.org/drawingml/2006/main" xmlns:pic="http://schemas.openxmlformats.org/drawingml/2006/picture">
             <wp:extent cx="5486400" cy="2966628"/>
-            <wp:docPr id="6" name="Picture 6"/>
+            <wp:docPr id="4" name="Picture 4"/>
             <wp:cNvGraphicFramePr>
               <a:graphicFrameLocks noChangeAspect="1"/>
             </wp:cNvGraphicFramePr>
@@ -6240,11 +4793,11 @@
               <a:graphicData uri="http://schemas.openxmlformats.org/drawingml/2006/picture">
                 <pic:pic>
                   <pic:nvPicPr>
-                    <pic:cNvPr id="0" name="diagram_5.png"/>
+                    <pic:cNvPr id="0" name="diagram_3.png"/>
                     <pic:cNvPicPr/>
                   </pic:nvPicPr>
                   <pic:blipFill>
-                    <a:blip r:embed="rId16"/>
+                    <a:blip r:embed="rId14"/>
                     <a:stretch>
                       <a:fillRect/>
                     </a:stretch>
@@ -7148,6 +5701,1437 @@
       </w:tr>
     </w:tbl>
     <w:p/>
+    <w:p>
+      <w:pPr>
+        <w:pBdr>
+          <w:bottom w:val="single" w:sz="6" w:color="E2E8F0"/>
+        </w:pBdr>
+      </w:pPr>
+    </w:p>
+    <w:p>
+      <w:pPr>
+        <w:pStyle w:val="Heading3"/>
+      </w:pPr>
+      <w:r>
+        <w:t>Approach 2: TC Gateway (Not Recommended)</w:t>
+      </w:r>
+    </w:p>
+    <w:p>
+      <w:r>
+        <w:rPr>
+          <w:i/>
+          <w:sz w:val="20"/>
+        </w:rPr>
+        <w:t>Not Recommended — Tax-Compliance orchestrates both TDS computation and payout creation; exposes /v2/payouts endpoint</w:t>
+      </w:r>
+    </w:p>
+    <w:p>
+      <w:pPr>
+        <w:spacing w:before="160" w:after="40"/>
+      </w:pPr>
+      <w:r>
+        <w:rPr>
+          <w:b/>
+          <w:i w:val="0"/>
+          <w:color w:val="0F172A"/>
+          <w:sz w:val="24"/>
+        </w:rPr>
+        <w:t>How It Works</w:t>
+      </w:r>
+    </w:p>
+    <w:p>
+      <w:r>
+        <w:rPr>
+          <w:b w:val="0"/>
+          <w:i w:val="0"/>
+          <w:sz w:val="22"/>
+        </w:rPr>
+        <w:t xml:space="preserve"> Tax-Compliance becomes the orchestrator. It exposes a single API endpoint that creates both the TDS Payment entity and the payout. </w:t>
+      </w:r>
+    </w:p>
+    <w:p>
+      <w:pPr>
+        <w:shd w:val="clear" w:color="auto" w:fill="EFF6FF"/>
+        <w:pBdr>
+          <w:left w:val="single" w:sz="18" w:space="6" w:color="1A73E8"/>
+        </w:pBdr>
+        <w:spacing w:before="80" w:after="40"/>
+        <w:ind w:left="120"/>
+      </w:pPr>
+      <w:r>
+        <w:rPr>
+          <w:b/>
+          <w:i w:val="0"/>
+          <w:color w:val="0F172A"/>
+          <w:sz w:val="24"/>
+        </w:rPr>
+        <w:t>Flow Summary</w:t>
+      </w:r>
+    </w:p>
+    <w:p>
+      <w:pPr>
+        <w:shd w:val="clear" w:color="auto" w:fill="EFF6FF"/>
+        <w:pBdr>
+          <w:left w:val="single" w:sz="18" w:space="6" w:color="1A73E8"/>
+        </w:pBdr>
+        <w:spacing w:before="0" w:after="40"/>
+        <w:ind w:left="300" w:hanging="180"/>
+      </w:pPr>
+      <w:r>
+        <w:rPr>
+          <w:sz w:val="22"/>
+        </w:rPr>
+        <w:t xml:space="preserve">•  </w:t>
+      </w:r>
+      <w:r>
+        <w:rPr>
+          <w:b/>
+          <w:i w:val="0"/>
+          <w:sz w:val="22"/>
+        </w:rPr>
+        <w:t>Preview (UI only):</w:t>
+      </w:r>
+      <w:r>
+        <w:rPr>
+          <w:b w:val="0"/>
+          <w:i w:val="0"/>
+          <w:sz w:val="22"/>
+        </w:rPr>
+        <w:t xml:space="preserve"> Tax-Compliance (BFF) computes TDS to show breakdown</w:t>
+      </w:r>
+    </w:p>
+    <w:p>
+      <w:pPr>
+        <w:shd w:val="clear" w:color="auto" w:fill="EFF6FF"/>
+        <w:pBdr>
+          <w:left w:val="single" w:sz="18" w:space="6" w:color="1A73E8"/>
+        </w:pBdr>
+        <w:spacing w:before="0" w:after="40"/>
+        <w:ind w:left="300" w:hanging="180"/>
+      </w:pPr>
+      <w:r>
+        <w:rPr>
+          <w:sz w:val="22"/>
+        </w:rPr>
+        <w:t xml:space="preserve">•  </w:t>
+      </w:r>
+      <w:r>
+        <w:rPr>
+          <w:b/>
+          <w:i w:val="0"/>
+          <w:sz w:val="22"/>
+        </w:rPr>
+        <w:t>Single API Call:</w:t>
+      </w:r>
+      <w:r>
+        <w:rPr>
+          <w:b w:val="0"/>
+          <w:i w:val="0"/>
+          <w:sz w:val="22"/>
+        </w:rPr>
+        <w:t xml:space="preserve"> UI calls Tax-Compliance payout creation API (not Payouts directly)</w:t>
+      </w:r>
+    </w:p>
+    <w:p>
+      <w:pPr>
+        <w:shd w:val="clear" w:color="auto" w:fill="EFF6FF"/>
+        <w:pBdr>
+          <w:left w:val="single" w:sz="18" w:space="6" w:color="1A73E8"/>
+        </w:pBdr>
+        <w:spacing w:before="0" w:after="40"/>
+        <w:ind w:left="300" w:hanging="180"/>
+      </w:pPr>
+      <w:r>
+        <w:rPr>
+          <w:sz w:val="22"/>
+        </w:rPr>
+        <w:t xml:space="preserve">•  </w:t>
+      </w:r>
+      <w:r>
+        <w:rPr>
+          <w:b/>
+          <w:i w:val="0"/>
+          <w:sz w:val="22"/>
+        </w:rPr>
+        <w:t>Tax-Compliance Orchestration:</w:t>
+      </w:r>
+    </w:p>
+    <w:p>
+      <w:pPr>
+        <w:shd w:val="clear" w:color="auto" w:fill="EFF6FF"/>
+        <w:pBdr>
+          <w:left w:val="single" w:sz="18" w:space="6" w:color="1A73E8"/>
+        </w:pBdr>
+        <w:spacing w:before="0" w:after="40"/>
+        <w:ind w:left="300" w:hanging="180"/>
+      </w:pPr>
+      <w:r>
+        <w:rPr>
+          <w:sz w:val="22"/>
+        </w:rPr>
+        <w:t xml:space="preserve">•  </w:t>
+      </w:r>
+      <w:r>
+        <w:rPr>
+          <w:b/>
+          <w:i w:val="0"/>
+          <w:sz w:val="22"/>
+        </w:rPr>
+        <w:t>Status Sync:</w:t>
+      </w:r>
+      <w:r>
+        <w:rPr>
+          <w:b w:val="0"/>
+          <w:i w:val="0"/>
+          <w:sz w:val="22"/>
+        </w:rPr>
+        <w:t xml:space="preserve"> Tax-Compliance listens to payout status updates via existing Kafka topic</w:t>
+      </w:r>
+    </w:p>
+    <w:p>
+      <w:pPr>
+        <w:spacing w:before="0" w:after="80"/>
+      </w:pPr>
+    </w:p>
+    <w:p>
+      <w:pPr>
+        <w:spacing w:before="160" w:after="40"/>
+      </w:pPr>
+      <w:r>
+        <w:rPr>
+          <w:b/>
+          <w:i w:val="0"/>
+          <w:color w:val="0F172A"/>
+          <w:sz w:val="24"/>
+        </w:rPr>
+        <w:t>Flow Diagram</w:t>
+      </w:r>
+    </w:p>
+    <w:p>
+      <w:pPr>
+        <w:jc w:val="center"/>
+      </w:pPr>
+      <w:r>
+        <w:drawing>
+          <wp:inline xmlns:a="http://schemas.openxmlformats.org/drawingml/2006/main" xmlns:pic="http://schemas.openxmlformats.org/drawingml/2006/picture">
+            <wp:extent cx="5486400" cy="6065798"/>
+            <wp:docPr id="5" name="Picture 5"/>
+            <wp:cNvGraphicFramePr>
+              <a:graphicFrameLocks noChangeAspect="1"/>
+            </wp:cNvGraphicFramePr>
+            <a:graphic>
+              <a:graphicData uri="http://schemas.openxmlformats.org/drawingml/2006/picture">
+                <pic:pic>
+                  <pic:nvPicPr>
+                    <pic:cNvPr id="0" name="diagram_4.png"/>
+                    <pic:cNvPicPr/>
+                  </pic:nvPicPr>
+                  <pic:blipFill>
+                    <a:blip r:embed="rId15"/>
+                    <a:stretch>
+                      <a:fillRect/>
+                    </a:stretch>
+                  </pic:blipFill>
+                  <pic:spPr>
+                    <a:xfrm>
+                      <a:off x="0" y="0"/>
+                      <a:ext cx="5486400" cy="6065798"/>
+                    </a:xfrm>
+                    <a:prstGeom prst="rect"/>
+                  </pic:spPr>
+                </pic:pic>
+              </a:graphicData>
+            </a:graphic>
+          </wp:inline>
+        </w:drawing>
+      </w:r>
+    </w:p>
+    <w:p/>
+    <w:p>
+      <w:pPr>
+        <w:spacing w:before="160" w:after="40"/>
+      </w:pPr>
+      <w:r>
+        <w:rPr>
+          <w:b/>
+          <w:i w:val="0"/>
+          <w:color w:val="0F172A"/>
+          <w:sz w:val="24"/>
+        </w:rPr>
+        <w:t>Payout Type Considerations</w:t>
+      </w:r>
+    </w:p>
+    <w:tbl>
+      <w:tblPr>
+        <w:tblStyle w:val="TableGrid"/>
+        <w:tblW w:type="auto" w:w="0"/>
+        <w:tblLook w:firstColumn="1" w:firstRow="1" w:lastColumn="0" w:lastRow="0" w:noHBand="0" w:noVBand="1" w:val="04A0"/>
+        <w:tblBorders>
+          <w:top w:val="single" w:sz="4" w:color="CCCCCC"/>
+          <w:left w:val="single" w:sz="4" w:color="CCCCCC"/>
+          <w:bottom w:val="single" w:sz="4" w:color="CCCCCC"/>
+          <w:right w:val="single" w:sz="4" w:color="CCCCCC"/>
+          <w:insideH w:val="single" w:sz="4" w:color="CCCCCC"/>
+          <w:insideV w:val="single" w:sz="4" w:color="CCCCCC"/>
+        </w:tblBorders>
+      </w:tblPr>
+      <w:tblGrid>
+        <w:gridCol w:w="4703"/>
+        <w:gridCol w:w="4703"/>
+      </w:tblGrid>
+      <w:tr>
+        <w:tc>
+          <w:tcPr>
+            <w:tcW w:type="dxa" w:w="4703"/>
+            <w:shd w:val="clear" w:color="auto" w:fill="1A73E8"/>
+          </w:tcPr>
+          <w:p>
+            <w:r>
+              <w:rPr>
+                <w:b/>
+                <w:i w:val="0"/>
+                <w:color w:val="FFFFFF"/>
+                <w:sz w:val="22"/>
+              </w:rPr>
+              <w:t>Payout Type</w:t>
+            </w:r>
+          </w:p>
+        </w:tc>
+        <w:tc>
+          <w:tcPr>
+            <w:tcW w:type="dxa" w:w="4703"/>
+            <w:shd w:val="clear" w:color="auto" w:fill="1A73E8"/>
+          </w:tcPr>
+          <w:p>
+            <w:r>
+              <w:rPr>
+                <w:b/>
+                <w:i w:val="0"/>
+                <w:color w:val="FFFFFF"/>
+                <w:sz w:val="22"/>
+              </w:rPr>
+              <w:t>Impact</w:t>
+            </w:r>
+          </w:p>
+        </w:tc>
+      </w:tr>
+      <w:tr>
+        <w:tc>
+          <w:tcPr>
+            <w:tcW w:type="dxa" w:w="4703"/>
+            <w:shd w:val="clear" w:color="auto" w:fill="FFFFFF"/>
+          </w:tcPr>
+          <w:p>
+            <w:r>
+              <w:rPr>
+                <w:b/>
+                <w:i w:val="0"/>
+                <w:sz w:val="22"/>
+              </w:rPr>
+              <w:t>Single Payout (UI)</w:t>
+            </w:r>
+          </w:p>
+        </w:tc>
+        <w:tc>
+          <w:tcPr>
+            <w:tcW w:type="dxa" w:w="4703"/>
+            <w:shd w:val="clear" w:color="auto" w:fill="FFFFFF"/>
+          </w:tcPr>
+          <w:p>
+            <w:r>
+              <w:rPr>
+                <w:b w:val="0"/>
+                <w:i w:val="0"/>
+                <w:sz w:val="22"/>
+              </w:rPr>
+              <w:t>One orchestrated call via Tax-Compliance</w:t>
+            </w:r>
+          </w:p>
+        </w:tc>
+      </w:tr>
+      <w:tr>
+        <w:tc>
+          <w:tcPr>
+            <w:tcW w:type="dxa" w:w="4703"/>
+            <w:shd w:val="clear" w:color="auto" w:fill="F8FAFC"/>
+          </w:tcPr>
+          <w:p>
+            <w:r>
+              <w:rPr>
+                <w:b/>
+                <w:i w:val="0"/>
+                <w:sz w:val="22"/>
+              </w:rPr>
+              <w:t>Bulk Payout (CSV)</w:t>
+            </w:r>
+          </w:p>
+        </w:tc>
+        <w:tc>
+          <w:tcPr>
+            <w:tcW w:type="dxa" w:w="4703"/>
+            <w:shd w:val="clear" w:color="auto" w:fill="F8FAFC"/>
+          </w:tcPr>
+          <w:p>
+            <w:r>
+              <w:rPr>
+                <w:b w:val="0"/>
+                <w:i w:val="0"/>
+                <w:sz w:val="22"/>
+              </w:rPr>
+              <w:t>Would require new bulk orchestration API in Tax-Compliance; complex error handling</w:t>
+            </w:r>
+          </w:p>
+        </w:tc>
+      </w:tr>
+      <w:tr>
+        <w:tc>
+          <w:tcPr>
+            <w:tcW w:type="dxa" w:w="4703"/>
+            <w:shd w:val="clear" w:color="auto" w:fill="FFFFFF"/>
+          </w:tcPr>
+          <w:p>
+            <w:r>
+              <w:rPr>
+                <w:b/>
+                <w:i w:val="0"/>
+                <w:sz w:val="22"/>
+              </w:rPr>
+              <w:t>API Payouts</w:t>
+            </w:r>
+          </w:p>
+        </w:tc>
+        <w:tc>
+          <w:tcPr>
+            <w:tcW w:type="dxa" w:w="4703"/>
+            <w:shd w:val="clear" w:color="auto" w:fill="FFFFFF"/>
+          </w:tcPr>
+          <w:p>
+            <w:r>
+              <w:rPr>
+                <w:b w:val="0"/>
+                <w:i w:val="0"/>
+                <w:sz w:val="22"/>
+              </w:rPr>
+              <w:t>External users call Tax-Compliance instead of Payouts (API surface change)</w:t>
+            </w:r>
+          </w:p>
+        </w:tc>
+      </w:tr>
+    </w:tbl>
+    <w:p/>
+    <w:p>
+      <w:pPr>
+        <w:spacing w:before="160" w:after="40"/>
+      </w:pPr>
+      <w:r>
+        <w:rPr>
+          <w:b/>
+          <w:i w:val="0"/>
+          <w:color w:val="0F172A"/>
+          <w:sz w:val="24"/>
+        </w:rPr>
+        <w:t>Pros and Cons</w:t>
+      </w:r>
+    </w:p>
+    <w:tbl>
+      <w:tblPr>
+        <w:tblStyle w:val="TableGrid"/>
+        <w:tblW w:type="auto" w:w="0"/>
+        <w:tblLook w:firstColumn="1" w:firstRow="1" w:lastColumn="0" w:lastRow="0" w:noHBand="0" w:noVBand="1" w:val="04A0"/>
+        <w:tblBorders>
+          <w:top w:val="single" w:sz="4" w:color="CCCCCC"/>
+          <w:left w:val="single" w:sz="4" w:color="CCCCCC"/>
+          <w:bottom w:val="single" w:sz="4" w:color="CCCCCC"/>
+          <w:right w:val="single" w:sz="4" w:color="CCCCCC"/>
+          <w:insideH w:val="single" w:sz="4" w:color="CCCCCC"/>
+          <w:insideV w:val="single" w:sz="4" w:color="CCCCCC"/>
+        </w:tblBorders>
+      </w:tblPr>
+      <w:tblGrid>
+        <w:gridCol w:w="4703"/>
+        <w:gridCol w:w="4703"/>
+      </w:tblGrid>
+      <w:tr>
+        <w:tc>
+          <w:tcPr>
+            <w:tcW w:type="dxa" w:w="4703"/>
+            <w:shd w:val="clear" w:color="auto" w:fill="1A73E8"/>
+          </w:tcPr>
+          <w:p>
+            <w:r>
+              <w:rPr>
+                <w:b/>
+                <w:i w:val="0"/>
+                <w:color w:val="FFFFFF"/>
+                <w:sz w:val="22"/>
+              </w:rPr>
+              <w:t>Pros</w:t>
+            </w:r>
+          </w:p>
+        </w:tc>
+        <w:tc>
+          <w:tcPr>
+            <w:tcW w:type="dxa" w:w="4703"/>
+            <w:shd w:val="clear" w:color="auto" w:fill="1A73E8"/>
+          </w:tcPr>
+          <w:p>
+            <w:r>
+              <w:rPr>
+                <w:b/>
+                <w:i w:val="0"/>
+                <w:color w:val="FFFFFF"/>
+                <w:sz w:val="22"/>
+              </w:rPr>
+              <w:t>Cons</w:t>
+            </w:r>
+          </w:p>
+        </w:tc>
+      </w:tr>
+      <w:tr>
+        <w:tc>
+          <w:tcPr>
+            <w:tcW w:type="dxa" w:w="4703"/>
+            <w:shd w:val="clear" w:color="auto" w:fill="FFFFFF"/>
+          </w:tcPr>
+          <w:p>
+            <w:r>
+              <w:rPr>
+                <w:b w:val="0"/>
+                <w:i w:val="0"/>
+                <w:sz w:val="22"/>
+              </w:rPr>
+              <w:t>Single API call returns both TDS Payment ID and Payout ID</w:t>
+            </w:r>
+          </w:p>
+        </w:tc>
+        <w:tc>
+          <w:tcPr>
+            <w:tcW w:type="dxa" w:w="4703"/>
+            <w:shd w:val="clear" w:color="auto" w:fill="FFFFFF"/>
+          </w:tcPr>
+          <w:p>
+            <w:r>
+              <w:rPr>
+                <w:b w:val="0"/>
+                <w:i w:val="0"/>
+                <w:sz w:val="22"/>
+              </w:rPr>
+              <w:t>Reversed S2S call (Tax-Compliance → Payouts adds latency)</w:t>
+            </w:r>
+          </w:p>
+        </w:tc>
+      </w:tr>
+      <w:tr>
+        <w:tc>
+          <w:tcPr>
+            <w:tcW w:type="dxa" w:w="4703"/>
+            <w:shd w:val="clear" w:color="auto" w:fill="F8FAFC"/>
+          </w:tcPr>
+          <w:p>
+            <w:r>
+              <w:rPr>
+                <w:b w:val="0"/>
+                <w:i w:val="0"/>
+                <w:sz w:val="22"/>
+              </w:rPr>
+              <w:t>TDS Payment entity available synchronously</w:t>
+            </w:r>
+          </w:p>
+        </w:tc>
+        <w:tc>
+          <w:tcPr>
+            <w:tcW w:type="dxa" w:w="4703"/>
+            <w:shd w:val="clear" w:color="auto" w:fill="F8FAFC"/>
+          </w:tcPr>
+          <w:p>
+            <w:r>
+              <w:rPr>
+                <w:b w:val="0"/>
+                <w:i w:val="0"/>
+                <w:sz w:val="22"/>
+              </w:rPr>
+              <w:t>Tax-Compliance depends on Payouts (tight coupling)</w:t>
+            </w:r>
+          </w:p>
+        </w:tc>
+      </w:tr>
+      <w:tr>
+        <w:tc>
+          <w:tcPr>
+            <w:tcW w:type="dxa" w:w="4703"/>
+            <w:shd w:val="clear" w:color="auto" w:fill="FFFFFF"/>
+          </w:tcPr>
+          <w:p>
+            <w:r>
+              <w:rPr>
+                <w:b w:val="0"/>
+                <w:i w:val="0"/>
+                <w:sz w:val="22"/>
+              </w:rPr>
+              <w:t>Tax-Compliance owns all TDS data</w:t>
+            </w:r>
+          </w:p>
+        </w:tc>
+        <w:tc>
+          <w:tcPr>
+            <w:tcW w:type="dxa" w:w="4703"/>
+            <w:shd w:val="clear" w:color="auto" w:fill="FFFFFF"/>
+          </w:tcPr>
+          <w:p>
+            <w:r>
+              <w:rPr>
+                <w:b w:val="0"/>
+                <w:i w:val="0"/>
+                <w:sz w:val="22"/>
+              </w:rPr>
+              <w:t>Domain leakage - Tax-Compliance must understand payout creation</w:t>
+            </w:r>
+          </w:p>
+        </w:tc>
+      </w:tr>
+      <w:tr>
+        <w:tc>
+          <w:tcPr>
+            <w:tcW w:type="dxa" w:w="4703"/>
+            <w:shd w:val="clear" w:color="auto" w:fill="F8FAFC"/>
+          </w:tcPr>
+          <w:p>
+            <w:r>
+              <w:rPr>
+                <w:b w:val="0"/>
+                <w:i w:val="0"/>
+                <w:sz w:val="22"/>
+              </w:rPr>
+              <w:t>No new Kafka topic needed</w:t>
+            </w:r>
+          </w:p>
+        </w:tc>
+        <w:tc>
+          <w:tcPr>
+            <w:tcW w:type="dxa" w:w="4703"/>
+            <w:shd w:val="clear" w:color="auto" w:fill="F8FAFC"/>
+          </w:tcPr>
+          <w:p>
+            <w:r>
+              <w:rPr>
+                <w:b w:val="0"/>
+                <w:i w:val="0"/>
+                <w:sz w:val="22"/>
+              </w:rPr>
+              <w:t>Complex orchestration logic in Tax-Compliance</w:t>
+            </w:r>
+          </w:p>
+        </w:tc>
+      </w:tr>
+      <w:tr>
+        <w:tc>
+          <w:tcPr>
+            <w:tcW w:type="dxa" w:w="4703"/>
+            <w:shd w:val="clear" w:color="auto" w:fill="FFFFFF"/>
+          </w:tcPr>
+          <w:p>
+            <w:r>
+              <w:rPr>
+                <w:b w:val="0"/>
+                <w:i w:val="0"/>
+                <w:sz w:val="22"/>
+              </w:rPr>
+              <w:t>Minimal Payouts changes</w:t>
+            </w:r>
+          </w:p>
+        </w:tc>
+        <w:tc>
+          <w:tcPr>
+            <w:tcW w:type="dxa" w:w="4703"/>
+            <w:shd w:val="clear" w:color="auto" w:fill="FFFFFF"/>
+          </w:tcPr>
+          <w:p>
+            <w:r>
+              <w:rPr>
+                <w:b w:val="0"/>
+                <w:i w:val="0"/>
+                <w:sz w:val="22"/>
+              </w:rPr>
+              <w:t>Bulk payout support requires significant Tax-Compliance work</w:t>
+            </w:r>
+          </w:p>
+        </w:tc>
+      </w:tr>
+    </w:tbl>
+    <w:p/>
+    <w:p>
+      <w:pPr>
+        <w:shd w:val="clear" w:color="auto" w:fill="FFFBEB"/>
+        <w:pBdr>
+          <w:left w:val="single" w:sz="18" w:space="6" w:color="1A73E8"/>
+        </w:pBdr>
+        <w:spacing w:before="80" w:after="40"/>
+        <w:ind w:left="120"/>
+      </w:pPr>
+      <w:r>
+        <w:rPr>
+          <w:b/>
+          <w:i w:val="0"/>
+          <w:color w:val="0F172A"/>
+          <w:sz w:val="24"/>
+        </w:rPr>
+        <w:t>When to Consider</w:t>
+      </w:r>
+    </w:p>
+    <w:p>
+      <w:pPr>
+        <w:shd w:val="clear" w:color="auto" w:fill="FFFBEB"/>
+        <w:pBdr>
+          <w:left w:val="single" w:sz="18" w:space="6" w:color="1A73E8"/>
+        </w:pBdr>
+        <w:spacing w:before="0" w:after="40"/>
+        <w:ind w:left="120"/>
+      </w:pPr>
+      <w:r>
+        <w:rPr>
+          <w:b w:val="0"/>
+          <w:i w:val="0"/>
+          <w:sz w:val="22"/>
+        </w:rPr>
+        <w:t xml:space="preserve"> This approach is viable if having the TDS Payment ID synchronously in the API response is a hard requirement. However, it introduces orchestration complexity and reverses the natural dependency direction (Tax-Compliance calling Payouts). </w:t>
+      </w:r>
+    </w:p>
+    <w:p>
+      <w:pPr>
+        <w:spacing w:before="0" w:after="80"/>
+      </w:pPr>
+    </w:p>
+    <w:p>
+      <w:pPr>
+        <w:pBdr>
+          <w:bottom w:val="single" w:sz="6" w:color="E2E8F0"/>
+        </w:pBdr>
+      </w:pPr>
+    </w:p>
+    <w:p>
+      <w:pPr>
+        <w:pStyle w:val="Heading3"/>
+      </w:pPr>
+      <w:r>
+        <w:t>Approach 3: Pre-Compute Pattern (Not Recommended)</w:t>
+      </w:r>
+    </w:p>
+    <w:p>
+      <w:r>
+        <w:rPr>
+          <w:i/>
+          <w:sz w:val="20"/>
+        </w:rPr>
+        <w:t>Not Recommended — Caller pre-computes TDS via Tax-Compliance first, then calls Payouts separately; two API calls</w:t>
+      </w:r>
+    </w:p>
+    <w:p>
+      <w:pPr>
+        <w:spacing w:before="160" w:after="40"/>
+      </w:pPr>
+      <w:r>
+        <w:rPr>
+          <w:b/>
+          <w:i w:val="0"/>
+          <w:color w:val="0F172A"/>
+          <w:sz w:val="24"/>
+        </w:rPr>
+        <w:t>How It Works</w:t>
+      </w:r>
+    </w:p>
+    <w:p>
+      <w:r>
+        <w:rPr>
+          <w:b w:val="0"/>
+          <w:i w:val="0"/>
+          <w:sz w:val="22"/>
+        </w:rPr>
+        <w:t xml:space="preserve"> The caller (UI/BFF or API merchant) makes TWO separate API calls: first to Tax-Compliance to compute TDS and create the tds_payments entity, then to Payouts to create the payout with the pre-computed net amount. </w:t>
+      </w:r>
+    </w:p>
+    <w:p>
+      <w:pPr>
+        <w:shd w:val="clear" w:color="auto" w:fill="EFF6FF"/>
+        <w:pBdr>
+          <w:left w:val="single" w:sz="18" w:space="6" w:color="1A73E8"/>
+        </w:pBdr>
+        <w:spacing w:before="80" w:after="40"/>
+        <w:ind w:left="120"/>
+      </w:pPr>
+      <w:r>
+        <w:rPr>
+          <w:b/>
+          <w:i w:val="0"/>
+          <w:color w:val="0F172A"/>
+          <w:sz w:val="24"/>
+        </w:rPr>
+        <w:t>Flow Summary</w:t>
+      </w:r>
+    </w:p>
+    <w:p>
+      <w:pPr>
+        <w:shd w:val="clear" w:color="auto" w:fill="EFF6FF"/>
+        <w:pBdr>
+          <w:left w:val="single" w:sz="18" w:space="6" w:color="1A73E8"/>
+        </w:pBdr>
+        <w:spacing w:before="0" w:after="40"/>
+        <w:ind w:left="300" w:hanging="180"/>
+      </w:pPr>
+      <w:r>
+        <w:rPr>
+          <w:sz w:val="22"/>
+        </w:rPr>
+        <w:t xml:space="preserve">•  </w:t>
+      </w:r>
+      <w:r>
+        <w:rPr>
+          <w:b/>
+          <w:i w:val="0"/>
+          <w:sz w:val="22"/>
+        </w:rPr>
+        <w:t>Compute TDS (First API Call):</w:t>
+      </w:r>
+      <w:r>
+        <w:rPr>
+          <w:b w:val="0"/>
+          <w:i w:val="0"/>
+          <w:sz w:val="22"/>
+        </w:rPr>
+        <w:t xml:space="preserve"> Caller calls Tax-Compliance API with gross_amount, category_id, contact_id</w:t>
+      </w:r>
+    </w:p>
+    <w:p>
+      <w:pPr>
+        <w:shd w:val="clear" w:color="auto" w:fill="EFF6FF"/>
+        <w:pBdr>
+          <w:left w:val="single" w:sz="18" w:space="6" w:color="1A73E8"/>
+        </w:pBdr>
+        <w:spacing w:before="0" w:after="40"/>
+        <w:ind w:left="300" w:hanging="180"/>
+      </w:pPr>
+      <w:r>
+        <w:rPr>
+          <w:sz w:val="22"/>
+        </w:rPr>
+        <w:t xml:space="preserve">•  </w:t>
+      </w:r>
+      <w:r>
+        <w:rPr>
+          <w:b/>
+          <w:i w:val="0"/>
+          <w:sz w:val="22"/>
+        </w:rPr>
+        <w:t>TDS Entity Created:</w:t>
+      </w:r>
+      <w:r>
+        <w:rPr>
+          <w:b w:val="0"/>
+          <w:i w:val="0"/>
+          <w:sz w:val="22"/>
+        </w:rPr>
+        <w:t xml:space="preserve"> Tax-Compliance computes TDS, creates tds_payments entity (status: PENDING), returns tds_payment_id, tds_amount, net_amount</w:t>
+      </w:r>
+    </w:p>
+    <w:p>
+      <w:pPr>
+        <w:shd w:val="clear" w:color="auto" w:fill="EFF6FF"/>
+        <w:pBdr>
+          <w:left w:val="single" w:sz="18" w:space="6" w:color="1A73E8"/>
+        </w:pBdr>
+        <w:spacing w:before="0" w:after="40"/>
+        <w:ind w:left="300" w:hanging="180"/>
+      </w:pPr>
+      <w:r>
+        <w:rPr>
+          <w:sz w:val="22"/>
+        </w:rPr>
+        <w:t xml:space="preserve">•  </w:t>
+      </w:r>
+      <w:r>
+        <w:rPr>
+          <w:b/>
+          <w:i w:val="0"/>
+          <w:sz w:val="22"/>
+        </w:rPr>
+        <w:t>Create Payout (Second API Call):</w:t>
+      </w:r>
+      <w:r>
+        <w:rPr>
+          <w:b w:val="0"/>
+          <w:i w:val="0"/>
+          <w:sz w:val="22"/>
+        </w:rPr>
+        <w:t xml:space="preserve"> Caller calls Payouts API with net_amount and tds_payment_id in metadata</w:t>
+      </w:r>
+    </w:p>
+    <w:p>
+      <w:pPr>
+        <w:shd w:val="clear" w:color="auto" w:fill="EFF6FF"/>
+        <w:pBdr>
+          <w:left w:val="single" w:sz="18" w:space="6" w:color="1A73E8"/>
+        </w:pBdr>
+        <w:spacing w:before="0" w:after="40"/>
+        <w:ind w:left="300" w:hanging="180"/>
+      </w:pPr>
+      <w:r>
+        <w:rPr>
+          <w:sz w:val="22"/>
+        </w:rPr>
+        <w:t xml:space="preserve">•  </w:t>
+      </w:r>
+      <w:r>
+        <w:rPr>
+          <w:b/>
+          <w:i w:val="0"/>
+          <w:sz w:val="22"/>
+        </w:rPr>
+        <w:t>Payout Creation:</w:t>
+      </w:r>
+      <w:r>
+        <w:rPr>
+          <w:b w:val="0"/>
+          <w:i w:val="0"/>
+          <w:sz w:val="22"/>
+        </w:rPr>
+        <w:t xml:space="preserve"> Payouts creates payout with net_amount (no S2S call, no amount mutation)</w:t>
+      </w:r>
+    </w:p>
+    <w:p>
+      <w:pPr>
+        <w:shd w:val="clear" w:color="auto" w:fill="EFF6FF"/>
+        <w:pBdr>
+          <w:left w:val="single" w:sz="18" w:space="6" w:color="1A73E8"/>
+        </w:pBdr>
+        <w:spacing w:before="0" w:after="40"/>
+        <w:ind w:left="300" w:hanging="180"/>
+      </w:pPr>
+      <w:r>
+        <w:rPr>
+          <w:sz w:val="22"/>
+        </w:rPr>
+        <w:t xml:space="preserve">•  </w:t>
+      </w:r>
+      <w:r>
+        <w:rPr>
+          <w:b/>
+          <w:i w:val="0"/>
+          <w:sz w:val="22"/>
+        </w:rPr>
+        <w:t>TDS Update:</w:t>
+      </w:r>
+      <w:r>
+        <w:rPr>
+          <w:b w:val="0"/>
+          <w:i w:val="0"/>
+          <w:sz w:val="22"/>
+        </w:rPr>
+        <w:t xml:space="preserve"> When payout reaches terminal state, Tax-Compliance updates tds_payments entity status via payout status events</w:t>
+      </w:r>
+    </w:p>
+    <w:p>
+      <w:pPr>
+        <w:spacing w:before="0" w:after="80"/>
+      </w:pPr>
+    </w:p>
+    <w:p>
+      <w:pPr>
+        <w:spacing w:before="160" w:after="40"/>
+      </w:pPr>
+      <w:r>
+        <w:rPr>
+          <w:b/>
+          <w:i w:val="0"/>
+          <w:color w:val="0F172A"/>
+          <w:sz w:val="24"/>
+        </w:rPr>
+        <w:t>Flow Diagram</w:t>
+      </w:r>
+    </w:p>
+    <w:p>
+      <w:pPr>
+        <w:jc w:val="center"/>
+      </w:pPr>
+      <w:r>
+        <w:drawing>
+          <wp:inline xmlns:a="http://schemas.openxmlformats.org/drawingml/2006/main" xmlns:pic="http://schemas.openxmlformats.org/drawingml/2006/picture">
+            <wp:extent cx="5486400" cy="3736214"/>
+            <wp:docPr id="6" name="Picture 6"/>
+            <wp:cNvGraphicFramePr>
+              <a:graphicFrameLocks noChangeAspect="1"/>
+            </wp:cNvGraphicFramePr>
+            <a:graphic>
+              <a:graphicData uri="http://schemas.openxmlformats.org/drawingml/2006/picture">
+                <pic:pic>
+                  <pic:nvPicPr>
+                    <pic:cNvPr id="0" name="diagram_5.png"/>
+                    <pic:cNvPicPr/>
+                  </pic:nvPicPr>
+                  <pic:blipFill>
+                    <a:blip r:embed="rId16"/>
+                    <a:stretch>
+                      <a:fillRect/>
+                    </a:stretch>
+                  </pic:blipFill>
+                  <pic:spPr>
+                    <a:xfrm>
+                      <a:off x="0" y="0"/>
+                      <a:ext cx="5486400" cy="3736214"/>
+                    </a:xfrm>
+                    <a:prstGeom prst="rect"/>
+                  </pic:spPr>
+                </pic:pic>
+              </a:graphicData>
+            </a:graphic>
+          </wp:inline>
+        </w:drawing>
+      </w:r>
+    </w:p>
+    <w:p/>
+    <w:p>
+      <w:pPr>
+        <w:spacing w:before="160" w:after="40"/>
+      </w:pPr>
+      <w:r>
+        <w:rPr>
+          <w:b/>
+          <w:i w:val="0"/>
+          <w:color w:val="0F172A"/>
+          <w:sz w:val="24"/>
+        </w:rPr>
+        <w:t>Payout Type Considerations</w:t>
+      </w:r>
+    </w:p>
+    <w:tbl>
+      <w:tblPr>
+        <w:tblStyle w:val="TableGrid"/>
+        <w:tblW w:type="auto" w:w="0"/>
+        <w:tblLook w:firstColumn="1" w:firstRow="1" w:lastColumn="0" w:lastRow="0" w:noHBand="0" w:noVBand="1" w:val="04A0"/>
+        <w:tblBorders>
+          <w:top w:val="single" w:sz="4" w:color="CCCCCC"/>
+          <w:left w:val="single" w:sz="4" w:color="CCCCCC"/>
+          <w:bottom w:val="single" w:sz="4" w:color="CCCCCC"/>
+          <w:right w:val="single" w:sz="4" w:color="CCCCCC"/>
+          <w:insideH w:val="single" w:sz="4" w:color="CCCCCC"/>
+          <w:insideV w:val="single" w:sz="4" w:color="CCCCCC"/>
+        </w:tblBorders>
+      </w:tblPr>
+      <w:tblGrid>
+        <w:gridCol w:w="4703"/>
+        <w:gridCol w:w="4703"/>
+      </w:tblGrid>
+      <w:tr>
+        <w:tc>
+          <w:tcPr>
+            <w:tcW w:type="dxa" w:w="4703"/>
+            <w:shd w:val="clear" w:color="auto" w:fill="1A73E8"/>
+          </w:tcPr>
+          <w:p>
+            <w:r>
+              <w:rPr>
+                <w:b/>
+                <w:i w:val="0"/>
+                <w:color w:val="FFFFFF"/>
+                <w:sz w:val="22"/>
+              </w:rPr>
+              <w:t>Payout Type</w:t>
+            </w:r>
+          </w:p>
+        </w:tc>
+        <w:tc>
+          <w:tcPr>
+            <w:tcW w:type="dxa" w:w="4703"/>
+            <w:shd w:val="clear" w:color="auto" w:fill="1A73E8"/>
+          </w:tcPr>
+          <w:p>
+            <w:r>
+              <w:rPr>
+                <w:b/>
+                <w:i w:val="0"/>
+                <w:color w:val="FFFFFF"/>
+                <w:sz w:val="22"/>
+              </w:rPr>
+              <w:t>Impact</w:t>
+            </w:r>
+          </w:p>
+        </w:tc>
+      </w:tr>
+      <w:tr>
+        <w:tc>
+          <w:tcPr>
+            <w:tcW w:type="dxa" w:w="4703"/>
+            <w:shd w:val="clear" w:color="auto" w:fill="FFFFFF"/>
+          </w:tcPr>
+          <w:p>
+            <w:r>
+              <w:rPr>
+                <w:b/>
+                <w:i w:val="0"/>
+                <w:sz w:val="22"/>
+              </w:rPr>
+              <w:t>Single Payout (UI)</w:t>
+            </w:r>
+          </w:p>
+        </w:tc>
+        <w:tc>
+          <w:tcPr>
+            <w:tcW w:type="dxa" w:w="4703"/>
+            <w:shd w:val="clear" w:color="auto" w:fill="FFFFFF"/>
+          </w:tcPr>
+          <w:p>
+            <w:r>
+              <w:rPr>
+                <w:b w:val="0"/>
+                <w:i w:val="0"/>
+                <w:sz w:val="22"/>
+              </w:rPr>
+              <w:t>Two API calls required (TDS compute + payout creation); acceptable for single payouts</w:t>
+            </w:r>
+          </w:p>
+        </w:tc>
+      </w:tr>
+      <w:tr>
+        <w:tc>
+          <w:tcPr>
+            <w:tcW w:type="dxa" w:w="4703"/>
+            <w:shd w:val="clear" w:color="auto" w:fill="F8FAFC"/>
+          </w:tcPr>
+          <w:p>
+            <w:r>
+              <w:rPr>
+                <w:b/>
+                <w:i w:val="0"/>
+                <w:sz w:val="22"/>
+              </w:rPr>
+              <w:t>Bulk Payout (CSV)</w:t>
+            </w:r>
+          </w:p>
+        </w:tc>
+        <w:tc>
+          <w:tcPr>
+            <w:tcW w:type="dxa" w:w="4703"/>
+            <w:shd w:val="clear" w:color="auto" w:fill="F8FAFC"/>
+          </w:tcPr>
+          <w:p>
+            <w:r>
+              <w:rPr>
+                <w:b w:val="0"/>
+                <w:i w:val="0"/>
+                <w:sz w:val="22"/>
+              </w:rPr>
+              <w:t>Must compute TDS for all rows first, then create payouts; complex workflow with intermediate state management</w:t>
+            </w:r>
+          </w:p>
+        </w:tc>
+      </w:tr>
+      <w:tr>
+        <w:tc>
+          <w:tcPr>
+            <w:tcW w:type="dxa" w:w="4703"/>
+            <w:shd w:val="clear" w:color="auto" w:fill="FFFFFF"/>
+          </w:tcPr>
+          <w:p>
+            <w:r>
+              <w:rPr>
+                <w:b/>
+                <w:i w:val="0"/>
+                <w:sz w:val="22"/>
+              </w:rPr>
+              <w:t>API Payouts</w:t>
+            </w:r>
+          </w:p>
+        </w:tc>
+        <w:tc>
+          <w:tcPr>
+            <w:tcW w:type="dxa" w:w="4703"/>
+            <w:shd w:val="clear" w:color="auto" w:fill="FFFFFF"/>
+          </w:tcPr>
+          <w:p>
+            <w:r>
+              <w:rPr>
+                <w:b w:val="0"/>
+                <w:i w:val="0"/>
+                <w:sz w:val="22"/>
+              </w:rPr>
+              <w:t>API merchants must make two sequential API calls; breaks one-stop solution requirement</w:t>
+            </w:r>
+          </w:p>
+        </w:tc>
+      </w:tr>
+    </w:tbl>
+    <w:p/>
+    <w:p>
+      <w:pPr>
+        <w:spacing w:before="160" w:after="40"/>
+      </w:pPr>
+      <w:r>
+        <w:rPr>
+          <w:b/>
+          <w:i w:val="0"/>
+          <w:color w:val="0F172A"/>
+          <w:sz w:val="24"/>
+        </w:rPr>
+        <w:t>Pros and Cons</w:t>
+      </w:r>
+    </w:p>
+    <w:tbl>
+      <w:tblPr>
+        <w:tblStyle w:val="TableGrid"/>
+        <w:tblW w:type="auto" w:w="0"/>
+        <w:tblLook w:firstColumn="1" w:firstRow="1" w:lastColumn="0" w:lastRow="0" w:noHBand="0" w:noVBand="1" w:val="04A0"/>
+        <w:tblBorders>
+          <w:top w:val="single" w:sz="4" w:color="CCCCCC"/>
+          <w:left w:val="single" w:sz="4" w:color="CCCCCC"/>
+          <w:bottom w:val="single" w:sz="4" w:color="CCCCCC"/>
+          <w:right w:val="single" w:sz="4" w:color="CCCCCC"/>
+          <w:insideH w:val="single" w:sz="4" w:color="CCCCCC"/>
+          <w:insideV w:val="single" w:sz="4" w:color="CCCCCC"/>
+        </w:tblBorders>
+      </w:tblPr>
+      <w:tblGrid>
+        <w:gridCol w:w="4703"/>
+        <w:gridCol w:w="4703"/>
+      </w:tblGrid>
+      <w:tr>
+        <w:tc>
+          <w:tcPr>
+            <w:tcW w:type="dxa" w:w="4703"/>
+            <w:shd w:val="clear" w:color="auto" w:fill="1A73E8"/>
+          </w:tcPr>
+          <w:p>
+            <w:r>
+              <w:rPr>
+                <w:b/>
+                <w:i w:val="0"/>
+                <w:color w:val="FFFFFF"/>
+                <w:sz w:val="22"/>
+              </w:rPr>
+              <w:t>Pros</w:t>
+            </w:r>
+          </w:p>
+        </w:tc>
+        <w:tc>
+          <w:tcPr>
+            <w:tcW w:type="dxa" w:w="4703"/>
+            <w:shd w:val="clear" w:color="auto" w:fill="1A73E8"/>
+          </w:tcPr>
+          <w:p>
+            <w:r>
+              <w:rPr>
+                <w:b/>
+                <w:i w:val="0"/>
+                <w:color w:val="FFFFFF"/>
+                <w:sz w:val="22"/>
+              </w:rPr>
+              <w:t>Cons</w:t>
+            </w:r>
+          </w:p>
+        </w:tc>
+      </w:tr>
+      <w:tr>
+        <w:tc>
+          <w:tcPr>
+            <w:tcW w:type="dxa" w:w="4703"/>
+            <w:shd w:val="clear" w:color="auto" w:fill="FFFFFF"/>
+          </w:tcPr>
+          <w:p>
+            <w:r>
+              <w:rPr>
+                <w:b w:val="0"/>
+                <w:i w:val="0"/>
+                <w:sz w:val="22"/>
+              </w:rPr>
+              <w:t>No S2S coupling between Payouts and Tax-Compliance</w:t>
+            </w:r>
+          </w:p>
+        </w:tc>
+        <w:tc>
+          <w:tcPr>
+            <w:tcW w:type="dxa" w:w="4703"/>
+            <w:shd w:val="clear" w:color="auto" w:fill="FFFFFF"/>
+          </w:tcPr>
+          <w:p>
+            <w:r>
+              <w:rPr>
+                <w:b w:val="0"/>
+                <w:i w:val="0"/>
+                <w:sz w:val="22"/>
+              </w:rPr>
+              <w:t>TWO API calls required for merchants (breaks one-stop solution)</w:t>
+            </w:r>
+          </w:p>
+        </w:tc>
+      </w:tr>
+      <w:tr>
+        <w:tc>
+          <w:tcPr>
+            <w:tcW w:type="dxa" w:w="4703"/>
+            <w:shd w:val="clear" w:color="auto" w:fill="F8FAFC"/>
+          </w:tcPr>
+          <w:p>
+            <w:r>
+              <w:rPr>
+                <w:b w:val="0"/>
+                <w:i w:val="0"/>
+                <w:sz w:val="22"/>
+              </w:rPr>
+              <w:t>No amount mutation in Payouts (caller sends net amount directly)</w:t>
+            </w:r>
+          </w:p>
+        </w:tc>
+        <w:tc>
+          <w:tcPr>
+            <w:tcW w:type="dxa" w:w="4703"/>
+            <w:shd w:val="clear" w:color="auto" w:fill="F8FAFC"/>
+          </w:tcPr>
+          <w:p>
+            <w:r>
+              <w:rPr>
+                <w:b w:val="0"/>
+                <w:i w:val="0"/>
+                <w:sz w:val="22"/>
+              </w:rPr>
+              <w:t>Complex workflow for bulk payouts (compute all TDS first, then create payouts)</w:t>
+            </w:r>
+          </w:p>
+        </w:tc>
+      </w:tr>
+      <w:tr>
+        <w:tc>
+          <w:tcPr>
+            <w:tcW w:type="dxa" w:w="4703"/>
+            <w:shd w:val="clear" w:color="auto" w:fill="FFFFFF"/>
+          </w:tcPr>
+          <w:p>
+            <w:r>
+              <w:rPr>
+                <w:b w:val="0"/>
+                <w:i w:val="0"/>
+                <w:sz w:val="22"/>
+              </w:rPr>
+              <w:t>TDS entity created synchronously in first call</w:t>
+            </w:r>
+          </w:p>
+        </w:tc>
+        <w:tc>
+          <w:tcPr>
+            <w:tcW w:type="dxa" w:w="4703"/>
+            <w:shd w:val="clear" w:color="auto" w:fill="FFFFFF"/>
+          </w:tcPr>
+          <w:p>
+            <w:r>
+              <w:rPr>
+                <w:b w:val="0"/>
+                <w:i w:val="0"/>
+                <w:sz w:val="22"/>
+              </w:rPr>
+              <w:t>Poor UX for API merchants (must orchestrate two sequential calls)</w:t>
+            </w:r>
+          </w:p>
+        </w:tc>
+      </w:tr>
+      <w:tr>
+        <w:tc>
+          <w:tcPr>
+            <w:tcW w:type="dxa" w:w="4703"/>
+            <w:shd w:val="clear" w:color="auto" w:fill="F8FAFC"/>
+          </w:tcPr>
+          <w:p>
+            <w:r>
+              <w:rPr>
+                <w:b w:val="0"/>
+                <w:i w:val="0"/>
+                <w:sz w:val="22"/>
+              </w:rPr>
+              <w:t>Clean separation of concerns</w:t>
+            </w:r>
+          </w:p>
+        </w:tc>
+        <w:tc>
+          <w:tcPr>
+            <w:tcW w:type="dxa" w:w="4703"/>
+            <w:shd w:val="clear" w:color="auto" w:fill="F8FAFC"/>
+          </w:tcPr>
+          <w:p>
+            <w:r>
+              <w:rPr>
+                <w:b w:val="0"/>
+                <w:i w:val="0"/>
+                <w:sz w:val="22"/>
+              </w:rPr>
+              <w:t>Intermediate state management required (tds_payments in PENDING between calls)</w:t>
+            </w:r>
+          </w:p>
+        </w:tc>
+      </w:tr>
+      <w:tr>
+        <w:tc>
+          <w:tcPr>
+            <w:tcW w:type="dxa" w:w="4703"/>
+            <w:shd w:val="clear" w:color="auto" w:fill="FFFFFF"/>
+          </w:tcPr>
+          <w:p/>
+        </w:tc>
+        <w:tc>
+          <w:tcPr>
+            <w:tcW w:type="dxa" w:w="4703"/>
+            <w:shd w:val="clear" w:color="auto" w:fill="FFFFFF"/>
+          </w:tcPr>
+          <w:p>
+            <w:r>
+              <w:rPr>
+                <w:b w:val="0"/>
+                <w:i w:val="0"/>
+                <w:sz w:val="22"/>
+              </w:rPr>
+              <w:t>Caller must handle failures in either API call and cleanup orphaned entities</w:t>
+            </w:r>
+          </w:p>
+        </w:tc>
+      </w:tr>
+    </w:tbl>
+    <w:p/>
+    <w:p>
+      <w:pPr>
+        <w:shd w:val="clear" w:color="auto" w:fill="FFFBEB"/>
+        <w:pBdr>
+          <w:left w:val="single" w:sz="18" w:space="6" w:color="1A73E8"/>
+        </w:pBdr>
+        <w:spacing w:before="80" w:after="40"/>
+        <w:ind w:left="120"/>
+      </w:pPr>
+      <w:r>
+        <w:rPr>
+          <w:b/>
+          <w:i w:val="0"/>
+          <w:color w:val="0F172A"/>
+          <w:sz w:val="24"/>
+        </w:rPr>
+        <w:t>Why Not Recommended</w:t>
+      </w:r>
+    </w:p>
+    <w:p>
+      <w:pPr>
+        <w:shd w:val="clear" w:color="auto" w:fill="FFFBEB"/>
+        <w:pBdr>
+          <w:left w:val="single" w:sz="18" w:space="6" w:color="1A73E8"/>
+        </w:pBdr>
+        <w:spacing w:before="0" w:after="40"/>
+        <w:ind w:left="120"/>
+      </w:pPr>
+      <w:r>
+        <w:rPr>
+          <w:b w:val="0"/>
+          <w:i w:val="0"/>
+          <w:sz w:val="22"/>
+        </w:rPr>
+        <w:t xml:space="preserve"> This approach introduces significant technical debt: latency overhead, service coupling, domain leakage, and risky amount mutation. The synchronous S2S call in the critical path makes payouts dependent on Tax-Compliance availability. </w:t>
+      </w:r>
+    </w:p>
+    <w:p>
+      <w:pPr>
+        <w:spacing w:before="0" w:after="80"/>
+      </w:pPr>
+    </w:p>
     <w:p>
       <w:pPr>
         <w:pBdr>
@@ -7744,7 +7728,7 @@
                 <w:i w:val="0"/>
                 <w:sz w:val="22"/>
               </w:rPr>
-              <w:t>Synchronously</w:t>
+              <w:t>Synchronously (enrichment)</w:t>
             </w:r>
           </w:p>
         </w:tc>
@@ -7772,11 +7756,11 @@
           <w:p>
             <w:r>
               <w:rPr>
-                <w:b w:val="0"/>
-                <w:i w:val="0"/>
-                <w:sz w:val="22"/>
-              </w:rPr>
-              <w:t>Asynchronously (Kafka)</w:t>
+                <w:b/>
+                <w:i w:val="0"/>
+                <w:sz w:val="22"/>
+              </w:rPr>
+              <w:t>Synchronously (first call)</w:t>
             </w:r>
           </w:p>
         </w:tc>
@@ -8074,7 +8058,7 @@
                 <w:i w:val="0"/>
                 <w:sz w:val="22"/>
               </w:rPr>
-              <w:t>Yes (sync)</w:t>
+              <w:t>Yes (in payout response)</w:t>
             </w:r>
           </w:p>
         </w:tc>
@@ -8090,7 +8074,7 @@
                 <w:i w:val="0"/>
                 <w:sz w:val="22"/>
               </w:rPr>
-              <w:t>Yes (sync)</w:t>
+              <w:t>Yes (in payout response)</w:t>
             </w:r>
           </w:p>
         </w:tc>
@@ -8106,7 +8090,7 @@
                 <w:i w:val="0"/>
                 <w:sz w:val="22"/>
               </w:rPr>
-              <w:t>No (async)</w:t>
+              <w:t>Yes (but in first call, not payout response)</w:t>
             </w:r>
           </w:p>
         </w:tc>
@@ -9329,7 +9313,7 @@
         <w:pStyle w:val="Heading3"/>
       </w:pPr>
       <w:r>
-        <w:t>8.6.1 Payouts Service — Kafka Routing Logic</w:t>
+        <w:t>8.6.1 Payouts Service — Enrichment Hook Logic</w:t>
       </w:r>
     </w:p>
     <w:p>
@@ -9339,58 +9323,23 @@
           <w:i w:val="0"/>
           <w:sz w:val="22"/>
         </w:rPr>
-        <w:t xml:space="preserve">The only business logic change in Payouts is inside </w:t>
-      </w:r>
-      <w:r>
-        <w:rPr>
-          <w:rFonts w:ascii="Courier New" w:hAnsi="Courier New"/>
+        <w:t xml:space="preserve">The key business logic change in Payouts is the </w:t>
+      </w:r>
+      <w:r>
+        <w:rPr>
+          <w:b/>
+          <w:i w:val="0"/>
+          <w:sz w:val="22"/>
+        </w:rPr>
+        <w:t>enrichment hook</w:t>
+      </w:r>
+      <w:r>
+        <w:rPr>
           <w:b w:val="0"/>
           <w:i w:val="0"/>
           <w:sz w:val="22"/>
         </w:rPr>
-        <w:t>ProcessTdsForPayout()</w:t>
-      </w:r>
-      <w:r>
-        <w:rPr>
-          <w:b w:val="0"/>
-          <w:i w:val="0"/>
-          <w:sz w:val="22"/>
-        </w:rPr>
-        <w:t xml:space="preserve"> in </w:t>
-      </w:r>
-      <w:r>
-        <w:rPr>
-          <w:rFonts w:ascii="Courier New" w:hAnsi="Courier New"/>
-          <w:b w:val="0"/>
-          <w:i w:val="0"/>
-          <w:sz w:val="22"/>
-        </w:rPr>
-        <w:t>core.go</w:t>
-      </w:r>
-      <w:r>
-        <w:rPr>
-          <w:b w:val="0"/>
-          <w:i w:val="0"/>
-          <w:sz w:val="22"/>
-        </w:rPr>
-        <w:t xml:space="preserve">. When a payout reaches a terminal state, the function checks the </w:t>
-      </w:r>
-      <w:r>
-        <w:rPr>
-          <w:rFonts w:ascii="Courier New" w:hAnsi="Courier New"/>
-          <w:b w:val="0"/>
-          <w:i w:val="0"/>
-          <w:sz w:val="22"/>
-        </w:rPr>
-        <w:t>tds.source</w:t>
-      </w:r>
-      <w:r>
-        <w:rPr>
-          <w:b w:val="0"/>
-          <w:i w:val="0"/>
-          <w:sz w:val="22"/>
-        </w:rPr>
-        <w:t xml:space="preserve"> field to decide which Kafka topic to publish to:</w:t>
+        <w:t xml:space="preserve"> that calls Tax-Compliance when TDS fields are present in the payout request. This is implemented as a lightweight, optional hook (~20 LOC) that runs BEFORE payout creation.</w:t>
       </w:r>
     </w:p>
     <w:p>
@@ -9409,7 +9358,7 @@
           <w:color w:val="0F172A"/>
           <w:sz w:val="24"/>
         </w:rPr>
-        <w:t>Routing Decision inProcessTdsForPayout()</w:t>
+        <w:t>Enrichment Flow in Payout Creation Handler</w:t>
       </w:r>
     </w:p>
     <w:p>
@@ -9429,11 +9378,19 @@
       </w:r>
       <w:r>
         <w:rPr>
+          <w:b/>
+          <w:i w:val="0"/>
+          <w:sz w:val="22"/>
+        </w:rPr>
+        <w:t>Check for TDS fields:</w:t>
+      </w:r>
+      <w:r>
+        <w:rPr>
           <w:b w:val="0"/>
           <w:i w:val="0"/>
           <w:sz w:val="22"/>
         </w:rPr>
-        <w:t xml:space="preserve">If </w:t>
+        <w:t xml:space="preserve"> If request contains </w:t>
       </w:r>
       <w:r>
         <w:rPr>
@@ -9442,7 +9399,7 @@
           <w:i w:val="0"/>
           <w:sz w:val="22"/>
         </w:rPr>
-        <w:t>tds.source == "bb_plus"</w:t>
+        <w:t>tds_category_id</w:t>
       </w:r>
       <w:r>
         <w:rPr>
@@ -9450,24 +9407,24 @@
           <w:i w:val="0"/>
           <w:sz w:val="22"/>
         </w:rPr>
-        <w:t xml:space="preserve"> → publish to </w:t>
+        <w:t xml:space="preserve"> and </w:t>
       </w:r>
       <w:r>
         <w:rPr>
           <w:rFonts w:ascii="Courier New" w:hAnsi="Courier New"/>
-          <w:b/>
-          <w:i w:val="0"/>
-          <w:sz w:val="22"/>
-        </w:rPr>
-        <w:t>add-tds-entry-bb-plus</w:t>
-      </w:r>
-      <w:r>
-        <w:rPr>
           <w:b w:val="0"/>
           <w:i w:val="0"/>
           <w:sz w:val="22"/>
         </w:rPr>
-        <w:t xml:space="preserve"> (new topic, consumed by Tax-Compliance)</w:t>
+        <w:t>amount</w:t>
+      </w:r>
+      <w:r>
+        <w:rPr>
+          <w:b w:val="0"/>
+          <w:i w:val="0"/>
+          <w:sz w:val="22"/>
+        </w:rPr>
+        <w:t>, trigger enrichment</w:t>
       </w:r>
     </w:p>
     <w:p>
@@ -9487,28 +9444,36 @@
       </w:r>
       <w:r>
         <w:rPr>
+          <w:b/>
+          <w:i w:val="0"/>
+          <w:sz w:val="22"/>
+        </w:rPr>
+        <w:t>Call Tax-Compliance:</w:t>
+      </w:r>
+      <w:r>
+        <w:rPr>
           <w:b w:val="0"/>
           <w:i w:val="0"/>
           <w:sz w:val="22"/>
         </w:rPr>
-        <w:t xml:space="preserve">Otherwise → publish to </w:t>
+        <w:t xml:space="preserve"> Sync HTTP call to </w:t>
       </w:r>
       <w:r>
         <w:rPr>
           <w:rFonts w:ascii="Courier New" w:hAnsi="Courier New"/>
-          <w:b/>
-          <w:i w:val="0"/>
-          <w:sz w:val="22"/>
-        </w:rPr>
-        <w:t>add-tds-entry</w:t>
-      </w:r>
-      <w:r>
-        <w:rPr>
           <w:b w:val="0"/>
           <w:i w:val="0"/>
           <w:sz w:val="22"/>
         </w:rPr>
-        <w:t xml:space="preserve"> (existing topic, consumed by Vendor-Payments — unchanged)</w:t>
+        <w:t>/internal/tds/enrich</w:t>
+      </w:r>
+      <w:r>
+        <w:rPr>
+          <w:b w:val="0"/>
+          <w:i w:val="0"/>
+          <w:sz w:val="22"/>
+        </w:rPr>
+        <w:t xml:space="preserve"> with contact_id, gross_amount, category_id, apply_ldc</w:t>
       </w:r>
     </w:p>
     <w:p>
@@ -9528,20 +9493,75 @@
       </w:r>
       <w:r>
         <w:rPr>
+          <w:b/>
+          <w:i w:val="0"/>
+          <w:sz w:val="22"/>
+        </w:rPr>
+        <w:t>Receive enriched data:</w:t>
+      </w:r>
+      <w:r>
+        <w:rPr>
           <w:b w:val="0"/>
           <w:i w:val="0"/>
           <w:sz w:val="22"/>
         </w:rPr>
-        <w:t xml:space="preserve">If </w:t>
-      </w:r>
-      <w:r>
-        <w:rPr>
-          <w:rFonts w:ascii="Courier New" w:hAnsi="Courier New"/>
+        <w:t xml:space="preserve"> Tax-Compliance returns {net_amount, tds_amount, rate, tds_payment_id}</w:t>
+      </w:r>
+    </w:p>
+    <w:p>
+      <w:pPr>
+        <w:shd w:val="clear" w:color="auto" w:fill="EFF6FF"/>
+        <w:pBdr>
+          <w:left w:val="single" w:sz="18" w:space="6" w:color="1A73E8"/>
+        </w:pBdr>
+        <w:spacing w:before="0" w:after="40"/>
+        <w:ind w:left="300" w:hanging="180"/>
+      </w:pPr>
+      <w:r>
+        <w:rPr>
+          <w:sz w:val="22"/>
+        </w:rPr>
+        <w:t xml:space="preserve">•  </w:t>
+      </w:r>
+      <w:r>
+        <w:rPr>
+          <w:b/>
+          <w:i w:val="0"/>
+          <w:sz w:val="22"/>
+        </w:rPr>
+        <w:t>Create payout:</w:t>
+      </w:r>
+      <w:r>
+        <w:rPr>
           <w:b w:val="0"/>
           <w:i w:val="0"/>
           <w:sz w:val="22"/>
         </w:rPr>
-        <w:t>tds.source</w:t>
+        <w:t xml:space="preserve"> Use enriched net_amount as the payout amount; store TDS metadata</w:t>
+      </w:r>
+    </w:p>
+    <w:p>
+      <w:pPr>
+        <w:shd w:val="clear" w:color="auto" w:fill="EFF6FF"/>
+        <w:pBdr>
+          <w:left w:val="single" w:sz="18" w:space="6" w:color="1A73E8"/>
+        </w:pBdr>
+        <w:spacing w:before="0" w:after="40"/>
+        <w:ind w:left="300" w:hanging="180"/>
+      </w:pPr>
+      <w:r>
+        <w:rPr>
+          <w:sz w:val="22"/>
+        </w:rPr>
+        <w:t xml:space="preserve">•  </w:t>
+      </w:r>
+      <w:r>
+        <w:rPr>
+          <w:b/>
+          <w:i w:val="0"/>
+          <w:sz w:val="22"/>
+        </w:rPr>
+        <w:t>Emit events:</w:t>
       </w:r>
       <w:r>
         <w:rPr>
@@ -9549,24 +9569,7 @@
           <w:i w:val="0"/>
           <w:sz w:val="22"/>
         </w:rPr>
-        <w:t xml:space="preserve"> is empty or not </w:t>
-      </w:r>
-      <w:r>
-        <w:rPr>
-          <w:rFonts w:ascii="Courier New" w:hAnsi="Courier New"/>
-          <w:b w:val="0"/>
-          <w:i w:val="0"/>
-          <w:sz w:val="22"/>
-        </w:rPr>
-        <w:t>"bb_plus"</w:t>
-      </w:r>
-      <w:r>
-        <w:rPr>
-          <w:b w:val="0"/>
-          <w:i w:val="0"/>
-          <w:sz w:val="22"/>
-        </w:rPr>
-        <w:t xml:space="preserve"> → existing behaviour, no change</w:t>
+        <w:t xml:space="preserve"> Standard payout status events (Tax-Compliance listens and updates tds_payments entity)</w:t>
       </w:r>
     </w:p>
     <w:p>
@@ -9659,7 +9662,7 @@
                 <w:i w:val="0"/>
                 <w:sz w:val="22"/>
               </w:rPr>
-              <w:t>TDSDetails struct</w:t>
+              <w:t>Payout API handler</w:t>
             </w:r>
           </w:p>
         </w:tc>
@@ -9675,7 +9678,57 @@
                 <w:i w:val="0"/>
                 <w:sz w:val="22"/>
               </w:rPr>
-              <w:t xml:space="preserve">Add optional fields: </w:t>
+              <w:t>Add enrichment hook: if TDS fields present, call Tax-Compliance /internal/tds/enrich before creating payout</w:t>
+            </w:r>
+          </w:p>
+        </w:tc>
+        <w:tc>
+          <w:tcPr>
+            <w:tcW w:type="dxa" w:w="3135"/>
+            <w:shd w:val="clear" w:color="auto" w:fill="FFFFFF"/>
+          </w:tcPr>
+          <w:p>
+            <w:r>
+              <w:rPr>
+                <w:b w:val="0"/>
+                <w:i w:val="0"/>
+                <w:sz w:val="22"/>
+              </w:rPr>
+              <w:t>~20 LOC hook; optional (only runs if TDS fields present)</w:t>
+            </w:r>
+          </w:p>
+        </w:tc>
+      </w:tr>
+      <w:tr>
+        <w:tc>
+          <w:tcPr>
+            <w:tcW w:type="dxa" w:w="3135"/>
+            <w:shd w:val="clear" w:color="auto" w:fill="F8FAFC"/>
+          </w:tcPr>
+          <w:p>
+            <w:r>
+              <w:rPr>
+                <w:b/>
+                <w:i w:val="0"/>
+                <w:sz w:val="22"/>
+              </w:rPr>
+              <w:t>TDSDetails struct</w:t>
+            </w:r>
+          </w:p>
+        </w:tc>
+        <w:tc>
+          <w:tcPr>
+            <w:tcW w:type="dxa" w:w="3135"/>
+            <w:shd w:val="clear" w:color="auto" w:fill="F8FAFC"/>
+          </w:tcPr>
+          <w:p>
+            <w:r>
+              <w:rPr>
+                <w:b w:val="0"/>
+                <w:i w:val="0"/>
+                <w:sz w:val="22"/>
+              </w:rPr>
+              <w:t xml:space="preserve">Add fields: </w:t>
             </w:r>
             <w:r>
               <w:rPr>
@@ -9684,7 +9737,7 @@
                 <w:i w:val="0"/>
                 <w:sz w:val="22"/>
               </w:rPr>
-              <w:t>source</w:t>
+              <w:t>tds_payment_id</w:t>
             </w:r>
             <w:r>
               <w:rPr>
@@ -9701,7 +9754,7 @@
                 <w:i w:val="0"/>
                 <w:sz w:val="22"/>
               </w:rPr>
-              <w:t>gross_amount</w:t>
+              <w:t>tds_amount</w:t>
             </w:r>
             <w:r>
               <w:rPr>
@@ -9718,7 +9771,7 @@
                 <w:i w:val="0"/>
                 <w:sz w:val="22"/>
               </w:rPr>
-              <w:t>breakdown</w:t>
+              <w:t>rate</w:t>
             </w:r>
             <w:r>
               <w:rPr>
@@ -9726,10 +9779,45 @@
                 <w:i w:val="0"/>
                 <w:sz w:val="22"/>
               </w:rPr>
-              <w:t xml:space="preserve"> (JSON)</w:t>
-            </w:r>
-          </w:p>
-        </w:tc>
+              <w:t xml:space="preserve"> (float), </w:t>
+            </w:r>
+            <w:r>
+              <w:rPr>
+                <w:rFonts w:ascii="Courier New" w:hAnsi="Courier New"/>
+                <w:b w:val="0"/>
+                <w:i w:val="0"/>
+                <w:sz w:val="22"/>
+              </w:rPr>
+              <w:t>category_id</w:t>
+            </w:r>
+            <w:r>
+              <w:rPr>
+                <w:b w:val="0"/>
+                <w:i w:val="0"/>
+                <w:sz w:val="22"/>
+              </w:rPr>
+              <w:t xml:space="preserve"> (string)</w:t>
+            </w:r>
+          </w:p>
+        </w:tc>
+        <w:tc>
+          <w:tcPr>
+            <w:tcW w:type="dxa" w:w="3135"/>
+            <w:shd w:val="clear" w:color="auto" w:fill="F8FAFC"/>
+          </w:tcPr>
+          <w:p>
+            <w:r>
+              <w:rPr>
+                <w:b w:val="0"/>
+                <w:i w:val="0"/>
+                <w:sz w:val="22"/>
+              </w:rPr>
+              <w:t>Additive — no existing code affected</w:t>
+            </w:r>
+          </w:p>
+        </w:tc>
+      </w:tr>
+      <w:tr>
         <w:tc>
           <w:tcPr>
             <w:tcW w:type="dxa" w:w="3135"/>
@@ -9738,11 +9826,77 @@
           <w:p>
             <w:r>
               <w:rPr>
+                <w:b/>
+                <w:i w:val="0"/>
+                <w:sz w:val="22"/>
+              </w:rPr>
+              <w:t>Payout creation</w:t>
+            </w:r>
+          </w:p>
+        </w:tc>
+        <w:tc>
+          <w:tcPr>
+            <w:tcW w:type="dxa" w:w="3135"/>
+            <w:shd w:val="clear" w:color="auto" w:fill="FFFFFF"/>
+          </w:tcPr>
+          <w:p>
+            <w:r>
+              <w:rPr>
                 <w:b w:val="0"/>
                 <w:i w:val="0"/>
                 <w:sz w:val="22"/>
               </w:rPr>
-              <w:t>Additive — no existing callers affected</w:t>
+              <w:t xml:space="preserve">Use enriched </w:t>
+            </w:r>
+            <w:r>
+              <w:rPr>
+                <w:rFonts w:ascii="Courier New" w:hAnsi="Courier New"/>
+                <w:b w:val="0"/>
+                <w:i w:val="0"/>
+                <w:sz w:val="22"/>
+              </w:rPr>
+              <w:t>net_amount</w:t>
+            </w:r>
+            <w:r>
+              <w:rPr>
+                <w:b w:val="0"/>
+                <w:i w:val="0"/>
+                <w:sz w:val="22"/>
+              </w:rPr>
+              <w:t xml:space="preserve"> from Tax-Compliance response; store </w:t>
+            </w:r>
+            <w:r>
+              <w:rPr>
+                <w:rFonts w:ascii="Courier New" w:hAnsi="Courier New"/>
+                <w:b w:val="0"/>
+                <w:i w:val="0"/>
+                <w:sz w:val="22"/>
+              </w:rPr>
+              <w:t>tds_payment_id</w:t>
+            </w:r>
+            <w:r>
+              <w:rPr>
+                <w:b w:val="0"/>
+                <w:i w:val="0"/>
+                <w:sz w:val="22"/>
+              </w:rPr>
+              <w:t xml:space="preserve"> in metadata</w:t>
+            </w:r>
+          </w:p>
+        </w:tc>
+        <w:tc>
+          <w:tcPr>
+            <w:tcW w:type="dxa" w:w="3135"/>
+            <w:shd w:val="clear" w:color="auto" w:fill="FFFFFF"/>
+          </w:tcPr>
+          <w:p>
+            <w:r>
+              <w:rPr>
+                <w:b w:val="0"/>
+                <w:i w:val="0"/>
+                <w:sz w:val="22"/>
+              </w:rPr>
+              <w:t>No amount mutation in Payouts — Tax-Compliance computes and returns net amount</w:t>
             </w:r>
           </w:p>
         </w:tc>
@@ -9760,7 +9914,7 @@
                 <w:i w:val="0"/>
                 <w:sz w:val="22"/>
               </w:rPr>
-              <w:t>Payout API handler</w:t>
+              <w:t>Event emission</w:t>
             </w:r>
           </w:p>
         </w:tc>
@@ -9776,24 +9930,7 @@
                 <w:i w:val="0"/>
                 <w:sz w:val="22"/>
               </w:rPr>
-              <w:t xml:space="preserve">Accept new optional TDS fields from request body; store in </w:t>
-            </w:r>
-            <w:r>
-              <w:rPr>
-                <w:rFonts w:ascii="Courier New" w:hAnsi="Courier New"/>
-                <w:b w:val="0"/>
-                <w:i w:val="0"/>
-                <w:sz w:val="22"/>
-              </w:rPr>
-              <w:t>payout_details</w:t>
-            </w:r>
-            <w:r>
-              <w:rPr>
-                <w:b w:val="0"/>
-                <w:i w:val="0"/>
-                <w:sz w:val="22"/>
-              </w:rPr>
-              <w:t xml:space="preserve"> JSON</w:t>
+              <w:t>Existing payout status events carry TDS metadata (tds_payment_id, tds_amount) for Tax-Compliance listener</w:t>
             </w:r>
           </w:p>
         </w:tc>
@@ -9809,191 +9946,197 @@
                 <w:i w:val="0"/>
                 <w:sz w:val="22"/>
               </w:rPr>
-              <w:t xml:space="preserve">No version change to </w:t>
-            </w:r>
-            <w:r>
-              <w:rPr>
-                <w:rFonts w:ascii="Courier New" w:hAnsi="Courier New"/>
-                <w:b w:val="0"/>
-                <w:i w:val="0"/>
-                <w:sz w:val="22"/>
-              </w:rPr>
-              <w:t>/v2/payouts</w:t>
-            </w:r>
-          </w:p>
-        </w:tc>
-      </w:tr>
-      <w:tr>
-        <w:tc>
-          <w:tcPr>
-            <w:tcW w:type="dxa" w:w="3135"/>
-            <w:shd w:val="clear" w:color="auto" w:fill="FFFFFF"/>
-          </w:tcPr>
-          <w:p>
-            <w:r>
-              <w:rPr>
-                <w:rFonts w:ascii="Courier New" w:hAnsi="Courier New"/>
-                <w:b/>
-                <w:i w:val="0"/>
-                <w:sz w:val="22"/>
-              </w:rPr>
-              <w:t>ProcessTdsForPayout()</w:t>
-            </w:r>
-          </w:p>
-        </w:tc>
-        <w:tc>
-          <w:tcPr>
-            <w:tcW w:type="dxa" w:w="3135"/>
-            <w:shd w:val="clear" w:color="auto" w:fill="FFFFFF"/>
-          </w:tcPr>
-          <w:p>
-            <w:r>
-              <w:rPr>
-                <w:b w:val="0"/>
-                <w:i w:val="0"/>
-                <w:sz w:val="22"/>
-              </w:rPr>
-              <w:t xml:space="preserve">Add </w:t>
-            </w:r>
-            <w:r>
-              <w:rPr>
-                <w:rFonts w:ascii="Courier New" w:hAnsi="Courier New"/>
-                <w:b w:val="0"/>
-                <w:i w:val="0"/>
-                <w:sz w:val="22"/>
-              </w:rPr>
-              <w:t>if tds.source == "bb_plus"</w:t>
-            </w:r>
-            <w:r>
-              <w:rPr>
-                <w:b w:val="0"/>
-                <w:i w:val="0"/>
-                <w:sz w:val="22"/>
-              </w:rPr>
-              <w:t xml:space="preserve"> branch → publish to new Kafka topic with enriched payload</w:t>
-            </w:r>
-          </w:p>
-        </w:tc>
-        <w:tc>
-          <w:tcPr>
-            <w:tcW w:type="dxa" w:w="3135"/>
-            <w:shd w:val="clear" w:color="auto" w:fill="FFFFFF"/>
-          </w:tcPr>
-          <w:p>
-            <w:r>
-              <w:rPr>
-                <w:b w:val="0"/>
-                <w:i w:val="0"/>
-                <w:sz w:val="22"/>
-              </w:rPr>
-              <w:t>Else-branch untouched; Vendor-Payments routing unchanged</w:t>
-            </w:r>
-          </w:p>
-        </w:tc>
-      </w:tr>
-      <w:tr>
-        <w:tc>
-          <w:tcPr>
-            <w:tcW w:type="dxa" w:w="3135"/>
-            <w:shd w:val="clear" w:color="auto" w:fill="F8FAFC"/>
-          </w:tcPr>
-          <w:p>
-            <w:r>
-              <w:rPr>
-                <w:b/>
-                <w:i w:val="0"/>
-                <w:sz w:val="22"/>
-              </w:rPr>
-              <w:t>Kafka message</w:t>
-            </w:r>
-          </w:p>
-        </w:tc>
-        <w:tc>
-          <w:tcPr>
-            <w:tcW w:type="dxa" w:w="3135"/>
-            <w:shd w:val="clear" w:color="auto" w:fill="F8FAFC"/>
-          </w:tcPr>
-          <w:p>
-            <w:r>
-              <w:rPr>
-                <w:b w:val="0"/>
-                <w:i w:val="0"/>
-                <w:sz w:val="22"/>
-              </w:rPr>
-              <w:t>BB+ enrichment fields (</w:t>
-            </w:r>
-            <w:r>
-              <w:rPr>
-                <w:rFonts w:ascii="Courier New" w:hAnsi="Courier New"/>
-                <w:b w:val="0"/>
-                <w:i w:val="0"/>
-                <w:sz w:val="22"/>
-              </w:rPr>
-              <w:t>bb_plus_tds_input</w:t>
-            </w:r>
-            <w:r>
-              <w:rPr>
-                <w:b w:val="0"/>
-                <w:i w:val="0"/>
-                <w:sz w:val="22"/>
-              </w:rPr>
-              <w:t xml:space="preserve">, </w:t>
-            </w:r>
-            <w:r>
-              <w:rPr>
-                <w:rFonts w:ascii="Courier New" w:hAnsi="Courier New"/>
-                <w:b w:val="0"/>
-                <w:i w:val="0"/>
-                <w:sz w:val="22"/>
-              </w:rPr>
-              <w:t>bb_plus_tds_computed</w:t>
-            </w:r>
-            <w:r>
-              <w:rPr>
-                <w:b w:val="0"/>
-                <w:i w:val="0"/>
-                <w:sz w:val="22"/>
-              </w:rPr>
-              <w:t xml:space="preserve">) added with </w:t>
-            </w:r>
-            <w:r>
-              <w:rPr>
-                <w:rFonts w:ascii="Courier New" w:hAnsi="Courier New"/>
-                <w:b w:val="0"/>
-                <w:i w:val="0"/>
-                <w:sz w:val="22"/>
-              </w:rPr>
-              <w:t>omitempty</w:t>
-            </w:r>
-            <w:r>
-              <w:rPr>
-                <w:b w:val="0"/>
-                <w:i w:val="0"/>
-                <w:sz w:val="22"/>
-              </w:rPr>
-              <w:t xml:space="preserve"> — nil for all non-BB+ payouts</w:t>
-            </w:r>
-          </w:p>
-        </w:tc>
-        <w:tc>
-          <w:tcPr>
-            <w:tcW w:type="dxa" w:w="3135"/>
-            <w:shd w:val="clear" w:color="auto" w:fill="F8FAFC"/>
-          </w:tcPr>
-          <w:p>
-            <w:r>
-              <w:rPr>
-                <w:b w:val="0"/>
-                <w:i w:val="0"/>
-                <w:sz w:val="22"/>
-              </w:rPr>
-              <w:t>Backward-compatible; existing consumers ignore new fields</w:t>
+              <w:t>No new events or topics; reuses existing event infrastructure</w:t>
             </w:r>
           </w:p>
         </w:tc>
       </w:tr>
     </w:tbl>
     <w:p/>
+    <w:p>
+      <w:pPr>
+        <w:shd w:val="clear" w:color="auto" w:fill="EFF6FF"/>
+        <w:pBdr>
+          <w:left w:val="single" w:sz="18" w:space="6" w:color="1A73E8"/>
+        </w:pBdr>
+        <w:spacing w:before="80" w:after="40"/>
+        <w:ind w:left="120"/>
+      </w:pPr>
+      <w:r>
+        <w:rPr>
+          <w:b/>
+          <w:i w:val="0"/>
+          <w:color w:val="0F172A"/>
+          <w:sz w:val="24"/>
+        </w:rPr>
+        <w:t>What Payouts DOES in Enrichment Hook</w:t>
+      </w:r>
+    </w:p>
+    <w:p>
+      <w:pPr>
+        <w:shd w:val="clear" w:color="auto" w:fill="EFF6FF"/>
+        <w:pBdr>
+          <w:left w:val="single" w:sz="18" w:space="6" w:color="1A73E8"/>
+        </w:pBdr>
+        <w:spacing w:before="0" w:after="40"/>
+        <w:ind w:left="300" w:hanging="180"/>
+      </w:pPr>
+      <w:r>
+        <w:rPr>
+          <w:sz w:val="22"/>
+        </w:rPr>
+        <w:t xml:space="preserve">•  </w:t>
+      </w:r>
+      <w:r>
+        <w:rPr>
+          <w:b w:val="0"/>
+          <w:i w:val="0"/>
+          <w:sz w:val="22"/>
+        </w:rPr>
+        <w:t xml:space="preserve">Payouts </w:t>
+      </w:r>
+      <w:r>
+        <w:rPr>
+          <w:b/>
+          <w:i w:val="0"/>
+          <w:sz w:val="22"/>
+        </w:rPr>
+        <w:t>calls Tax-Compliance /internal/tds/enrich</w:t>
+      </w:r>
+      <w:r>
+        <w:rPr>
+          <w:b w:val="0"/>
+          <w:i w:val="0"/>
+          <w:sz w:val="22"/>
+        </w:rPr>
+        <w:t xml:space="preserve"> synchronously (~50-100ms) if TDS fields present</w:t>
+      </w:r>
+    </w:p>
+    <w:p>
+      <w:pPr>
+        <w:shd w:val="clear" w:color="auto" w:fill="EFF6FF"/>
+        <w:pBdr>
+          <w:left w:val="single" w:sz="18" w:space="6" w:color="1A73E8"/>
+        </w:pBdr>
+        <w:spacing w:before="0" w:after="40"/>
+        <w:ind w:left="300" w:hanging="180"/>
+      </w:pPr>
+      <w:r>
+        <w:rPr>
+          <w:sz w:val="22"/>
+        </w:rPr>
+        <w:t xml:space="preserve">•  </w:t>
+      </w:r>
+      <w:r>
+        <w:rPr>
+          <w:b w:val="0"/>
+          <w:i w:val="0"/>
+          <w:sz w:val="22"/>
+        </w:rPr>
+        <w:t xml:space="preserve">Payouts </w:t>
+      </w:r>
+      <w:r>
+        <w:rPr>
+          <w:b/>
+          <w:i w:val="0"/>
+          <w:sz w:val="22"/>
+        </w:rPr>
+        <w:t>uses enriched net_amount</w:t>
+      </w:r>
+      <w:r>
+        <w:rPr>
+          <w:b w:val="0"/>
+          <w:i w:val="0"/>
+          <w:sz w:val="22"/>
+        </w:rPr>
+        <w:t xml:space="preserve"> from Tax-Compliance for payout creation</w:t>
+      </w:r>
+    </w:p>
+    <w:p>
+      <w:pPr>
+        <w:shd w:val="clear" w:color="auto" w:fill="EFF6FF"/>
+        <w:pBdr>
+          <w:left w:val="single" w:sz="18" w:space="6" w:color="1A73E8"/>
+        </w:pBdr>
+        <w:spacing w:before="0" w:after="40"/>
+        <w:ind w:left="300" w:hanging="180"/>
+      </w:pPr>
+      <w:r>
+        <w:rPr>
+          <w:sz w:val="22"/>
+        </w:rPr>
+        <w:t xml:space="preserve">•  </w:t>
+      </w:r>
+      <w:r>
+        <w:rPr>
+          <w:b w:val="0"/>
+          <w:i w:val="0"/>
+          <w:sz w:val="22"/>
+        </w:rPr>
+        <w:t xml:space="preserve">Payouts </w:t>
+      </w:r>
+      <w:r>
+        <w:rPr>
+          <w:b/>
+          <w:i w:val="0"/>
+          <w:sz w:val="22"/>
+        </w:rPr>
+        <w:t>stores TDS metadata</w:t>
+      </w:r>
+      <w:r>
+        <w:rPr>
+          <w:b w:val="0"/>
+          <w:i w:val="0"/>
+          <w:sz w:val="22"/>
+        </w:rPr>
+        <w:t xml:space="preserve"> (tds_payment_id, tds_amount, rate) in payout_details</w:t>
+      </w:r>
+    </w:p>
+    <w:p>
+      <w:pPr>
+        <w:shd w:val="clear" w:color="auto" w:fill="EFF6FF"/>
+        <w:pBdr>
+          <w:left w:val="single" w:sz="18" w:space="6" w:color="1A73E8"/>
+        </w:pBdr>
+        <w:spacing w:before="0" w:after="40"/>
+        <w:ind w:left="300" w:hanging="180"/>
+      </w:pPr>
+      <w:r>
+        <w:rPr>
+          <w:sz w:val="22"/>
+        </w:rPr>
+        <w:t xml:space="preserve">•  </w:t>
+      </w:r>
+      <w:r>
+        <w:rPr>
+          <w:b w:val="0"/>
+          <w:i w:val="0"/>
+          <w:sz w:val="22"/>
+        </w:rPr>
+        <w:t xml:space="preserve">Payouts </w:t>
+      </w:r>
+      <w:r>
+        <w:rPr>
+          <w:b/>
+          <w:i w:val="0"/>
+          <w:sz w:val="22"/>
+        </w:rPr>
+        <w:t>emits standard status events</w:t>
+      </w:r>
+      <w:r>
+        <w:rPr>
+          <w:b w:val="0"/>
+          <w:i w:val="0"/>
+          <w:sz w:val="22"/>
+        </w:rPr>
+        <w:t xml:space="preserve"> that Tax-Compliance consumes to update tds_payments entity</w:t>
+      </w:r>
+    </w:p>
+    <w:p>
+      <w:pPr>
+        <w:spacing w:before="0" w:after="80"/>
+      </w:pPr>
+    </w:p>
     <w:p>
       <w:pPr>
         <w:shd w:val="clear" w:color="auto" w:fill="FFFBEB"/>
@@ -10050,7 +10193,7 @@
           <w:i w:val="0"/>
           <w:sz w:val="22"/>
         </w:rPr>
-        <w:t xml:space="preserve"> call Tax-Compliance — no S2S call added</w:t>
+        <w:t xml:space="preserve"> compute TDS — Tax-Compliance handles all computation logic</w:t>
       </w:r>
     </w:p>
     <w:p>
@@ -10090,24 +10233,7 @@
           <w:i w:val="0"/>
           <w:sz w:val="22"/>
         </w:rPr>
-        <w:t xml:space="preserve"> validate the pre-computed </w:t>
-      </w:r>
-      <w:r>
-        <w:rPr>
-          <w:rFonts w:ascii="Courier New" w:hAnsi="Courier New"/>
-          <w:b w:val="0"/>
-          <w:i w:val="0"/>
-          <w:sz w:val="22"/>
-        </w:rPr>
-        <w:t>tds_amount</w:t>
-      </w:r>
-      <w:r>
-        <w:rPr>
-          <w:b w:val="0"/>
-          <w:i w:val="0"/>
-          <w:sz w:val="22"/>
-        </w:rPr>
-        <w:t xml:space="preserve"> — caller's responsibility</w:t>
+        <w:t xml:space="preserve"> validate TDS category rules — Tax-Compliance validates and returns errors if invalid</w:t>
       </w:r>
     </w:p>
     <w:p>
@@ -10147,7 +10273,7 @@
           <w:i w:val="0"/>
           <w:sz w:val="22"/>
         </w:rPr>
-        <w:t xml:space="preserve"> mutate the payout amount (caller sends NET amount directly)</w:t>
+        <w:t xml:space="preserve"> create tds_payments entity — Tax-Compliance creates it during enrichment call</w:t>
       </w:r>
     </w:p>
     <w:p>
@@ -10187,24 +10313,7 @@
           <w:i w:val="0"/>
           <w:sz w:val="22"/>
         </w:rPr>
-        <w:t xml:space="preserve"> create any </w:t>
-      </w:r>
-      <w:r>
-        <w:rPr>
-          <w:rFonts w:ascii="Courier New" w:hAnsi="Courier New"/>
-          <w:b w:val="0"/>
-          <w:i w:val="0"/>
-          <w:sz w:val="22"/>
-        </w:rPr>
-        <w:t>tds_payments</w:t>
-      </w:r>
-      <w:r>
-        <w:rPr>
-          <w:b w:val="0"/>
-          <w:i w:val="0"/>
-          <w:sz w:val="22"/>
-        </w:rPr>
-        <w:t xml:space="preserve"> entity — Tax-Compliance does that asynchronously</w:t>
+        <w:t xml:space="preserve"> have domain knowledge of TDS — zero domain leak; Payouts is a thin orchestrator</w:t>
       </w:r>
     </w:p>
     <w:p>

</xml_diff>

<commit_message>
Fix spacing and horizontal rules in DOCX converter
Improvements:
- Replace ugly underscore separators with subtle gray horizontal lines
- Increase heading spacing: H1/H2=10pt after, H3/H4=8pt after (was 4-6pt)
- Increase paragraph spacing: 8pt after (was 6pt)
- Better visual separation between sections
- More breathing room between headings and content

Fixes:
✅ Section separators now professional gray lines (not underscores)
✅ Headers properly spaced from content
✅ Better readability with improved vertical rhythm

Co-Authored-By: Claude Sonnet 4.5 <noreply@anthropic.com>
</commit_message>
<xml_diff>
--- a/TDS_Payout_Integration_Tech_Spec_Summary.docx
+++ b/TDS_Payout_Integration_Tech_Spec_Summary.docx
@@ -86,7 +86,7 @@
       <w:pPr>
         <w:pStyle w:val="Heading1"/>
         <w:keepNext/>
-        <w:spacing w:before="400" w:after="120"/>
+        <w:spacing w:before="400" w:after="200"/>
       </w:pPr>
       <w:r>
         <w:rPr>
@@ -101,7 +101,7 @@
     </w:p>
     <w:p>
       <w:pPr>
-        <w:spacing w:after="120" w:line="276" w:lineRule="auto"/>
+        <w:spacing w:after="160" w:line="276" w:lineRule="auto"/>
       </w:pPr>
       <w:r>
         <w:rPr>
@@ -417,7 +417,7 @@
       <w:pPr>
         <w:pStyle w:val="Heading3"/>
         <w:keepNext/>
-        <w:spacing w:before="320" w:after="80"/>
+        <w:spacing w:before="320" w:after="160"/>
       </w:pPr>
       <w:r>
         <w:rPr>
@@ -720,9 +720,12 @@
       </w:hyperlink>
     </w:p>
     <w:p>
-      <w:r>
-        <w:t>____________________________________________________________</w:t>
-      </w:r>
+      <w:pPr>
+        <w:spacing w:before="240" w:after="240"/>
+        <w:pBdr>
+          <w:bottom w:val="single" w:sz="6" w:space="1" w:color="CCCCCC"/>
+        </w:pBdr>
+      </w:pPr>
     </w:p>
     <w:p>
       <w:r>
@@ -740,7 +743,7 @@
       <w:pPr>
         <w:pStyle w:val="Heading2"/>
         <w:keepNext/>
-        <w:spacing w:before="360" w:after="120"/>
+        <w:spacing w:before="360" w:after="160"/>
       </w:pPr>
       <w:r>
         <w:rPr>
@@ -929,9 +932,12 @@
       </w:r>
     </w:p>
     <w:p>
-      <w:r>
-        <w:t>____________________________________________________________</w:t>
-      </w:r>
+      <w:pPr>
+        <w:spacing w:before="240" w:after="240"/>
+        <w:pBdr>
+          <w:bottom w:val="single" w:sz="6" w:space="1" w:color="CCCCCC"/>
+        </w:pBdr>
+      </w:pPr>
     </w:p>
     <w:p>
       <w:r>
@@ -949,7 +955,7 @@
       <w:pPr>
         <w:pStyle w:val="Heading2"/>
         <w:keepNext/>
-        <w:spacing w:before="360" w:after="120"/>
+        <w:spacing w:before="360" w:after="160"/>
       </w:pPr>
       <w:r>
         <w:rPr>
@@ -964,7 +970,7 @@
     </w:p>
     <w:p>
       <w:pPr>
-        <w:spacing w:after="120" w:line="276" w:lineRule="auto"/>
+        <w:spacing w:after="160" w:line="276" w:lineRule="auto"/>
       </w:pPr>
       <w:r>
         <w:rPr>
@@ -988,7 +994,7 @@
       <w:pPr>
         <w:pStyle w:val="Heading3"/>
         <w:keepNext/>
-        <w:spacing w:before="320" w:after="80"/>
+        <w:spacing w:before="320" w:after="160"/>
       </w:pPr>
       <w:r>
         <w:rPr>
@@ -1130,7 +1136,7 @@
       <w:pPr>
         <w:pStyle w:val="Heading3"/>
         <w:keepNext/>
-        <w:spacing w:before="320" w:after="80"/>
+        <w:spacing w:before="320" w:after="160"/>
       </w:pPr>
       <w:r>
         <w:rPr>
@@ -1181,7 +1187,7 @@
       <w:pPr>
         <w:pStyle w:val="Heading3"/>
         <w:keepNext/>
-        <w:spacing w:before="320" w:after="80"/>
+        <w:spacing w:before="320" w:after="160"/>
       </w:pPr>
       <w:r>
         <w:rPr>
@@ -1196,7 +1202,7 @@
     </w:p>
     <w:p>
       <w:pPr>
-        <w:spacing w:after="120" w:line="276" w:lineRule="auto"/>
+        <w:spacing w:after="160" w:line="276" w:lineRule="auto"/>
       </w:pPr>
       <w:r>
         <w:rPr>
@@ -1293,7 +1299,7 @@
       <w:pPr>
         <w:pStyle w:val="Heading3"/>
         <w:keepNext/>
-        <w:spacing w:before="320" w:after="80"/>
+        <w:spacing w:before="320" w:after="160"/>
       </w:pPr>
       <w:r>
         <w:rPr>
@@ -1409,9 +1415,12 @@
       </w:r>
     </w:p>
     <w:p>
-      <w:r>
-        <w:t>____________________________________________________________</w:t>
-      </w:r>
+      <w:pPr>
+        <w:spacing w:before="240" w:after="240"/>
+        <w:pBdr>
+          <w:bottom w:val="single" w:sz="6" w:space="1" w:color="CCCCCC"/>
+        </w:pBdr>
+      </w:pPr>
     </w:p>
     <w:p>
       <w:r>
@@ -1429,7 +1438,7 @@
       <w:pPr>
         <w:pStyle w:val="Heading2"/>
         <w:keepNext/>
-        <w:spacing w:before="360" w:after="120"/>
+        <w:spacing w:before="360" w:after="160"/>
       </w:pPr>
       <w:r>
         <w:rPr>
@@ -1518,9 +1527,12 @@
       </w:r>
     </w:p>
     <w:p>
-      <w:r>
-        <w:t>____________________________________________________________</w:t>
-      </w:r>
+      <w:pPr>
+        <w:spacing w:before="240" w:after="240"/>
+        <w:pBdr>
+          <w:bottom w:val="single" w:sz="6" w:space="1" w:color="CCCCCC"/>
+        </w:pBdr>
+      </w:pPr>
     </w:p>
     <w:p>
       <w:r>
@@ -1538,7 +1550,7 @@
       <w:pPr>
         <w:pStyle w:val="Heading2"/>
         <w:keepNext/>
-        <w:spacing w:before="360" w:after="120"/>
+        <w:spacing w:before="360" w:after="160"/>
       </w:pPr>
       <w:r>
         <w:rPr>
@@ -1627,9 +1639,12 @@
       </w:r>
     </w:p>
     <w:p>
-      <w:r>
-        <w:t>____________________________________________________________</w:t>
-      </w:r>
+      <w:pPr>
+        <w:spacing w:before="240" w:after="240"/>
+        <w:pBdr>
+          <w:bottom w:val="single" w:sz="6" w:space="1" w:color="CCCCCC"/>
+        </w:pBdr>
+      </w:pPr>
     </w:p>
     <w:p>
       <w:r>
@@ -1647,7 +1662,7 @@
       <w:pPr>
         <w:pStyle w:val="Heading2"/>
         <w:keepNext/>
-        <w:spacing w:before="360" w:after="120"/>
+        <w:spacing w:before="360" w:after="160"/>
       </w:pPr>
       <w:r>
         <w:rPr>
@@ -1664,7 +1679,7 @@
       <w:pPr>
         <w:pStyle w:val="Heading3"/>
         <w:keepNext/>
-        <w:spacing w:before="320" w:after="80"/>
+        <w:spacing w:before="320" w:after="160"/>
       </w:pPr>
       <w:r>
         <w:rPr>
@@ -1796,7 +1811,7 @@
       <w:pPr>
         <w:pStyle w:val="Heading3"/>
         <w:keepNext/>
-        <w:spacing w:before="320" w:after="80"/>
+        <w:spacing w:before="320" w:after="160"/>
       </w:pPr>
       <w:r>
         <w:rPr>
@@ -1908,7 +1923,7 @@
       <w:pPr>
         <w:pStyle w:val="Heading3"/>
         <w:keepNext/>
-        <w:spacing w:before="320" w:after="80"/>
+        <w:spacing w:before="320" w:after="160"/>
       </w:pPr>
       <w:r>
         <w:rPr>
@@ -2042,9 +2057,12 @@
       </w:r>
     </w:p>
     <w:p>
-      <w:r>
-        <w:t>____________________________________________________________</w:t>
-      </w:r>
+      <w:pPr>
+        <w:spacing w:before="240" w:after="240"/>
+        <w:pBdr>
+          <w:bottom w:val="single" w:sz="6" w:space="1" w:color="CCCCCC"/>
+        </w:pBdr>
+      </w:pPr>
     </w:p>
     <w:p>
       <w:r>
@@ -2062,7 +2080,7 @@
       <w:pPr>
         <w:pStyle w:val="Heading2"/>
         <w:keepNext/>
-        <w:spacing w:before="360" w:after="120"/>
+        <w:spacing w:before="360" w:after="160"/>
       </w:pPr>
       <w:r>
         <w:rPr>
@@ -2079,7 +2097,7 @@
       <w:pPr>
         <w:pStyle w:val="Heading3"/>
         <w:keepNext/>
-        <w:spacing w:before="320" w:after="80"/>
+        <w:spacing w:before="320" w:after="160"/>
       </w:pPr>
       <w:r>
         <w:rPr>
@@ -2320,7 +2338,7 @@
       <w:pPr>
         <w:pStyle w:val="Heading3"/>
         <w:keepNext/>
-        <w:spacing w:before="320" w:after="80"/>
+        <w:spacing w:before="320" w:after="160"/>
       </w:pPr>
       <w:r>
         <w:rPr>
@@ -2356,7 +2374,7 @@
       <w:pPr>
         <w:pStyle w:val="Heading3"/>
         <w:keepNext/>
-        <w:spacing w:before="320" w:after="80"/>
+        <w:spacing w:before="320" w:after="160"/>
       </w:pPr>
       <w:r>
         <w:rPr>
@@ -2607,7 +2625,7 @@
       <w:pPr>
         <w:pStyle w:val="Heading3"/>
         <w:keepNext/>
-        <w:spacing w:before="320" w:after="80"/>
+        <w:spacing w:before="320" w:after="160"/>
       </w:pPr>
       <w:r>
         <w:rPr>
@@ -2855,9 +2873,12 @@
       </w:tr>
     </w:tbl>
     <w:p>
-      <w:r>
-        <w:t>____________________________________________________________</w:t>
-      </w:r>
+      <w:pPr>
+        <w:spacing w:before="240" w:after="240"/>
+        <w:pBdr>
+          <w:bottom w:val="single" w:sz="6" w:space="1" w:color="CCCCCC"/>
+        </w:pBdr>
+      </w:pPr>
     </w:p>
     <w:p>
       <w:r>
@@ -2875,7 +2896,7 @@
       <w:pPr>
         <w:pStyle w:val="Heading2"/>
         <w:keepNext/>
-        <w:spacing w:before="360" w:after="120"/>
+        <w:spacing w:before="360" w:after="160"/>
       </w:pPr>
       <w:r>
         <w:rPr>
@@ -3453,9 +3474,12 @@
       </w:tr>
     </w:tbl>
     <w:p>
-      <w:r>
-        <w:t>____________________________________________________________</w:t>
-      </w:r>
+      <w:pPr>
+        <w:spacing w:before="240" w:after="240"/>
+        <w:pBdr>
+          <w:bottom w:val="single" w:sz="6" w:space="1" w:color="CCCCCC"/>
+        </w:pBdr>
+      </w:pPr>
     </w:p>
     <w:p>
       <w:r>
@@ -3473,7 +3497,7 @@
       <w:pPr>
         <w:pStyle w:val="Heading2"/>
         <w:keepNext/>
-        <w:spacing w:before="360" w:after="120"/>
+        <w:spacing w:before="360" w:after="160"/>
       </w:pPr>
       <w:r>
         <w:rPr>
@@ -3585,7 +3609,7 @@
       <w:pPr>
         <w:pStyle w:val="Heading2"/>
         <w:keepNext/>
-        <w:spacing w:before="360" w:after="120"/>
+        <w:spacing w:before="360" w:after="160"/>
       </w:pPr>
       <w:r>
         <w:rPr>
@@ -3600,7 +3624,7 @@
     </w:p>
     <w:p>
       <w:pPr>
-        <w:spacing w:after="120" w:line="276" w:lineRule="auto"/>
+        <w:spacing w:after="160" w:line="276" w:lineRule="auto"/>
       </w:pPr>
       <w:r>
         <w:rPr>
@@ -3918,15 +3942,18 @@
       </w:tr>
     </w:tbl>
     <w:p>
-      <w:r>
-        <w:t>____________________________________________________________</w:t>
-      </w:r>
+      <w:pPr>
+        <w:spacing w:before="240" w:after="240"/>
+        <w:pBdr>
+          <w:bottom w:val="single" w:sz="6" w:space="1" w:color="CCCCCC"/>
+        </w:pBdr>
+      </w:pPr>
     </w:p>
     <w:p>
       <w:pPr>
         <w:pStyle w:val="Heading3"/>
         <w:keepNext/>
-        <w:spacing w:before="320" w:after="80"/>
+        <w:spacing w:before="320" w:after="160"/>
       </w:pPr>
       <w:r>
         <w:rPr>
@@ -4042,7 +4069,7 @@
       <w:pPr>
         <w:pStyle w:val="Heading4"/>
         <w:keepNext/>
-        <w:spacing w:before="280" w:after="80"/>
+        <w:spacing w:before="280" w:after="120"/>
       </w:pPr>
       <w:r>
         <w:rPr>
@@ -4057,7 +4084,7 @@
     </w:p>
     <w:p>
       <w:pPr>
-        <w:spacing w:after="120" w:line="276" w:lineRule="auto"/>
+        <w:spacing w:after="160" w:line="276" w:lineRule="auto"/>
       </w:pPr>
       <w:r>
         <w:rPr>
@@ -4100,7 +4127,7 @@
       <w:pPr>
         <w:pStyle w:val="Heading4"/>
         <w:keepNext/>
-        <w:spacing w:before="280" w:after="80"/>
+        <w:spacing w:before="280" w:after="120"/>
       </w:pPr>
       <w:r>
         <w:rPr>
@@ -4156,7 +4183,7 @@
       <w:pPr>
         <w:pStyle w:val="Heading4"/>
         <w:keepNext/>
-        <w:spacing w:before="280" w:after="80"/>
+        <w:spacing w:before="280" w:after="120"/>
       </w:pPr>
       <w:r>
         <w:rPr>
@@ -4481,7 +4508,7 @@
       <w:pPr>
         <w:pStyle w:val="Heading4"/>
         <w:keepNext/>
-        <w:spacing w:before="280" w:after="80"/>
+        <w:spacing w:before="280" w:after="120"/>
       </w:pPr>
       <w:r>
         <w:rPr>
@@ -4878,7 +4905,7 @@
       <w:pPr>
         <w:pStyle w:val="Heading4"/>
         <w:keepNext/>
-        <w:spacing w:before="280" w:after="80"/>
+        <w:spacing w:before="280" w:after="120"/>
       </w:pPr>
       <w:r>
         <w:rPr>
@@ -4914,7 +4941,7 @@
       <w:pPr>
         <w:pStyle w:val="Heading4"/>
         <w:keepNext/>
-        <w:spacing w:before="280" w:after="80"/>
+        <w:spacing w:before="280" w:after="120"/>
       </w:pPr>
       <w:r>
         <w:rPr>
@@ -4970,7 +4997,7 @@
       <w:pPr>
         <w:pStyle w:val="Heading4"/>
         <w:keepNext/>
-        <w:spacing w:before="280" w:after="80"/>
+        <w:spacing w:before="280" w:after="120"/>
       </w:pPr>
       <w:r>
         <w:rPr>
@@ -5026,7 +5053,7 @@
       <w:pPr>
         <w:pStyle w:val="Heading4"/>
         <w:keepNext/>
-        <w:spacing w:before="280" w:after="80"/>
+        <w:spacing w:before="280" w:after="120"/>
       </w:pPr>
       <w:r>
         <w:rPr>
@@ -5082,7 +5109,7 @@
       <w:pPr>
         <w:pStyle w:val="Heading4"/>
         <w:keepNext/>
-        <w:spacing w:before="280" w:after="80"/>
+        <w:spacing w:before="280" w:after="120"/>
       </w:pPr>
       <w:r>
         <w:rPr>
@@ -5606,7 +5633,7 @@
       <w:pPr>
         <w:pStyle w:val="Heading4"/>
         <w:keepNext/>
-        <w:spacing w:before="280" w:after="80"/>
+        <w:spacing w:before="280" w:after="120"/>
       </w:pPr>
       <w:r>
         <w:rPr>
@@ -5948,15 +5975,18 @@
       </w:tr>
     </w:tbl>
     <w:p>
-      <w:r>
-        <w:t>____________________________________________________________</w:t>
-      </w:r>
+      <w:pPr>
+        <w:spacing w:before="240" w:after="240"/>
+        <w:pBdr>
+          <w:bottom w:val="single" w:sz="6" w:space="1" w:color="CCCCCC"/>
+        </w:pBdr>
+      </w:pPr>
     </w:p>
     <w:p>
       <w:pPr>
         <w:pStyle w:val="Heading3"/>
         <w:keepNext/>
-        <w:spacing w:before="320" w:after="80"/>
+        <w:spacing w:before="320" w:after="160"/>
       </w:pPr>
       <w:r>
         <w:rPr>
@@ -5997,7 +6027,7 @@
       <w:pPr>
         <w:pStyle w:val="Heading4"/>
         <w:keepNext/>
-        <w:spacing w:before="280" w:after="80"/>
+        <w:spacing w:before="280" w:after="120"/>
       </w:pPr>
       <w:r>
         <w:rPr>
@@ -6012,7 +6042,7 @@
     </w:p>
     <w:p>
       <w:pPr>
-        <w:spacing w:after="120" w:line="276" w:lineRule="auto"/>
+        <w:spacing w:after="160" w:line="276" w:lineRule="auto"/>
       </w:pPr>
       <w:r>
         <w:rPr>
@@ -6053,7 +6083,7 @@
       <w:pPr>
         <w:pStyle w:val="Heading4"/>
         <w:keepNext/>
-        <w:spacing w:before="280" w:after="80"/>
+        <w:spacing w:before="280" w:after="120"/>
       </w:pPr>
       <w:r>
         <w:rPr>
@@ -6109,7 +6139,7 @@
       <w:pPr>
         <w:pStyle w:val="Heading4"/>
         <w:keepNext/>
-        <w:spacing w:before="280" w:after="80"/>
+        <w:spacing w:before="280" w:after="120"/>
       </w:pPr>
       <w:r>
         <w:rPr>
@@ -6290,7 +6320,7 @@
       <w:pPr>
         <w:pStyle w:val="Heading4"/>
         <w:keepNext/>
-        <w:spacing w:before="280" w:after="80"/>
+        <w:spacing w:before="280" w:after="120"/>
       </w:pPr>
       <w:r>
         <w:rPr>
@@ -6585,15 +6615,18 @@
       </w:r>
     </w:p>
     <w:p>
-      <w:r>
-        <w:t>____________________________________________________________</w:t>
-      </w:r>
+      <w:pPr>
+        <w:spacing w:before="240" w:after="240"/>
+        <w:pBdr>
+          <w:bottom w:val="single" w:sz="6" w:space="1" w:color="CCCCCC"/>
+        </w:pBdr>
+      </w:pPr>
     </w:p>
     <w:p>
       <w:pPr>
         <w:pStyle w:val="Heading3"/>
         <w:keepNext/>
-        <w:spacing w:before="320" w:after="80"/>
+        <w:spacing w:before="320" w:after="160"/>
       </w:pPr>
       <w:r>
         <w:rPr>
@@ -6634,7 +6667,7 @@
       <w:pPr>
         <w:pStyle w:val="Heading4"/>
         <w:keepNext/>
-        <w:spacing w:before="280" w:after="80"/>
+        <w:spacing w:before="280" w:after="120"/>
       </w:pPr>
       <w:r>
         <w:rPr>
@@ -6649,7 +6682,7 @@
     </w:p>
     <w:p>
       <w:pPr>
-        <w:spacing w:after="120" w:line="276" w:lineRule="auto"/>
+        <w:spacing w:after="160" w:line="276" w:lineRule="auto"/>
       </w:pPr>
       <w:r>
         <w:rPr>
@@ -6690,7 +6723,7 @@
       <w:pPr>
         <w:pStyle w:val="Heading4"/>
         <w:keepNext/>
-        <w:spacing w:before="280" w:after="80"/>
+        <w:spacing w:before="280" w:after="120"/>
       </w:pPr>
       <w:r>
         <w:rPr>
@@ -6746,7 +6779,7 @@
       <w:pPr>
         <w:pStyle w:val="Heading4"/>
         <w:keepNext/>
-        <w:spacing w:before="280" w:after="80"/>
+        <w:spacing w:before="280" w:after="120"/>
       </w:pPr>
       <w:r>
         <w:rPr>
@@ -6927,7 +6960,7 @@
       <w:pPr>
         <w:pStyle w:val="Heading4"/>
         <w:keepNext/>
-        <w:spacing w:before="280" w:after="80"/>
+        <w:spacing w:before="280" w:after="120"/>
       </w:pPr>
       <w:r>
         <w:rPr>
@@ -7211,15 +7244,18 @@
       </w:r>
     </w:p>
     <w:p>
-      <w:r>
-        <w:t>____________________________________________________________</w:t>
-      </w:r>
+      <w:pPr>
+        <w:spacing w:before="240" w:after="240"/>
+        <w:pBdr>
+          <w:bottom w:val="single" w:sz="6" w:space="1" w:color="CCCCCC"/>
+        </w:pBdr>
+      </w:pPr>
     </w:p>
     <w:p>
       <w:pPr>
         <w:pStyle w:val="Heading3"/>
         <w:keepNext/>
-        <w:spacing w:before="320" w:after="80"/>
+        <w:spacing w:before="320" w:after="160"/>
       </w:pPr>
       <w:r>
         <w:rPr>
@@ -8388,15 +8424,18 @@
       </w:r>
     </w:p>
     <w:p>
-      <w:r>
-        <w:t>____________________________________________________________</w:t>
-      </w:r>
+      <w:pPr>
+        <w:spacing w:before="240" w:after="240"/>
+        <w:pBdr>
+          <w:bottom w:val="single" w:sz="6" w:space="1" w:color="CCCCCC"/>
+        </w:pBdr>
+      </w:pPr>
     </w:p>
     <w:p>
       <w:pPr>
         <w:pStyle w:val="Heading2"/>
         <w:keepNext/>
-        <w:spacing w:before="360" w:after="120"/>
+        <w:spacing w:before="360" w:after="160"/>
       </w:pPr>
       <w:r>
         <w:rPr>
@@ -8598,7 +8637,7 @@
       <w:pPr>
         <w:pStyle w:val="Heading2"/>
         <w:keepNext/>
-        <w:spacing w:before="360" w:after="120"/>
+        <w:spacing w:before="360" w:after="160"/>
       </w:pPr>
       <w:r>
         <w:rPr>
@@ -8615,7 +8654,7 @@
       <w:pPr>
         <w:pStyle w:val="Heading3"/>
         <w:keepNext/>
-        <w:spacing w:before="320" w:after="80"/>
+        <w:spacing w:before="320" w:after="160"/>
       </w:pPr>
       <w:r>
         <w:rPr>
@@ -9095,7 +9134,7 @@
       <w:pPr>
         <w:pStyle w:val="Heading3"/>
         <w:keepNext/>
-        <w:spacing w:before="320" w:after="80"/>
+        <w:spacing w:before="320" w:after="160"/>
       </w:pPr>
       <w:r>
         <w:rPr>
@@ -9366,7 +9405,7 @@
       <w:pPr>
         <w:pStyle w:val="Heading2"/>
         <w:keepNext/>
-        <w:spacing w:before="360" w:after="120"/>
+        <w:spacing w:before="360" w:after="160"/>
       </w:pPr>
       <w:r>
         <w:rPr>
@@ -9383,7 +9422,7 @@
       <w:pPr>
         <w:pStyle w:val="Heading3"/>
         <w:keepNext/>
-        <w:spacing w:before="320" w:after="80"/>
+        <w:spacing w:before="320" w:after="160"/>
       </w:pPr>
       <w:r>
         <w:rPr>
@@ -9398,7 +9437,7 @@
     </w:p>
     <w:p>
       <w:pPr>
-        <w:spacing w:after="120" w:line="276" w:lineRule="auto"/>
+        <w:spacing w:after="160" w:line="276" w:lineRule="auto"/>
       </w:pPr>
       <w:r>
         <w:rPr>
@@ -9899,7 +9938,7 @@
       <w:pPr>
         <w:pStyle w:val="Heading2"/>
         <w:keepNext/>
-        <w:spacing w:before="360" w:after="120"/>
+        <w:spacing w:before="360" w:after="160"/>
       </w:pPr>
       <w:r>
         <w:rPr>
@@ -9973,7 +10012,7 @@
       <w:pPr>
         <w:pStyle w:val="Heading3"/>
         <w:keepNext/>
-        <w:spacing w:before="320" w:after="80"/>
+        <w:spacing w:before="320" w:after="160"/>
       </w:pPr>
       <w:r>
         <w:rPr>
@@ -10154,7 +10193,7 @@
       <w:pPr>
         <w:pStyle w:val="Heading2"/>
         <w:keepNext/>
-        <w:spacing w:before="360" w:after="120"/>
+        <w:spacing w:before="360" w:after="160"/>
       </w:pPr>
       <w:r>
         <w:rPr>
@@ -10321,7 +10360,7 @@
       <w:pPr>
         <w:pStyle w:val="Heading3"/>
         <w:keepNext/>
-        <w:spacing w:before="320" w:after="80"/>
+        <w:spacing w:before="320" w:after="160"/>
       </w:pPr>
       <w:r>
         <w:rPr>
@@ -10510,14 +10549,20 @@
       </w:r>
     </w:p>
     <w:p>
-      <w:r>
-        <w:t>____________________________________________________________</w:t>
-      </w:r>
+      <w:pPr>
+        <w:spacing w:before="240" w:after="240"/>
+        <w:pBdr>
+          <w:bottom w:val="single" w:sz="6" w:space="1" w:color="CCCCCC"/>
+        </w:pBdr>
+      </w:pPr>
     </w:p>
     <w:p>
-      <w:r>
-        <w:t>____________________________________________________________</w:t>
-      </w:r>
+      <w:pPr>
+        <w:spacing w:before="240" w:after="240"/>
+        <w:pBdr>
+          <w:bottom w:val="single" w:sz="6" w:space="1" w:color="CCCCCC"/>
+        </w:pBdr>
+      </w:pPr>
     </w:p>
     <w:p>
       <w:r>
@@ -10535,7 +10580,7 @@
       <w:pPr>
         <w:pStyle w:val="Heading2"/>
         <w:keepNext/>
-        <w:spacing w:before="360" w:after="120"/>
+        <w:spacing w:before="360" w:after="160"/>
       </w:pPr>
       <w:r>
         <w:rPr>
@@ -10552,7 +10597,7 @@
       <w:pPr>
         <w:pStyle w:val="Heading3"/>
         <w:keepNext/>
-        <w:spacing w:before="320" w:after="80"/>
+        <w:spacing w:before="320" w:after="160"/>
       </w:pPr>
       <w:r>
         <w:rPr>
@@ -10614,7 +10659,7 @@
       <w:pPr>
         <w:pStyle w:val="Heading3"/>
         <w:keepNext/>
-        <w:spacing w:before="320" w:after="80"/>
+        <w:spacing w:before="320" w:after="160"/>
       </w:pPr>
       <w:r>
         <w:rPr>
@@ -10706,7 +10751,7 @@
       <w:pPr>
         <w:pStyle w:val="Heading3"/>
         <w:keepNext/>
-        <w:spacing w:before="320" w:after="80"/>
+        <w:spacing w:before="320" w:after="160"/>
       </w:pPr>
       <w:r>
         <w:rPr>
@@ -10937,7 +10982,7 @@
       <w:pPr>
         <w:pStyle w:val="Heading3"/>
         <w:keepNext/>
-        <w:spacing w:before="320" w:after="80"/>
+        <w:spacing w:before="320" w:after="160"/>
       </w:pPr>
       <w:r>
         <w:rPr>
@@ -11014,7 +11059,7 @@
       <w:pPr>
         <w:pStyle w:val="Heading3"/>
         <w:keepNext/>
-        <w:spacing w:before="320" w:after="80"/>
+        <w:spacing w:before="320" w:after="160"/>
       </w:pPr>
       <w:r>
         <w:rPr>
@@ -11096,7 +11141,7 @@
       <w:pPr>
         <w:pStyle w:val="Heading3"/>
         <w:keepNext/>
-        <w:spacing w:before="320" w:after="80"/>
+        <w:spacing w:before="320" w:after="160"/>
       </w:pPr>
       <w:r>
         <w:rPr>
@@ -11175,9 +11220,12 @@
       </w:r>
     </w:p>
     <w:p>
-      <w:r>
-        <w:t>____________________________________________________________</w:t>
-      </w:r>
+      <w:pPr>
+        <w:spacing w:before="240" w:after="240"/>
+        <w:pBdr>
+          <w:bottom w:val="single" w:sz="6" w:space="1" w:color="CCCCCC"/>
+        </w:pBdr>
+      </w:pPr>
     </w:p>
     <w:p>
       <w:r>
@@ -11195,7 +11243,7 @@
       <w:pPr>
         <w:pStyle w:val="Heading2"/>
         <w:keepNext/>
-        <w:spacing w:before="360" w:after="120"/>
+        <w:spacing w:before="360" w:after="160"/>
       </w:pPr>
       <w:r>
         <w:rPr>
@@ -11222,7 +11270,7 @@
       <w:pPr>
         <w:pStyle w:val="Heading3"/>
         <w:keepNext/>
-        <w:spacing w:before="320" w:after="80"/>
+        <w:spacing w:before="320" w:after="160"/>
       </w:pPr>
       <w:r>
         <w:rPr>
@@ -11237,7 +11285,7 @@
     </w:p>
     <w:p>
       <w:pPr>
-        <w:spacing w:after="120" w:line="276" w:lineRule="auto"/>
+        <w:spacing w:after="160" w:line="276" w:lineRule="auto"/>
       </w:pPr>
       <w:r>
         <w:rPr>
@@ -11274,7 +11322,7 @@
       <w:pPr>
         <w:pStyle w:val="Heading3"/>
         <w:keepNext/>
-        <w:spacing w:before="320" w:after="80"/>
+        <w:spacing w:before="320" w:after="160"/>
       </w:pPr>
       <w:r>
         <w:rPr>
@@ -11472,7 +11520,7 @@
       <w:pPr>
         <w:pStyle w:val="Heading3"/>
         <w:keepNext/>
-        <w:spacing w:before="320" w:after="80"/>
+        <w:spacing w:before="320" w:after="160"/>
       </w:pPr>
       <w:r>
         <w:rPr>
@@ -11487,7 +11535,7 @@
     </w:p>
     <w:p>
       <w:pPr>
-        <w:spacing w:after="120" w:line="276" w:lineRule="auto"/>
+        <w:spacing w:after="160" w:line="276" w:lineRule="auto"/>
       </w:pPr>
       <w:r>
         <w:rPr>
@@ -11526,7 +11574,7 @@
       <w:pPr>
         <w:pStyle w:val="Heading3"/>
         <w:keepNext/>
-        <w:spacing w:before="320" w:after="80"/>
+        <w:spacing w:before="320" w:after="160"/>
       </w:pPr>
       <w:r>
         <w:rPr>
@@ -11653,7 +11701,7 @@
       <w:pPr>
         <w:pStyle w:val="Heading3"/>
         <w:keepNext/>
-        <w:spacing w:before="320" w:after="80"/>
+        <w:spacing w:before="320" w:after="160"/>
       </w:pPr>
       <w:r>
         <w:rPr>
@@ -11957,7 +12005,7 @@
       <w:pPr>
         <w:pStyle w:val="Heading3"/>
         <w:keepNext/>
-        <w:spacing w:before="320" w:after="80"/>
+        <w:spacing w:before="320" w:after="160"/>
       </w:pPr>
       <w:r>
         <w:rPr>
@@ -12054,7 +12102,7 @@
       <w:pPr>
         <w:pStyle w:val="Heading3"/>
         <w:keepNext/>
-        <w:spacing w:before="320" w:after="80"/>
+        <w:spacing w:before="320" w:after="160"/>
       </w:pPr>
       <w:r>
         <w:rPr>
@@ -12069,7 +12117,7 @@
     </w:p>
     <w:p>
       <w:pPr>
-        <w:spacing w:after="120" w:line="276" w:lineRule="auto"/>
+        <w:spacing w:after="160" w:line="276" w:lineRule="auto"/>
       </w:pPr>
       <w:r>
         <w:rPr>
@@ -12103,9 +12151,12 @@
       </w:r>
     </w:p>
     <w:p>
-      <w:r>
-        <w:t>____________________________________________________________</w:t>
-      </w:r>
+      <w:pPr>
+        <w:spacing w:before="240" w:after="240"/>
+        <w:pBdr>
+          <w:bottom w:val="single" w:sz="6" w:space="1" w:color="CCCCCC"/>
+        </w:pBdr>
+      </w:pPr>
     </w:p>
     <w:p>
       <w:r>
@@ -12123,7 +12174,7 @@
       <w:pPr>
         <w:pStyle w:val="Heading2"/>
         <w:keepNext/>
-        <w:spacing w:before="360" w:after="120"/>
+        <w:spacing w:before="360" w:after="160"/>
       </w:pPr>
       <w:r>
         <w:rPr>
@@ -12140,7 +12191,7 @@
       <w:pPr>
         <w:pStyle w:val="Heading3"/>
         <w:keepNext/>
-        <w:spacing w:before="320" w:after="80"/>
+        <w:spacing w:before="320" w:after="160"/>
       </w:pPr>
       <w:r>
         <w:rPr>
@@ -12444,7 +12495,7 @@
       <w:pPr>
         <w:pStyle w:val="Heading3"/>
         <w:keepNext/>
-        <w:spacing w:before="320" w:after="80"/>
+        <w:spacing w:before="320" w:after="160"/>
       </w:pPr>
       <w:r>
         <w:rPr>
@@ -12832,9 +12883,12 @@
       </w:tr>
     </w:tbl>
     <w:p>
-      <w:r>
-        <w:t>____________________________________________________________</w:t>
-      </w:r>
+      <w:pPr>
+        <w:spacing w:before="240" w:after="240"/>
+        <w:pBdr>
+          <w:bottom w:val="single" w:sz="6" w:space="1" w:color="CCCCCC"/>
+        </w:pBdr>
+      </w:pPr>
     </w:p>
     <w:p>
       <w:r>
@@ -12852,7 +12906,7 @@
       <w:pPr>
         <w:pStyle w:val="Heading2"/>
         <w:keepNext/>
-        <w:spacing w:before="360" w:after="120"/>
+        <w:spacing w:before="360" w:after="160"/>
       </w:pPr>
       <w:r>
         <w:rPr>
@@ -12869,7 +12923,7 @@
       <w:pPr>
         <w:pStyle w:val="Heading3"/>
         <w:keepNext/>
-        <w:spacing w:before="320" w:after="80"/>
+        <w:spacing w:before="320" w:after="160"/>
       </w:pPr>
       <w:r>
         <w:rPr>
@@ -13041,7 +13095,7 @@
       <w:pPr>
         <w:pStyle w:val="Heading3"/>
         <w:keepNext/>
-        <w:spacing w:before="320" w:after="80"/>
+        <w:spacing w:before="320" w:after="160"/>
       </w:pPr>
       <w:r>
         <w:rPr>
@@ -13056,7 +13110,7 @@
     </w:p>
     <w:p>
       <w:pPr>
-        <w:spacing w:after="120" w:line="276" w:lineRule="auto"/>
+        <w:spacing w:after="160" w:line="276" w:lineRule="auto"/>
       </w:pPr>
       <w:r>
         <w:rPr>
@@ -13093,7 +13147,7 @@
       <w:pPr>
         <w:pStyle w:val="Heading3"/>
         <w:keepNext/>
-        <w:spacing w:before="320" w:after="80"/>
+        <w:spacing w:before="320" w:after="160"/>
       </w:pPr>
       <w:r>
         <w:rPr>
@@ -13152,9 +13206,12 @@
       </w:r>
     </w:p>
     <w:p>
-      <w:r>
-        <w:t>____________________________________________________________</w:t>
-      </w:r>
+      <w:pPr>
+        <w:spacing w:before="240" w:after="240"/>
+        <w:pBdr>
+          <w:bottom w:val="single" w:sz="6" w:space="1" w:color="CCCCCC"/>
+        </w:pBdr>
+      </w:pPr>
     </w:p>
     <w:p>
       <w:r>
@@ -13172,7 +13229,7 @@
       <w:pPr>
         <w:pStyle w:val="Heading2"/>
         <w:keepNext/>
-        <w:spacing w:before="360" w:after="120"/>
+        <w:spacing w:before="360" w:after="160"/>
       </w:pPr>
       <w:r>
         <w:rPr>
@@ -13189,7 +13246,7 @@
       <w:pPr>
         <w:pStyle w:val="Heading3"/>
         <w:keepNext/>
-        <w:spacing w:before="320" w:after="80"/>
+        <w:spacing w:before="320" w:after="160"/>
       </w:pPr>
       <w:r>
         <w:rPr>
@@ -13768,7 +13825,7 @@
       <w:pPr>
         <w:pStyle w:val="Heading3"/>
         <w:keepNext/>
-        <w:spacing w:before="320" w:after="80"/>
+        <w:spacing w:before="320" w:after="160"/>
       </w:pPr>
       <w:r>
         <w:rPr>
@@ -13783,7 +13840,7 @@
     </w:p>
     <w:p>
       <w:pPr>
-        <w:spacing w:after="120" w:line="276" w:lineRule="auto"/>
+        <w:spacing w:after="160" w:line="276" w:lineRule="auto"/>
       </w:pPr>
       <w:r>
         <w:rPr>
@@ -13820,7 +13877,7 @@
       <w:pPr>
         <w:pStyle w:val="Heading3"/>
         <w:keepNext/>
-        <w:spacing w:before="320" w:after="80"/>
+        <w:spacing w:before="320" w:after="160"/>
       </w:pPr>
       <w:r>
         <w:rPr>
@@ -13899,9 +13956,12 @@
       </w:r>
     </w:p>
     <w:p>
-      <w:r>
-        <w:t>____________________________________________________________</w:t>
-      </w:r>
+      <w:pPr>
+        <w:spacing w:before="240" w:after="240"/>
+        <w:pBdr>
+          <w:bottom w:val="single" w:sz="6" w:space="1" w:color="CCCCCC"/>
+        </w:pBdr>
+      </w:pPr>
     </w:p>
     <w:p>
       <w:r>
@@ -13919,7 +13979,7 @@
       <w:pPr>
         <w:pStyle w:val="Heading2"/>
         <w:keepNext/>
-        <w:spacing w:before="360" w:after="120"/>
+        <w:spacing w:before="360" w:after="160"/>
       </w:pPr>
       <w:r>
         <w:rPr>
@@ -13936,7 +13996,7 @@
       <w:pPr>
         <w:pStyle w:val="Heading3"/>
         <w:keepNext/>
-        <w:spacing w:before="320" w:after="80"/>
+        <w:spacing w:before="320" w:after="160"/>
       </w:pPr>
       <w:r>
         <w:rPr>
@@ -14075,9 +14135,12 @@
       </w:r>
     </w:p>
     <w:p>
-      <w:r>
-        <w:t>____________________________________________________________</w:t>
-      </w:r>
+      <w:pPr>
+        <w:spacing w:before="240" w:after="240"/>
+        <w:pBdr>
+          <w:bottom w:val="single" w:sz="6" w:space="1" w:color="CCCCCC"/>
+        </w:pBdr>
+      </w:pPr>
     </w:p>
     <w:p>
       <w:r>
@@ -14095,7 +14158,7 @@
       <w:pPr>
         <w:pStyle w:val="Heading2"/>
         <w:keepNext/>
-        <w:spacing w:before="360" w:after="120"/>
+        <w:spacing w:before="360" w:after="160"/>
       </w:pPr>
       <w:r>
         <w:rPr>
@@ -14449,9 +14512,12 @@
       </w:tr>
     </w:tbl>
     <w:p>
-      <w:r>
-        <w:t>____________________________________________________________</w:t>
-      </w:r>
+      <w:pPr>
+        <w:spacing w:before="240" w:after="240"/>
+        <w:pBdr>
+          <w:bottom w:val="single" w:sz="6" w:space="1" w:color="CCCCCC"/>
+        </w:pBdr>
+      </w:pPr>
     </w:p>
     <w:p>
       <w:r>
@@ -14469,7 +14535,7 @@
       <w:pPr>
         <w:pStyle w:val="Heading2"/>
         <w:keepNext/>
-        <w:spacing w:before="360" w:after="120"/>
+        <w:spacing w:before="360" w:after="160"/>
       </w:pPr>
       <w:r>
         <w:rPr>
@@ -14919,9 +14985,12 @@
       </w:tr>
     </w:tbl>
     <w:p>
-      <w:r>
-        <w:t>____________________________________________________________</w:t>
-      </w:r>
+      <w:pPr>
+        <w:spacing w:before="240" w:after="240"/>
+        <w:pBdr>
+          <w:bottom w:val="single" w:sz="6" w:space="1" w:color="CCCCCC"/>
+        </w:pBdr>
+      </w:pPr>
     </w:p>
     <w:p>
       <w:r>
@@ -14939,7 +15008,7 @@
       <w:pPr>
         <w:pStyle w:val="Heading2"/>
         <w:keepNext/>
-        <w:spacing w:before="360" w:after="120"/>
+        <w:spacing w:before="360" w:after="160"/>
       </w:pPr>
       <w:r>
         <w:rPr>
@@ -15459,7 +15528,7 @@
     <w:qFormat/>
     <w:rsid w:val="00FC693F"/>
     <w:pPr>
-      <w:spacing w:after="120" w:line="276" w:lineRule="auto"/>
+      <w:spacing w:after="160" w:line="276" w:lineRule="auto"/>
     </w:pPr>
     <w:rPr>
       <w:rFonts w:ascii="Arial" w:hAnsi="Arial"/>
@@ -15522,7 +15591,7 @@
     <w:pPr>
       <w:keepNext/>
       <w:keepLines/>
-      <w:spacing w:before="340" w:after="120" w:line="276" w:lineRule="auto"/>
+      <w:spacing w:before="340" w:after="200" w:line="276" w:lineRule="auto"/>
       <w:outlineLvl w:val="0"/>
     </w:pPr>
     <w:rPr>
@@ -15546,7 +15615,7 @@
     <w:pPr>
       <w:keepNext/>
       <w:keepLines/>
-      <w:spacing w:before="360" w:after="120" w:line="276" w:lineRule="auto"/>
+      <w:spacing w:before="360" w:after="200" w:line="276" w:lineRule="auto"/>
       <w:outlineLvl w:val="1"/>
     </w:pPr>
     <w:rPr>
@@ -15570,7 +15639,7 @@
     <w:pPr>
       <w:keepNext/>
       <w:keepLines/>
-      <w:spacing w:before="380" w:after="120" w:line="276" w:lineRule="auto"/>
+      <w:spacing w:before="380" w:after="160" w:line="276" w:lineRule="auto"/>
       <w:outlineLvl w:val="2"/>
     </w:pPr>
     <w:rPr>
@@ -15594,7 +15663,7 @@
     <w:pPr>
       <w:keepNext/>
       <w:keepLines/>
-      <w:spacing w:before="400" w:after="120" w:line="276" w:lineRule="auto"/>
+      <w:spacing w:before="400" w:after="160" w:line="276" w:lineRule="auto"/>
       <w:outlineLvl w:val="3"/>
     </w:pPr>
     <w:rPr>

</xml_diff>

<commit_message>
Fix all indentation and formatting issues in DOCX converter
- Filter out HTML comments (removed separator lines ═══════)
- Add explicit left alignment and zero indentation for all paragraphs
- Fix callout box indentation (recommendation, warning, info boxes)
- Add proper list formatting inside callout boxes with hanging indent
- Remove left indent from add_paragraph_border() function
- Regenerated DOCX with all fixes applied (348KB)

All sections now have consistent flush-left formatting matching Razorpay benchmark.

Co-Authored-By: Claude Sonnet 4.5 <noreply@anthropic.com>
</commit_message>
<xml_diff>
--- a/TDS_Payout_Integration_Tech_Spec_Summary.docx
+++ b/TDS_Payout_Integration_Tech_Spec_Summary.docx
@@ -102,6 +102,8 @@
     <w:p>
       <w:pPr>
         <w:spacing w:after="160" w:line="276" w:lineRule="auto"/>
+        <w:ind w:left="0" w:firstLine="0"/>
+        <w:jc w:val="left"/>
       </w:pPr>
       <w:r>
         <w:rPr>
@@ -722,22 +724,7 @@
     <w:p>
       <w:pPr>
         <w:spacing w:before="240" w:after="240"/>
-        <w:pBdr>
-          <w:bottom w:val="single" w:sz="6" w:space="1" w:color="CCCCCC"/>
-        </w:pBdr>
-      </w:pPr>
-    </w:p>
-    <w:p>
-      <w:r>
-        <w:rPr>
-          <w:rFonts w:ascii="Arial" w:hAnsi="Arial"/>
-          <w:b w:val="0"/>
-          <w:i w:val="0"/>
-          <w:color w:val="000000"/>
-          <w:sz w:val="22"/>
-        </w:rPr>
-        <w:t>═══════════════════════════════════════════════════════════════════════</w:t>
-      </w:r>
+      </w:pPr>
     </w:p>
     <w:p>
       <w:pPr>
@@ -934,22 +921,7 @@
     <w:p>
       <w:pPr>
         <w:spacing w:before="240" w:after="240"/>
-        <w:pBdr>
-          <w:bottom w:val="single" w:sz="6" w:space="1" w:color="CCCCCC"/>
-        </w:pBdr>
-      </w:pPr>
-    </w:p>
-    <w:p>
-      <w:r>
-        <w:rPr>
-          <w:rFonts w:ascii="Arial" w:hAnsi="Arial"/>
-          <w:b w:val="0"/>
-          <w:i w:val="0"/>
-          <w:color w:val="000000"/>
-          <w:sz w:val="22"/>
-        </w:rPr>
-        <w:t>═══════════════════════════════════════════════════════════════════════</w:t>
-      </w:r>
+      </w:pPr>
     </w:p>
     <w:p>
       <w:pPr>
@@ -971,6 +943,8 @@
     <w:p>
       <w:pPr>
         <w:spacing w:after="160" w:line="276" w:lineRule="auto"/>
+        <w:ind w:left="0" w:firstLine="0"/>
+        <w:jc w:val="left"/>
       </w:pPr>
       <w:r>
         <w:rPr>
@@ -1203,6 +1177,8 @@
     <w:p>
       <w:pPr>
         <w:spacing w:after="160" w:line="276" w:lineRule="auto"/>
+        <w:ind w:left="0" w:firstLine="0"/>
+        <w:jc w:val="left"/>
       </w:pPr>
       <w:r>
         <w:rPr>
@@ -1314,11 +1290,13 @@
     </w:p>
     <w:p>
       <w:pPr>
+        <w:ind w:left="0" w:firstLine="0"/>
+        <w:jc w:val="left"/>
         <w:shd w:val="clear" w:color="auto" w:fill="F0FDF4"/>
         <w:pBdr>
           <w:left w:val="single" w:sz="18" w:space="6" w:color="1155cc"/>
         </w:pBdr>
-        <w:ind w:left="120"/>
+        <w:ind w:left="0"/>
       </w:pPr>
       <w:r>
         <w:rPr>
@@ -1333,11 +1311,13 @@
     </w:p>
     <w:p>
       <w:pPr>
+        <w:ind w:left="0" w:firstLine="0"/>
+        <w:jc w:val="left"/>
         <w:shd w:val="clear" w:color="auto" w:fill="F0FDF4"/>
         <w:pBdr>
           <w:left w:val="single" w:sz="18" w:space="6" w:color="1155cc"/>
         </w:pBdr>
-        <w:ind w:left="120"/>
+        <w:ind w:left="0"/>
       </w:pPr>
       <w:r>
         <w:rPr>
@@ -1375,11 +1355,13 @@
     </w:p>
     <w:p>
       <w:pPr>
+        <w:ind w:left="0" w:firstLine="0"/>
+        <w:jc w:val="left"/>
         <w:shd w:val="clear" w:color="auto" w:fill="F0FDF4"/>
         <w:pBdr>
           <w:left w:val="single" w:sz="18" w:space="6" w:color="1155cc"/>
         </w:pBdr>
-        <w:ind w:left="120"/>
+        <w:ind w:left="0"/>
       </w:pPr>
       <w:r>
         <w:rPr>
@@ -1394,11 +1376,195 @@
     </w:p>
     <w:p>
       <w:pPr>
+        <w:pStyle w:val="ListBullet"/>
+        <w:ind w:left="720" w:hanging="360"/>
+        <w:jc w:val="left"/>
         <w:shd w:val="clear" w:color="auto" w:fill="F0FDF4"/>
         <w:pBdr>
           <w:left w:val="single" w:sz="18" w:space="6" w:color="1155cc"/>
         </w:pBdr>
-        <w:ind w:left="120"/>
+        <w:ind w:left="0"/>
+      </w:pPr>
+      <w:r>
+        <w:rPr>
+          <w:rFonts w:ascii="Arial" w:hAnsi="Arial"/>
+          <w:b/>
+          <w:i w:val="0"/>
+          <w:color w:val="000000"/>
+          <w:sz w:val="22"/>
+        </w:rPr>
+        <w:t>Minimal Input:</w:t>
+      </w:r>
+      <w:r>
+        <w:rPr>
+          <w:rFonts w:ascii="Arial" w:hAnsi="Arial"/>
+          <w:b w:val="0"/>
+          <w:i w:val="0"/>
+          <w:color w:val="000000"/>
+          <w:sz w:val="22"/>
+        </w:rPr>
+        <w:t xml:space="preserve"> Merchants should provide basic payout details (gross amount, TDS category, contact, etc.) without needing to pre-calculate TDS values themselves</w:t>
+      </w:r>
+    </w:p>
+    <w:p>
+      <w:pPr>
+        <w:pStyle w:val="ListBullet"/>
+        <w:ind w:left="720" w:hanging="360"/>
+        <w:jc w:val="left"/>
+        <w:shd w:val="clear" w:color="auto" w:fill="F0FDF4"/>
+        <w:pBdr>
+          <w:left w:val="single" w:sz="18" w:space="6" w:color="1155cc"/>
+        </w:pBdr>
+        <w:ind w:left="0"/>
+      </w:pPr>
+      <w:r>
+        <w:rPr>
+          <w:rFonts w:ascii="Arial" w:hAnsi="Arial"/>
+          <w:b/>
+          <w:i w:val="0"/>
+          <w:color w:val="000000"/>
+          <w:sz w:val="22"/>
+        </w:rPr>
+        <w:t>Automatic Calculation:</w:t>
+      </w:r>
+      <w:r>
+        <w:rPr>
+          <w:rFonts w:ascii="Arial" w:hAnsi="Arial"/>
+          <w:b w:val="0"/>
+          <w:i w:val="0"/>
+          <w:color w:val="000000"/>
+          <w:sz w:val="22"/>
+        </w:rPr>
+        <w:t xml:space="preserve"> The system should automatically compute TDS amounts based on the provided inputs</w:t>
+      </w:r>
+    </w:p>
+    <w:p>
+      <w:pPr>
+        <w:pStyle w:val="ListBullet"/>
+        <w:ind w:left="720" w:hanging="360"/>
+        <w:jc w:val="left"/>
+        <w:shd w:val="clear" w:color="auto" w:fill="F0FDF4"/>
+        <w:pBdr>
+          <w:left w:val="single" w:sz="18" w:space="6" w:color="1155cc"/>
+        </w:pBdr>
+        <w:ind w:left="0"/>
+      </w:pPr>
+      <w:r>
+        <w:rPr>
+          <w:rFonts w:ascii="Arial" w:hAnsi="Arial"/>
+          <w:b/>
+          <w:i w:val="0"/>
+          <w:color w:val="000000"/>
+          <w:sz w:val="22"/>
+        </w:rPr>
+        <w:t>Persistence:</w:t>
+      </w:r>
+      <w:r>
+        <w:rPr>
+          <w:rFonts w:ascii="Arial" w:hAnsi="Arial"/>
+          <w:b w:val="0"/>
+          <w:i w:val="0"/>
+          <w:color w:val="000000"/>
+          <w:sz w:val="22"/>
+        </w:rPr>
+        <w:t xml:space="preserve"> All TDS-related data should be persisted correctly for compliance and reporting</w:t>
+      </w:r>
+    </w:p>
+    <w:p>
+      <w:pPr>
+        <w:pStyle w:val="ListBullet"/>
+        <w:ind w:left="720" w:hanging="360"/>
+        <w:jc w:val="left"/>
+        <w:shd w:val="clear" w:color="auto" w:fill="F0FDF4"/>
+        <w:pBdr>
+          <w:left w:val="single" w:sz="18" w:space="6" w:color="1155cc"/>
+        </w:pBdr>
+        <w:ind w:left="0"/>
+      </w:pPr>
+      <w:r>
+        <w:rPr>
+          <w:rFonts w:ascii="Arial" w:hAnsi="Arial"/>
+          <w:b/>
+          <w:i w:val="0"/>
+          <w:color w:val="000000"/>
+          <w:sz w:val="22"/>
+        </w:rPr>
+        <w:t>Unified Flow:</w:t>
+      </w:r>
+      <w:r>
+        <w:rPr>
+          <w:rFonts w:ascii="Arial" w:hAnsi="Arial"/>
+          <w:b w:val="0"/>
+          <w:i w:val="0"/>
+          <w:color w:val="000000"/>
+          <w:sz w:val="22"/>
+        </w:rPr>
+        <w:t xml:space="preserve"> The payout should be created seamlessly after TDS calculation</w:t>
+      </w:r>
+    </w:p>
+    <w:p>
+      <w:pPr>
+        <w:pStyle w:val="ListBullet"/>
+        <w:ind w:left="720" w:hanging="360"/>
+        <w:jc w:val="left"/>
+        <w:shd w:val="clear" w:color="auto" w:fill="F0FDF4"/>
+        <w:pBdr>
+          <w:left w:val="single" w:sz="18" w:space="6" w:color="1155cc"/>
+        </w:pBdr>
+        <w:ind w:left="0"/>
+      </w:pPr>
+      <w:r>
+        <w:rPr>
+          <w:rFonts w:ascii="Arial" w:hAnsi="Arial"/>
+          <w:b/>
+          <w:i w:val="0"/>
+          <w:color w:val="000000"/>
+          <w:sz w:val="22"/>
+        </w:rPr>
+        <w:t>Universal Applicability:</w:t>
+      </w:r>
+      <w:r>
+        <w:rPr>
+          <w:rFonts w:ascii="Arial" w:hAnsi="Arial"/>
+          <w:b w:val="0"/>
+          <w:i w:val="0"/>
+          <w:color w:val="000000"/>
+          <w:sz w:val="22"/>
+        </w:rPr>
+        <w:t xml:space="preserve"> This single approach should work consistently across </w:t>
+      </w:r>
+      <w:r>
+        <w:rPr>
+          <w:rFonts w:ascii="Arial" w:hAnsi="Arial"/>
+          <w:b/>
+          <w:i w:val="0"/>
+          <w:color w:val="000000"/>
+          <w:sz w:val="22"/>
+        </w:rPr>
+        <w:t>all three payout types</w:t>
+      </w:r>
+      <w:r>
+        <w:rPr>
+          <w:rFonts w:ascii="Arial" w:hAnsi="Arial"/>
+          <w:b w:val="0"/>
+          <w:i w:val="0"/>
+          <w:color w:val="000000"/>
+          <w:sz w:val="22"/>
+        </w:rPr>
+        <w:t>:</w:t>
+        <w:br/>
+        <w:t xml:space="preserve">        </w:t>
+      </w:r>
+    </w:p>
+    <w:p>
+      <w:pPr>
+        <w:ind w:left="0" w:firstLine="0"/>
+        <w:jc w:val="left"/>
+        <w:shd w:val="clear" w:color="auto" w:fill="F0FDF4"/>
+        <w:pBdr>
+          <w:left w:val="single" w:sz="18" w:space="6" w:color="1155cc"/>
+        </w:pBdr>
+        <w:ind w:left="0"/>
       </w:pPr>
       <w:r>
         <w:rPr>
@@ -1417,22 +1583,7 @@
     <w:p>
       <w:pPr>
         <w:spacing w:before="240" w:after="240"/>
-        <w:pBdr>
-          <w:bottom w:val="single" w:sz="6" w:space="1" w:color="CCCCCC"/>
-        </w:pBdr>
-      </w:pPr>
-    </w:p>
-    <w:p>
-      <w:r>
-        <w:rPr>
-          <w:rFonts w:ascii="Arial" w:hAnsi="Arial"/>
-          <w:b w:val="0"/>
-          <w:i w:val="0"/>
-          <w:color w:val="000000"/>
-          <w:sz w:val="22"/>
-        </w:rPr>
-        <w:t>═══════════════════════════════════════════════════════════════════════</w:t>
-      </w:r>
+      </w:pPr>
     </w:p>
     <w:p>
       <w:pPr>
@@ -1529,22 +1680,7 @@
     <w:p>
       <w:pPr>
         <w:spacing w:before="240" w:after="240"/>
-        <w:pBdr>
-          <w:bottom w:val="single" w:sz="6" w:space="1" w:color="CCCCCC"/>
-        </w:pBdr>
-      </w:pPr>
-    </w:p>
-    <w:p>
-      <w:r>
-        <w:rPr>
-          <w:rFonts w:ascii="Arial" w:hAnsi="Arial"/>
-          <w:b w:val="0"/>
-          <w:i w:val="0"/>
-          <w:color w:val="000000"/>
-          <w:sz w:val="22"/>
-        </w:rPr>
-        <w:t>═══════════════════════════════════════════════════════════════════════</w:t>
-      </w:r>
+      </w:pPr>
     </w:p>
     <w:p>
       <w:pPr>
@@ -1641,22 +1777,7 @@
     <w:p>
       <w:pPr>
         <w:spacing w:before="240" w:after="240"/>
-        <w:pBdr>
-          <w:bottom w:val="single" w:sz="6" w:space="1" w:color="CCCCCC"/>
-        </w:pBdr>
-      </w:pPr>
-    </w:p>
-    <w:p>
-      <w:r>
-        <w:rPr>
-          <w:rFonts w:ascii="Arial" w:hAnsi="Arial"/>
-          <w:b w:val="0"/>
-          <w:i w:val="0"/>
-          <w:color w:val="000000"/>
-          <w:sz w:val="22"/>
-        </w:rPr>
-        <w:t>═══════════════════════════════════════════════════════════════════════</w:t>
-      </w:r>
+      </w:pPr>
     </w:p>
     <w:p>
       <w:pPr>
@@ -2059,22 +2180,7 @@
     <w:p>
       <w:pPr>
         <w:spacing w:before="240" w:after="240"/>
-        <w:pBdr>
-          <w:bottom w:val="single" w:sz="6" w:space="1" w:color="CCCCCC"/>
-        </w:pBdr>
-      </w:pPr>
-    </w:p>
-    <w:p>
-      <w:r>
-        <w:rPr>
-          <w:rFonts w:ascii="Arial" w:hAnsi="Arial"/>
-          <w:b w:val="0"/>
-          <w:i w:val="0"/>
-          <w:color w:val="000000"/>
-          <w:sz w:val="22"/>
-        </w:rPr>
-        <w:t>═══════════════════════════════════════════════════════════════════════</w:t>
-      </w:r>
+      </w:pPr>
     </w:p>
     <w:p>
       <w:pPr>
@@ -2353,11 +2459,13 @@
     </w:p>
     <w:p>
       <w:pPr>
+        <w:ind w:left="0" w:firstLine="0"/>
+        <w:jc w:val="left"/>
         <w:shd w:val="clear" w:color="auto" w:fill="EFF6FF"/>
         <w:pBdr>
           <w:left w:val="single" w:sz="18" w:space="6" w:color="1155cc"/>
         </w:pBdr>
-        <w:ind w:left="120"/>
+        <w:ind w:left="0"/>
       </w:pPr>
       <w:r>
         <w:rPr>
@@ -2875,22 +2983,7 @@
     <w:p>
       <w:pPr>
         <w:spacing w:before="240" w:after="240"/>
-        <w:pBdr>
-          <w:bottom w:val="single" w:sz="6" w:space="1" w:color="CCCCCC"/>
-        </w:pBdr>
-      </w:pPr>
-    </w:p>
-    <w:p>
-      <w:r>
-        <w:rPr>
-          <w:rFonts w:ascii="Arial" w:hAnsi="Arial"/>
-          <w:b w:val="0"/>
-          <w:i w:val="0"/>
-          <w:color w:val="000000"/>
-          <w:sz w:val="22"/>
-        </w:rPr>
-        <w:t>═══════════════════════════════════════════════════════════════════════</w:t>
-      </w:r>
+      </w:pPr>
     </w:p>
     <w:p>
       <w:pPr>
@@ -2911,11 +3004,13 @@
     </w:p>
     <w:p>
       <w:pPr>
+        <w:ind w:left="0" w:firstLine="0"/>
+        <w:jc w:val="left"/>
         <w:shd w:val="clear" w:color="auto" w:fill="FFFBEB"/>
         <w:pBdr>
           <w:left w:val="single" w:sz="18" w:space="6" w:color="1155cc"/>
         </w:pBdr>
-        <w:ind w:left="120"/>
+        <w:ind w:left="0"/>
       </w:pPr>
       <w:r>
         <w:rPr>
@@ -2930,11 +3025,13 @@
     </w:p>
     <w:p>
       <w:pPr>
+        <w:ind w:left="0" w:firstLine="0"/>
+        <w:jc w:val="left"/>
         <w:shd w:val="clear" w:color="auto" w:fill="FFFBEB"/>
         <w:pBdr>
           <w:left w:val="single" w:sz="18" w:space="6" w:color="1155cc"/>
         </w:pBdr>
-        <w:ind w:left="120"/>
+        <w:ind w:left="0"/>
       </w:pPr>
       <w:r>
         <w:rPr>
@@ -3089,11 +3186,13 @@
     </w:p>
     <w:p>
       <w:pPr>
+        <w:ind w:left="0" w:firstLine="0"/>
+        <w:jc w:val="left"/>
         <w:shd w:val="clear" w:color="auto" w:fill="FFFBEB"/>
         <w:pBdr>
           <w:left w:val="single" w:sz="18" w:space="6" w:color="1155cc"/>
         </w:pBdr>
-        <w:ind w:left="120"/>
+        <w:ind w:left="0"/>
       </w:pPr>
       <w:r>
         <w:rPr>
@@ -3476,22 +3575,7 @@
     <w:p>
       <w:pPr>
         <w:spacing w:before="240" w:after="240"/>
-        <w:pBdr>
-          <w:bottom w:val="single" w:sz="6" w:space="1" w:color="CCCCCC"/>
-        </w:pBdr>
-      </w:pPr>
-    </w:p>
-    <w:p>
-      <w:r>
-        <w:rPr>
-          <w:rFonts w:ascii="Arial" w:hAnsi="Arial"/>
-          <w:b w:val="0"/>
-          <w:i w:val="0"/>
-          <w:color w:val="000000"/>
-          <w:sz w:val="22"/>
-        </w:rPr>
-        <w:t>═══════════════════════════════════════════════════════════════════════</w:t>
-      </w:r>
+      </w:pPr>
     </w:p>
     <w:p>
       <w:pPr>
@@ -3512,11 +3596,13 @@
     </w:p>
     <w:p>
       <w:pPr>
+        <w:ind w:left="0" w:firstLine="0"/>
+        <w:jc w:val="left"/>
         <w:shd w:val="clear" w:color="auto" w:fill="F0FDF4"/>
         <w:pBdr>
           <w:left w:val="single" w:sz="18" w:space="6" w:color="1155cc"/>
         </w:pBdr>
-        <w:ind w:left="120"/>
+        <w:ind w:left="0"/>
       </w:pPr>
       <w:r>
         <w:rPr>
@@ -3531,11 +3617,13 @@
     </w:p>
     <w:p>
       <w:pPr>
+        <w:ind w:left="0" w:firstLine="0"/>
+        <w:jc w:val="left"/>
         <w:shd w:val="clear" w:color="auto" w:fill="F0FDF4"/>
         <w:pBdr>
           <w:left w:val="single" w:sz="18" w:space="6" w:color="1155cc"/>
         </w:pBdr>
-        <w:ind w:left="120"/>
+        <w:ind w:left="0"/>
       </w:pPr>
       <w:r>
         <w:rPr>
@@ -3625,6 +3713,8 @@
     <w:p>
       <w:pPr>
         <w:spacing w:after="160" w:line="276" w:lineRule="auto"/>
+        <w:ind w:left="0" w:firstLine="0"/>
+        <w:jc w:val="left"/>
       </w:pPr>
       <w:r>
         <w:rPr>
@@ -3944,9 +4034,6 @@
     <w:p>
       <w:pPr>
         <w:spacing w:before="240" w:after="240"/>
-        <w:pBdr>
-          <w:bottom w:val="single" w:sz="6" w:space="1" w:color="CCCCCC"/>
-        </w:pBdr>
       </w:pPr>
     </w:p>
     <w:p>
@@ -3992,11 +4079,13 @@
     </w:p>
     <w:p>
       <w:pPr>
+        <w:ind w:left="0" w:firstLine="0"/>
+        <w:jc w:val="left"/>
         <w:shd w:val="clear" w:color="auto" w:fill="F0FDF4"/>
         <w:pBdr>
           <w:left w:val="single" w:sz="18" w:space="6" w:color="1155cc"/>
         </w:pBdr>
-        <w:ind w:left="120"/>
+        <w:ind w:left="0"/>
       </w:pPr>
       <w:r>
         <w:rPr>
@@ -4011,11 +4100,13 @@
     </w:p>
     <w:p>
       <w:pPr>
+        <w:ind w:left="0" w:firstLine="0"/>
+        <w:jc w:val="left"/>
         <w:shd w:val="clear" w:color="auto" w:fill="F0FDF4"/>
         <w:pBdr>
           <w:left w:val="single" w:sz="18" w:space="6" w:color="1155cc"/>
         </w:pBdr>
-        <w:ind w:left="120"/>
+        <w:ind w:left="0"/>
       </w:pPr>
       <w:r>
         <w:rPr>
@@ -4085,6 +4176,8 @@
     <w:p>
       <w:pPr>
         <w:spacing w:after="160" w:line="276" w:lineRule="auto"/>
+        <w:ind w:left="0" w:firstLine="0"/>
+        <w:jc w:val="left"/>
       </w:pPr>
       <w:r>
         <w:rPr>
@@ -4106,11 +4199,13 @@
     </w:p>
     <w:p>
       <w:pPr>
+        <w:ind w:left="0" w:firstLine="0"/>
+        <w:jc w:val="left"/>
         <w:shd w:val="clear" w:color="auto" w:fill="EFF6FF"/>
         <w:pBdr>
           <w:left w:val="single" w:sz="18" w:space="6" w:color="1155cc"/>
         </w:pBdr>
-        <w:ind w:left="120"/>
+        <w:ind w:left="0"/>
       </w:pPr>
       <w:r>
         <w:rPr>
@@ -4121,6 +4216,172 @@
           <w:sz w:val="24"/>
         </w:rPr>
         <w:t>Flow Summary</w:t>
+      </w:r>
+    </w:p>
+    <w:p>
+      <w:pPr>
+        <w:pStyle w:val="ListNumber"/>
+        <w:ind w:left="720" w:hanging="360"/>
+        <w:jc w:val="left"/>
+        <w:shd w:val="clear" w:color="auto" w:fill="EFF6FF"/>
+        <w:pBdr>
+          <w:left w:val="single" w:sz="18" w:space="6" w:color="1155cc"/>
+        </w:pBdr>
+        <w:ind w:left="0"/>
+      </w:pPr>
+      <w:r>
+        <w:rPr>
+          <w:rFonts w:ascii="Arial" w:hAnsi="Arial"/>
+          <w:b/>
+          <w:i w:val="0"/>
+          <w:color w:val="000000"/>
+          <w:sz w:val="22"/>
+        </w:rPr>
+        <w:t>API Request:</w:t>
+      </w:r>
+      <w:r>
+        <w:rPr>
+          <w:rFonts w:ascii="Arial" w:hAnsi="Arial"/>
+          <w:b w:val="0"/>
+          <w:i w:val="0"/>
+          <w:color w:val="000000"/>
+          <w:sz w:val="22"/>
+        </w:rPr>
+        <w:t xml:space="preserve"> Merchant calls Payouts API with optional TDS fields:</w:t>
+        <w:br/>
+        <w:t xml:space="preserve">        </w:t>
+      </w:r>
+    </w:p>
+    <w:p>
+      <w:pPr>
+        <w:pStyle w:val="ListNumber"/>
+        <w:ind w:left="720" w:hanging="360"/>
+        <w:jc w:val="left"/>
+        <w:shd w:val="clear" w:color="auto" w:fill="EFF6FF"/>
+        <w:pBdr>
+          <w:left w:val="single" w:sz="18" w:space="6" w:color="1155cc"/>
+        </w:pBdr>
+        <w:ind w:left="0"/>
+      </w:pPr>
+      <w:r>
+        <w:rPr>
+          <w:rFonts w:ascii="Arial" w:hAnsi="Arial"/>
+          <w:b/>
+          <w:i w:val="0"/>
+          <w:color w:val="000000"/>
+          <w:sz w:val="22"/>
+        </w:rPr>
+        <w:t>Enrichment Hook (if TDS fields present):</w:t>
+      </w:r>
+      <w:r>
+        <w:rPr>
+          <w:rFonts w:ascii="Arial" w:hAnsi="Arial"/>
+          <w:b w:val="0"/>
+          <w:i w:val="0"/>
+          <w:color w:val="000000"/>
+          <w:sz w:val="22"/>
+        </w:rPr>
+        <w:t xml:space="preserve"> Payouts calls Tax-Compliance internal enrichment API:</w:t>
+        <w:br/>
+        <w:t xml:space="preserve">        </w:t>
+      </w:r>
+    </w:p>
+    <w:p>
+      <w:pPr>
+        <w:pStyle w:val="ListNumber"/>
+        <w:ind w:left="720" w:hanging="360"/>
+        <w:jc w:val="left"/>
+        <w:shd w:val="clear" w:color="auto" w:fill="EFF6FF"/>
+        <w:pBdr>
+          <w:left w:val="single" w:sz="18" w:space="6" w:color="1155cc"/>
+        </w:pBdr>
+        <w:ind w:left="0"/>
+      </w:pPr>
+      <w:r>
+        <w:rPr>
+          <w:rFonts w:ascii="Arial" w:hAnsi="Arial"/>
+          <w:b/>
+          <w:i w:val="0"/>
+          <w:color w:val="000000"/>
+          <w:sz w:val="22"/>
+        </w:rPr>
+        <w:t>Payout Creation:</w:t>
+      </w:r>
+      <w:r>
+        <w:rPr>
+          <w:rFonts w:ascii="Arial" w:hAnsi="Arial"/>
+          <w:b w:val="0"/>
+          <w:i w:val="0"/>
+          <w:color w:val="000000"/>
+          <w:sz w:val="22"/>
+        </w:rPr>
+        <w:t xml:space="preserve"> Payouts creates payout with:</w:t>
+        <w:br/>
+        <w:t xml:space="preserve">        </w:t>
+      </w:r>
+    </w:p>
+    <w:p>
+      <w:pPr>
+        <w:pStyle w:val="ListNumber"/>
+        <w:ind w:left="720" w:hanging="360"/>
+        <w:jc w:val="left"/>
+        <w:shd w:val="clear" w:color="auto" w:fill="EFF6FF"/>
+        <w:pBdr>
+          <w:left w:val="single" w:sz="18" w:space="6" w:color="1155cc"/>
+        </w:pBdr>
+        <w:ind w:left="0"/>
+      </w:pPr>
+      <w:r>
+        <w:rPr>
+          <w:rFonts w:ascii="Arial" w:hAnsi="Arial"/>
+          <w:b/>
+          <w:i w:val="0"/>
+          <w:color w:val="000000"/>
+          <w:sz w:val="22"/>
+        </w:rPr>
+        <w:t>Event Emission:</w:t>
+      </w:r>
+      <w:r>
+        <w:rPr>
+          <w:rFonts w:ascii="Arial" w:hAnsi="Arial"/>
+          <w:b w:val="0"/>
+          <w:i w:val="0"/>
+          <w:color w:val="000000"/>
+          <w:sz w:val="22"/>
+        </w:rPr>
+        <w:t xml:space="preserve"> Payouts emits status change events (existing mechanism)</w:t>
+      </w:r>
+    </w:p>
+    <w:p>
+      <w:pPr>
+        <w:pStyle w:val="ListNumber"/>
+        <w:ind w:left="720" w:hanging="360"/>
+        <w:jc w:val="left"/>
+        <w:shd w:val="clear" w:color="auto" w:fill="EFF6FF"/>
+        <w:pBdr>
+          <w:left w:val="single" w:sz="18" w:space="6" w:color="1155cc"/>
+        </w:pBdr>
+        <w:ind w:left="0"/>
+      </w:pPr>
+      <w:r>
+        <w:rPr>
+          <w:rFonts w:ascii="Arial" w:hAnsi="Arial"/>
+          <w:b/>
+          <w:i w:val="0"/>
+          <w:color w:val="000000"/>
+          <w:sz w:val="22"/>
+        </w:rPr>
+        <w:t>TDS Entity Update:</w:t>
+      </w:r>
+      <w:r>
+        <w:rPr>
+          <w:rFonts w:ascii="Arial" w:hAnsi="Arial"/>
+          <w:b w:val="0"/>
+          <w:i w:val="0"/>
+          <w:color w:val="000000"/>
+          <w:sz w:val="22"/>
+        </w:rPr>
+        <w:t xml:space="preserve"> Tax-Compliance listens to payout events and updates tds_payments entity (PENDING → SUCCESS/FAILED)</w:t>
       </w:r>
     </w:p>
     <w:p>
@@ -4523,11 +4784,13 @@
     </w:p>
     <w:p>
       <w:pPr>
+        <w:ind w:left="0" w:firstLine="0"/>
+        <w:jc w:val="left"/>
         <w:shd w:val="clear" w:color="auto" w:fill="EFF6FF"/>
         <w:pBdr>
           <w:left w:val="single" w:sz="18" w:space="6" w:color="1155cc"/>
         </w:pBdr>
-        <w:ind w:left="120"/>
+        <w:ind w:left="0"/>
       </w:pPr>
       <w:r>
         <w:rPr>
@@ -4542,11 +4805,13 @@
     </w:p>
     <w:p>
       <w:pPr>
+        <w:ind w:left="0" w:firstLine="0"/>
+        <w:jc w:val="left"/>
         <w:shd w:val="clear" w:color="auto" w:fill="EFF6FF"/>
         <w:pBdr>
           <w:left w:val="single" w:sz="18" w:space="6" w:color="1155cc"/>
         </w:pBdr>
-        <w:ind w:left="120"/>
+        <w:ind w:left="0"/>
       </w:pPr>
       <w:r>
         <w:rPr>
@@ -4586,11 +4851,13 @@
     </w:p>
     <w:p>
       <w:pPr>
+        <w:ind w:left="0" w:firstLine="0"/>
+        <w:jc w:val="left"/>
         <w:shd w:val="clear" w:color="auto" w:fill="EFF6FF"/>
         <w:pBdr>
           <w:left w:val="single" w:sz="18" w:space="6" w:color="1155cc"/>
         </w:pBdr>
-        <w:ind w:left="120"/>
+        <w:ind w:left="0"/>
       </w:pPr>
       <w:r>
         <w:rPr>
@@ -4617,6 +4884,134 @@
         <w:t xml:space="preserve">      the payout. The latency impact (~50-100ms) is acceptable for the following reasons:</w:t>
         <w:br/>
         <w:t xml:space="preserve">    </w:t>
+      </w:r>
+    </w:p>
+    <w:p>
+      <w:pPr>
+        <w:pStyle w:val="ListBullet"/>
+        <w:ind w:left="720" w:hanging="360"/>
+        <w:jc w:val="left"/>
+        <w:shd w:val="clear" w:color="auto" w:fill="EFF6FF"/>
+        <w:pBdr>
+          <w:left w:val="single" w:sz="18" w:space="6" w:color="1155cc"/>
+        </w:pBdr>
+        <w:ind w:left="0"/>
+      </w:pPr>
+      <w:r>
+        <w:rPr>
+          <w:rFonts w:ascii="Arial" w:hAnsi="Arial"/>
+          <w:b/>
+          <w:i w:val="0"/>
+          <w:color w:val="000000"/>
+          <w:sz w:val="22"/>
+        </w:rPr>
+        <w:t>Isolated Impact:</w:t>
+      </w:r>
+      <w:r>
+        <w:rPr>
+          <w:rFonts w:ascii="Arial" w:hAnsi="Arial"/>
+          <w:b w:val="0"/>
+          <w:i w:val="0"/>
+          <w:color w:val="000000"/>
+          <w:sz w:val="22"/>
+        </w:rPr>
+        <w:t xml:space="preserve"> Only affects TDS-enabled payouts; non-TDS payouts have zero latency change</w:t>
+      </w:r>
+    </w:p>
+    <w:p>
+      <w:pPr>
+        <w:pStyle w:val="ListBullet"/>
+        <w:ind w:left="720" w:hanging="360"/>
+        <w:jc w:val="left"/>
+        <w:shd w:val="clear" w:color="auto" w:fill="EFF6FF"/>
+        <w:pBdr>
+          <w:left w:val="single" w:sz="18" w:space="6" w:color="1155cc"/>
+        </w:pBdr>
+        <w:ind w:left="0"/>
+      </w:pPr>
+      <w:r>
+        <w:rPr>
+          <w:rFonts w:ascii="Arial" w:hAnsi="Arial"/>
+          <w:b/>
+          <w:i w:val="0"/>
+          <w:color w:val="000000"/>
+          <w:sz w:val="22"/>
+        </w:rPr>
+        <w:t>Lightweight Operation:</w:t>
+      </w:r>
+      <w:r>
+        <w:rPr>
+          <w:rFonts w:ascii="Arial" w:hAnsi="Arial"/>
+          <w:b w:val="0"/>
+          <w:i w:val="0"/>
+          <w:color w:val="000000"/>
+          <w:sz w:val="22"/>
+        </w:rPr>
+        <w:t xml:space="preserve"> Enrichment is fast (compute + DB insert)</w:t>
+      </w:r>
+    </w:p>
+    <w:p>
+      <w:pPr>
+        <w:pStyle w:val="ListBullet"/>
+        <w:ind w:left="720" w:hanging="360"/>
+        <w:jc w:val="left"/>
+        <w:shd w:val="clear" w:color="auto" w:fill="EFF6FF"/>
+        <w:pBdr>
+          <w:left w:val="single" w:sz="18" w:space="6" w:color="1155cc"/>
+        </w:pBdr>
+        <w:ind w:left="0"/>
+      </w:pPr>
+      <w:r>
+        <w:rPr>
+          <w:rFonts w:ascii="Arial" w:hAnsi="Arial"/>
+          <w:b/>
+          <w:i w:val="0"/>
+          <w:color w:val="000000"/>
+          <w:sz w:val="22"/>
+        </w:rPr>
+        <w:t>Scalable:</w:t>
+      </w:r>
+      <w:r>
+        <w:rPr>
+          <w:rFonts w:ascii="Arial" w:hAnsi="Arial"/>
+          <w:b w:val="0"/>
+          <w:i w:val="0"/>
+          <w:color w:val="000000"/>
+          <w:sz w:val="22"/>
+        </w:rPr>
+        <w:t xml:space="preserve"> Tax-Compliance can be horizontally scaled</w:t>
+      </w:r>
+    </w:p>
+    <w:p>
+      <w:pPr>
+        <w:pStyle w:val="ListBullet"/>
+        <w:ind w:left="720" w:hanging="360"/>
+        <w:jc w:val="left"/>
+        <w:shd w:val="clear" w:color="auto" w:fill="EFF6FF"/>
+        <w:pBdr>
+          <w:left w:val="single" w:sz="18" w:space="6" w:color="1155cc"/>
+        </w:pBdr>
+        <w:ind w:left="0"/>
+      </w:pPr>
+      <w:r>
+        <w:rPr>
+          <w:rFonts w:ascii="Arial" w:hAnsi="Arial"/>
+          <w:b/>
+          <w:i w:val="0"/>
+          <w:color w:val="000000"/>
+          <w:sz w:val="22"/>
+        </w:rPr>
+        <w:t>One-Stop Solution:</w:t>
+      </w:r>
+      <w:r>
+        <w:rPr>
+          <w:rFonts w:ascii="Arial" w:hAnsi="Arial"/>
+          <w:b w:val="0"/>
+          <w:i w:val="0"/>
+          <w:color w:val="000000"/>
+          <w:sz w:val="22"/>
+        </w:rPr>
+        <w:t xml:space="preserve"> Merchants get what they asked for - single API call</w:t>
       </w:r>
     </w:p>
     <w:tbl>
@@ -4920,11 +5315,197 @@
     </w:p>
     <w:p>
       <w:pPr>
+        <w:pStyle w:val="ListBullet"/>
+        <w:ind w:left="720" w:hanging="360"/>
+        <w:jc w:val="left"/>
         <w:shd w:val="clear" w:color="auto" w:fill="EFF6FF"/>
         <w:pBdr>
           <w:left w:val="single" w:sz="18" w:space="6" w:color="1155cc"/>
         </w:pBdr>
-        <w:ind w:left="120"/>
+        <w:ind w:left="0"/>
+      </w:pPr>
+      <w:r>
+        <w:rPr>
+          <w:rFonts w:ascii="Arial" w:hAnsi="Arial"/>
+          <w:b/>
+          <w:i w:val="0"/>
+          <w:color w:val="000000"/>
+          <w:sz w:val="22"/>
+        </w:rPr>
+        <w:t>Payouts stores:</w:t>
+      </w:r>
+      <w:r>
+        <w:rPr>
+          <w:rFonts w:ascii="Arial" w:hAnsi="Arial"/>
+          <w:b w:val="0"/>
+          <w:i w:val="0"/>
+          <w:color w:val="000000"/>
+          <w:sz w:val="22"/>
+        </w:rPr>
+        <w:t xml:space="preserve"> Payout with net_amount + metadata fields — </w:t>
+      </w:r>
+      <w:r>
+        <w:rPr>
+          <w:rFonts w:ascii="Courier New" w:hAnsi="Courier New"/>
+          <w:b w:val="0"/>
+          <w:i w:val="0"/>
+          <w:color w:val="000000"/>
+          <w:sz w:val="22"/>
+        </w:rPr>
+        <w:t>tds_payment_id</w:t>
+      </w:r>
+      <w:r>
+        <w:rPr>
+          <w:rFonts w:ascii="Arial" w:hAnsi="Arial"/>
+          <w:b w:val="0"/>
+          <w:i w:val="0"/>
+          <w:color w:val="000000"/>
+          <w:sz w:val="22"/>
+        </w:rPr>
+        <w:t xml:space="preserve">, </w:t>
+      </w:r>
+      <w:r>
+        <w:rPr>
+          <w:rFonts w:ascii="Courier New" w:hAnsi="Courier New"/>
+          <w:b w:val="0"/>
+          <w:i w:val="0"/>
+          <w:color w:val="000000"/>
+          <w:sz w:val="22"/>
+        </w:rPr>
+        <w:t>tds_amount</w:t>
+      </w:r>
+      <w:r>
+        <w:rPr>
+          <w:rFonts w:ascii="Arial" w:hAnsi="Arial"/>
+          <w:b w:val="0"/>
+          <w:i w:val="0"/>
+          <w:color w:val="000000"/>
+          <w:sz w:val="22"/>
+        </w:rPr>
+        <w:t xml:space="preserve">, </w:t>
+      </w:r>
+      <w:r>
+        <w:rPr>
+          <w:rFonts w:ascii="Courier New" w:hAnsi="Courier New"/>
+          <w:b w:val="0"/>
+          <w:i w:val="0"/>
+          <w:color w:val="000000"/>
+          <w:sz w:val="22"/>
+        </w:rPr>
+        <w:t>tds_rate</w:t>
+      </w:r>
+      <w:r>
+        <w:rPr>
+          <w:rFonts w:ascii="Arial" w:hAnsi="Arial"/>
+          <w:b w:val="0"/>
+          <w:i w:val="0"/>
+          <w:color w:val="000000"/>
+          <w:sz w:val="22"/>
+        </w:rPr>
+        <w:t xml:space="preserve">, </w:t>
+      </w:r>
+      <w:r>
+        <w:rPr>
+          <w:rFonts w:ascii="Courier New" w:hAnsi="Courier New"/>
+          <w:b w:val="0"/>
+          <w:i w:val="0"/>
+          <w:color w:val="000000"/>
+          <w:sz w:val="22"/>
+        </w:rPr>
+        <w:t>category_id</w:t>
+      </w:r>
+      <w:r>
+        <w:rPr>
+          <w:rFonts w:ascii="Arial" w:hAnsi="Arial"/>
+          <w:b w:val="0"/>
+          <w:i w:val="0"/>
+          <w:color w:val="000000"/>
+          <w:sz w:val="22"/>
+        </w:rPr>
+        <w:t xml:space="preserve"> (stored in payout metadata/details). No new entity in Payouts.</w:t>
+      </w:r>
+    </w:p>
+    <w:p>
+      <w:pPr>
+        <w:pStyle w:val="ListBullet"/>
+        <w:ind w:left="720" w:hanging="360"/>
+        <w:jc w:val="left"/>
+        <w:shd w:val="clear" w:color="auto" w:fill="EFF6FF"/>
+        <w:pBdr>
+          <w:left w:val="single" w:sz="18" w:space="6" w:color="1155cc"/>
+        </w:pBdr>
+        <w:ind w:left="0"/>
+      </w:pPr>
+      <w:r>
+        <w:rPr>
+          <w:rFonts w:ascii="Arial" w:hAnsi="Arial"/>
+          <w:b/>
+          <w:i w:val="0"/>
+          <w:color w:val="000000"/>
+          <w:sz w:val="22"/>
+        </w:rPr>
+        <w:t>Tax-Compliance stores:</w:t>
+      </w:r>
+      <w:r>
+        <w:rPr>
+          <w:rFonts w:ascii="Arial" w:hAnsi="Arial"/>
+          <w:b w:val="0"/>
+          <w:i w:val="0"/>
+          <w:color w:val="000000"/>
+          <w:sz w:val="22"/>
+        </w:rPr>
+        <w:t xml:space="preserve"> Full </w:t>
+      </w:r>
+      <w:r>
+        <w:rPr>
+          <w:rFonts w:ascii="Courier New" w:hAnsi="Courier New"/>
+          <w:b w:val="0"/>
+          <w:i w:val="0"/>
+          <w:color w:val="000000"/>
+          <w:sz w:val="22"/>
+        </w:rPr>
+        <w:t>tds_payments</w:t>
+      </w:r>
+      <w:r>
+        <w:rPr>
+          <w:rFonts w:ascii="Arial" w:hAnsi="Arial"/>
+          <w:b w:val="0"/>
+          <w:i w:val="0"/>
+          <w:color w:val="000000"/>
+          <w:sz w:val="22"/>
+        </w:rPr>
+        <w:t xml:space="preserve"> entity, created </w:t>
+      </w:r>
+      <w:r>
+        <w:rPr>
+          <w:rFonts w:ascii="Arial" w:hAnsi="Arial"/>
+          <w:b/>
+          <w:i w:val="0"/>
+          <w:color w:val="000000"/>
+          <w:sz w:val="22"/>
+        </w:rPr>
+        <w:t>synchronously during enrichment</w:t>
+      </w:r>
+      <w:r>
+        <w:rPr>
+          <w:rFonts w:ascii="Arial" w:hAnsi="Arial"/>
+          <w:b w:val="0"/>
+          <w:i w:val="0"/>
+          <w:color w:val="000000"/>
+          <w:sz w:val="22"/>
+        </w:rPr>
+        <w:t xml:space="preserve"> with status PENDING. Later updated to SUCCESS/FAILED via payout status events.</w:t>
+      </w:r>
+    </w:p>
+    <w:p>
+      <w:pPr>
+        <w:ind w:left="0" w:firstLine="0"/>
+        <w:jc w:val="left"/>
+        <w:shd w:val="clear" w:color="auto" w:fill="EFF6FF"/>
+        <w:pBdr>
+          <w:left w:val="single" w:sz="18" w:space="6" w:color="1155cc"/>
+        </w:pBdr>
+        <w:ind w:left="0"/>
       </w:pPr>
       <w:r>
         <w:rPr>
@@ -5977,9 +6558,6 @@
     <w:p>
       <w:pPr>
         <w:spacing w:before="240" w:after="240"/>
-        <w:pBdr>
-          <w:bottom w:val="single" w:sz="6" w:space="1" w:color="CCCCCC"/>
-        </w:pBdr>
       </w:pPr>
     </w:p>
     <w:p>
@@ -6043,6 +6621,8 @@
     <w:p>
       <w:pPr>
         <w:spacing w:after="160" w:line="276" w:lineRule="auto"/>
+        <w:ind w:left="0" w:firstLine="0"/>
+        <w:jc w:val="left"/>
       </w:pPr>
       <w:r>
         <w:rPr>
@@ -6062,11 +6642,13 @@
     </w:p>
     <w:p>
       <w:pPr>
+        <w:ind w:left="0" w:firstLine="0"/>
+        <w:jc w:val="left"/>
         <w:shd w:val="clear" w:color="auto" w:fill="EFF6FF"/>
         <w:pBdr>
           <w:left w:val="single" w:sz="18" w:space="6" w:color="1155cc"/>
         </w:pBdr>
-        <w:ind w:left="120"/>
+        <w:ind w:left="0"/>
       </w:pPr>
       <w:r>
         <w:rPr>
@@ -6077,6 +6659,124 @@
           <w:sz w:val="24"/>
         </w:rPr>
         <w:t>Flow Summary</w:t>
+      </w:r>
+    </w:p>
+    <w:p>
+      <w:pPr>
+        <w:pStyle w:val="ListNumber"/>
+        <w:ind w:left="720" w:hanging="360"/>
+        <w:jc w:val="left"/>
+        <w:shd w:val="clear" w:color="auto" w:fill="EFF6FF"/>
+        <w:pBdr>
+          <w:left w:val="single" w:sz="18" w:space="6" w:color="1155cc"/>
+        </w:pBdr>
+        <w:ind w:left="0"/>
+      </w:pPr>
+      <w:r>
+        <w:rPr>
+          <w:rFonts w:ascii="Arial" w:hAnsi="Arial"/>
+          <w:b/>
+          <w:i w:val="0"/>
+          <w:color w:val="000000"/>
+          <w:sz w:val="22"/>
+        </w:rPr>
+        <w:t>Preview (UI only):</w:t>
+      </w:r>
+      <w:r>
+        <w:rPr>
+          <w:rFonts w:ascii="Arial" w:hAnsi="Arial"/>
+          <w:b w:val="0"/>
+          <w:i w:val="0"/>
+          <w:color w:val="000000"/>
+          <w:sz w:val="22"/>
+        </w:rPr>
+        <w:t xml:space="preserve"> Tax-Compliance (BFF) computes TDS to show breakdown</w:t>
+      </w:r>
+    </w:p>
+    <w:p>
+      <w:pPr>
+        <w:pStyle w:val="ListNumber"/>
+        <w:ind w:left="720" w:hanging="360"/>
+        <w:jc w:val="left"/>
+        <w:shd w:val="clear" w:color="auto" w:fill="EFF6FF"/>
+        <w:pBdr>
+          <w:left w:val="single" w:sz="18" w:space="6" w:color="1155cc"/>
+        </w:pBdr>
+        <w:ind w:left="0"/>
+      </w:pPr>
+      <w:r>
+        <w:rPr>
+          <w:rFonts w:ascii="Arial" w:hAnsi="Arial"/>
+          <w:b/>
+          <w:i w:val="0"/>
+          <w:color w:val="000000"/>
+          <w:sz w:val="22"/>
+        </w:rPr>
+        <w:t>Single API Call:</w:t>
+      </w:r>
+      <w:r>
+        <w:rPr>
+          <w:rFonts w:ascii="Arial" w:hAnsi="Arial"/>
+          <w:b w:val="0"/>
+          <w:i w:val="0"/>
+          <w:color w:val="000000"/>
+          <w:sz w:val="22"/>
+        </w:rPr>
+        <w:t xml:space="preserve"> UI calls Tax-Compliance payout creation API (not Payouts directly)</w:t>
+      </w:r>
+    </w:p>
+    <w:p>
+      <w:pPr>
+        <w:pStyle w:val="ListNumber"/>
+        <w:ind w:left="720" w:hanging="360"/>
+        <w:jc w:val="left"/>
+        <w:shd w:val="clear" w:color="auto" w:fill="EFF6FF"/>
+        <w:pBdr>
+          <w:left w:val="single" w:sz="18" w:space="6" w:color="1155cc"/>
+        </w:pBdr>
+        <w:ind w:left="0"/>
+      </w:pPr>
+      <w:r>
+        <w:rPr>
+          <w:rFonts w:ascii="Arial" w:hAnsi="Arial"/>
+          <w:b/>
+          <w:i w:val="0"/>
+          <w:color w:val="000000"/>
+          <w:sz w:val="22"/>
+        </w:rPr>
+        <w:t>Tax-Compliance Orchestration:</w:t>
+      </w:r>
+    </w:p>
+    <w:p>
+      <w:pPr>
+        <w:pStyle w:val="ListNumber"/>
+        <w:ind w:left="720" w:hanging="360"/>
+        <w:jc w:val="left"/>
+        <w:shd w:val="clear" w:color="auto" w:fill="EFF6FF"/>
+        <w:pBdr>
+          <w:left w:val="single" w:sz="18" w:space="6" w:color="1155cc"/>
+        </w:pBdr>
+        <w:ind w:left="0"/>
+      </w:pPr>
+      <w:r>
+        <w:rPr>
+          <w:rFonts w:ascii="Arial" w:hAnsi="Arial"/>
+          <w:b/>
+          <w:i w:val="0"/>
+          <w:color w:val="000000"/>
+          <w:sz w:val="22"/>
+        </w:rPr>
+        <w:t>Status Sync:</w:t>
+      </w:r>
+      <w:r>
+        <w:rPr>
+          <w:rFonts w:ascii="Arial" w:hAnsi="Arial"/>
+          <w:b w:val="0"/>
+          <w:i w:val="0"/>
+          <w:color w:val="000000"/>
+          <w:sz w:val="22"/>
+        </w:rPr>
+        <w:t xml:space="preserve"> Tax-Compliance listens to payout status updates via existing Kafka topic</w:t>
       </w:r>
     </w:p>
     <w:p>
@@ -6571,11 +7271,13 @@
     </w:tbl>
     <w:p>
       <w:pPr>
+        <w:ind w:left="0" w:firstLine="0"/>
+        <w:jc w:val="left"/>
         <w:shd w:val="clear" w:color="auto" w:fill="FFFBEB"/>
         <w:pBdr>
           <w:left w:val="single" w:sz="18" w:space="6" w:color="1155cc"/>
         </w:pBdr>
-        <w:ind w:left="120"/>
+        <w:ind w:left="0"/>
       </w:pPr>
       <w:r>
         <w:rPr>
@@ -6590,11 +7292,13 @@
     </w:p>
     <w:p>
       <w:pPr>
+        <w:ind w:left="0" w:firstLine="0"/>
+        <w:jc w:val="left"/>
         <w:shd w:val="clear" w:color="auto" w:fill="FFFBEB"/>
         <w:pBdr>
           <w:left w:val="single" w:sz="18" w:space="6" w:color="1155cc"/>
         </w:pBdr>
-        <w:ind w:left="120"/>
+        <w:ind w:left="0"/>
       </w:pPr>
       <w:r>
         <w:rPr>
@@ -6617,9 +7321,6 @@
     <w:p>
       <w:pPr>
         <w:spacing w:before="240" w:after="240"/>
-        <w:pBdr>
-          <w:bottom w:val="single" w:sz="6" w:space="1" w:color="CCCCCC"/>
-        </w:pBdr>
       </w:pPr>
     </w:p>
     <w:p>
@@ -6683,6 +7384,8 @@
     <w:p>
       <w:pPr>
         <w:spacing w:after="160" w:line="276" w:lineRule="auto"/>
+        <w:ind w:left="0" w:firstLine="0"/>
+        <w:jc w:val="left"/>
       </w:pPr>
       <w:r>
         <w:rPr>
@@ -6702,11 +7405,13 @@
     </w:p>
     <w:p>
       <w:pPr>
+        <w:ind w:left="0" w:firstLine="0"/>
+        <w:jc w:val="left"/>
         <w:shd w:val="clear" w:color="auto" w:fill="EFF6FF"/>
         <w:pBdr>
           <w:left w:val="single" w:sz="18" w:space="6" w:color="1155cc"/>
         </w:pBdr>
-        <w:ind w:left="120"/>
+        <w:ind w:left="0"/>
       </w:pPr>
       <w:r>
         <w:rPr>
@@ -6717,6 +7422,166 @@
           <w:sz w:val="24"/>
         </w:rPr>
         <w:t>Flow Summary</w:t>
+      </w:r>
+    </w:p>
+    <w:p>
+      <w:pPr>
+        <w:pStyle w:val="ListNumber"/>
+        <w:ind w:left="720" w:hanging="360"/>
+        <w:jc w:val="left"/>
+        <w:shd w:val="clear" w:color="auto" w:fill="EFF6FF"/>
+        <w:pBdr>
+          <w:left w:val="single" w:sz="18" w:space="6" w:color="1155cc"/>
+        </w:pBdr>
+        <w:ind w:left="0"/>
+      </w:pPr>
+      <w:r>
+        <w:rPr>
+          <w:rFonts w:ascii="Arial" w:hAnsi="Arial"/>
+          <w:b/>
+          <w:i w:val="0"/>
+          <w:color w:val="000000"/>
+          <w:sz w:val="22"/>
+        </w:rPr>
+        <w:t>Compute TDS (First API Call):</w:t>
+      </w:r>
+      <w:r>
+        <w:rPr>
+          <w:rFonts w:ascii="Arial" w:hAnsi="Arial"/>
+          <w:b w:val="0"/>
+          <w:i w:val="0"/>
+          <w:color w:val="000000"/>
+          <w:sz w:val="22"/>
+        </w:rPr>
+        <w:t xml:space="preserve"> Caller calls Tax-Compliance API with gross_amount, category_id, contact_id</w:t>
+      </w:r>
+    </w:p>
+    <w:p>
+      <w:pPr>
+        <w:pStyle w:val="ListNumber"/>
+        <w:ind w:left="720" w:hanging="360"/>
+        <w:jc w:val="left"/>
+        <w:shd w:val="clear" w:color="auto" w:fill="EFF6FF"/>
+        <w:pBdr>
+          <w:left w:val="single" w:sz="18" w:space="6" w:color="1155cc"/>
+        </w:pBdr>
+        <w:ind w:left="0"/>
+      </w:pPr>
+      <w:r>
+        <w:rPr>
+          <w:rFonts w:ascii="Arial" w:hAnsi="Arial"/>
+          <w:b/>
+          <w:i w:val="0"/>
+          <w:color w:val="000000"/>
+          <w:sz w:val="22"/>
+        </w:rPr>
+        <w:t>TDS Entity Created:</w:t>
+      </w:r>
+      <w:r>
+        <w:rPr>
+          <w:rFonts w:ascii="Arial" w:hAnsi="Arial"/>
+          <w:b w:val="0"/>
+          <w:i w:val="0"/>
+          <w:color w:val="000000"/>
+          <w:sz w:val="22"/>
+        </w:rPr>
+        <w:t xml:space="preserve"> Tax-Compliance computes TDS, creates tds_payments entity (status: PENDING), returns tds_payment_id, tds_amount, net_amount</w:t>
+      </w:r>
+    </w:p>
+    <w:p>
+      <w:pPr>
+        <w:pStyle w:val="ListNumber"/>
+        <w:ind w:left="720" w:hanging="360"/>
+        <w:jc w:val="left"/>
+        <w:shd w:val="clear" w:color="auto" w:fill="EFF6FF"/>
+        <w:pBdr>
+          <w:left w:val="single" w:sz="18" w:space="6" w:color="1155cc"/>
+        </w:pBdr>
+        <w:ind w:left="0"/>
+      </w:pPr>
+      <w:r>
+        <w:rPr>
+          <w:rFonts w:ascii="Arial" w:hAnsi="Arial"/>
+          <w:b/>
+          <w:i w:val="0"/>
+          <w:color w:val="000000"/>
+          <w:sz w:val="22"/>
+        </w:rPr>
+        <w:t>Create Payout (Second API Call):</w:t>
+      </w:r>
+      <w:r>
+        <w:rPr>
+          <w:rFonts w:ascii="Arial" w:hAnsi="Arial"/>
+          <w:b w:val="0"/>
+          <w:i w:val="0"/>
+          <w:color w:val="000000"/>
+          <w:sz w:val="22"/>
+        </w:rPr>
+        <w:t xml:space="preserve"> Caller calls Payouts API with net_amount and tds_payment_id in metadata</w:t>
+      </w:r>
+    </w:p>
+    <w:p>
+      <w:pPr>
+        <w:pStyle w:val="ListNumber"/>
+        <w:ind w:left="720" w:hanging="360"/>
+        <w:jc w:val="left"/>
+        <w:shd w:val="clear" w:color="auto" w:fill="EFF6FF"/>
+        <w:pBdr>
+          <w:left w:val="single" w:sz="18" w:space="6" w:color="1155cc"/>
+        </w:pBdr>
+        <w:ind w:left="0"/>
+      </w:pPr>
+      <w:r>
+        <w:rPr>
+          <w:rFonts w:ascii="Arial" w:hAnsi="Arial"/>
+          <w:b/>
+          <w:i w:val="0"/>
+          <w:color w:val="000000"/>
+          <w:sz w:val="22"/>
+        </w:rPr>
+        <w:t>Payout Creation:</w:t>
+      </w:r>
+      <w:r>
+        <w:rPr>
+          <w:rFonts w:ascii="Arial" w:hAnsi="Arial"/>
+          <w:b w:val="0"/>
+          <w:i w:val="0"/>
+          <w:color w:val="000000"/>
+          <w:sz w:val="22"/>
+        </w:rPr>
+        <w:t xml:space="preserve"> Payouts creates payout with net_amount (no S2S call, no amount mutation)</w:t>
+      </w:r>
+    </w:p>
+    <w:p>
+      <w:pPr>
+        <w:pStyle w:val="ListNumber"/>
+        <w:ind w:left="720" w:hanging="360"/>
+        <w:jc w:val="left"/>
+        <w:shd w:val="clear" w:color="auto" w:fill="EFF6FF"/>
+        <w:pBdr>
+          <w:left w:val="single" w:sz="18" w:space="6" w:color="1155cc"/>
+        </w:pBdr>
+        <w:ind w:left="0"/>
+      </w:pPr>
+      <w:r>
+        <w:rPr>
+          <w:rFonts w:ascii="Arial" w:hAnsi="Arial"/>
+          <w:b/>
+          <w:i w:val="0"/>
+          <w:color w:val="000000"/>
+          <w:sz w:val="22"/>
+        </w:rPr>
+        <w:t>TDS Update:</w:t>
+      </w:r>
+      <w:r>
+        <w:rPr>
+          <w:rFonts w:ascii="Arial" w:hAnsi="Arial"/>
+          <w:b w:val="0"/>
+          <w:i w:val="0"/>
+          <w:color w:val="000000"/>
+          <w:sz w:val="22"/>
+        </w:rPr>
+        <w:t xml:space="preserve"> When payout reaches terminal state, Tax-Compliance updates tds_payments entity status via payout status events</w:t>
       </w:r>
     </w:p>
     <w:p>
@@ -7200,11 +8065,13 @@
     </w:tbl>
     <w:p>
       <w:pPr>
+        <w:ind w:left="0" w:firstLine="0"/>
+        <w:jc w:val="left"/>
         <w:shd w:val="clear" w:color="auto" w:fill="FFFBEB"/>
         <w:pBdr>
           <w:left w:val="single" w:sz="18" w:space="6" w:color="1155cc"/>
         </w:pBdr>
-        <w:ind w:left="120"/>
+        <w:ind w:left="0"/>
       </w:pPr>
       <w:r>
         <w:rPr>
@@ -7219,11 +8086,13 @@
     </w:p>
     <w:p>
       <w:pPr>
+        <w:ind w:left="0" w:firstLine="0"/>
+        <w:jc w:val="left"/>
         <w:shd w:val="clear" w:color="auto" w:fill="FFFBEB"/>
         <w:pBdr>
           <w:left w:val="single" w:sz="18" w:space="6" w:color="1155cc"/>
         </w:pBdr>
-        <w:ind w:left="120"/>
+        <w:ind w:left="0"/>
       </w:pPr>
       <w:r>
         <w:rPr>
@@ -7246,9 +8115,6 @@
     <w:p>
       <w:pPr>
         <w:spacing w:before="240" w:after="240"/>
-        <w:pBdr>
-          <w:bottom w:val="single" w:sz="6" w:space="1" w:color="CCCCCC"/>
-        </w:pBdr>
       </w:pPr>
     </w:p>
     <w:p>
@@ -8274,11 +9140,13 @@
     </w:tbl>
     <w:p>
       <w:pPr>
+        <w:ind w:left="0" w:firstLine="0"/>
+        <w:jc w:val="left"/>
         <w:shd w:val="clear" w:color="auto" w:fill="F0FDF4"/>
         <w:pBdr>
           <w:left w:val="single" w:sz="18" w:space="6" w:color="1155cc"/>
         </w:pBdr>
-        <w:ind w:left="120"/>
+        <w:ind w:left="0"/>
       </w:pPr>
       <w:r>
         <w:rPr>
@@ -8293,11 +9161,13 @@
     </w:p>
     <w:p>
       <w:pPr>
+        <w:ind w:left="0" w:firstLine="0"/>
+        <w:jc w:val="left"/>
         <w:shd w:val="clear" w:color="auto" w:fill="F0FDF4"/>
         <w:pBdr>
           <w:left w:val="single" w:sz="18" w:space="6" w:color="1155cc"/>
         </w:pBdr>
-        <w:ind w:left="120"/>
+        <w:ind w:left="0"/>
       </w:pPr>
       <w:r>
         <w:rPr>
@@ -8351,11 +9221,13 @@
     </w:p>
     <w:p>
       <w:pPr>
+        <w:ind w:left="0" w:firstLine="0"/>
+        <w:jc w:val="left"/>
         <w:shd w:val="clear" w:color="auto" w:fill="F0FDF4"/>
         <w:pBdr>
           <w:left w:val="single" w:sz="18" w:space="6" w:color="1155cc"/>
         </w:pBdr>
-        <w:ind w:left="120"/>
+        <w:ind w:left="0"/>
       </w:pPr>
       <w:r>
         <w:rPr>
@@ -8384,11 +9256,13 @@
     </w:p>
     <w:p>
       <w:pPr>
+        <w:ind w:left="0" w:firstLine="0"/>
+        <w:jc w:val="left"/>
         <w:shd w:val="clear" w:color="auto" w:fill="F0FDF4"/>
         <w:pBdr>
           <w:left w:val="single" w:sz="18" w:space="6" w:color="1155cc"/>
         </w:pBdr>
-        <w:ind w:left="120"/>
+        <w:ind w:left="0"/>
       </w:pPr>
       <w:r>
         <w:rPr>
@@ -8426,9 +9300,6 @@
     <w:p>
       <w:pPr>
         <w:spacing w:before="240" w:after="240"/>
-        <w:pBdr>
-          <w:bottom w:val="single" w:sz="6" w:space="1" w:color="CCCCCC"/>
-        </w:pBdr>
       </w:pPr>
     </w:p>
     <w:p>
@@ -8669,11 +9540,13 @@
     </w:p>
     <w:p>
       <w:pPr>
+        <w:ind w:left="0" w:firstLine="0"/>
+        <w:jc w:val="left"/>
         <w:shd w:val="clear" w:color="auto" w:fill="EFF6FF"/>
         <w:pBdr>
           <w:left w:val="single" w:sz="18" w:space="6" w:color="1155cc"/>
         </w:pBdr>
-        <w:ind w:left="120"/>
+        <w:ind w:left="0"/>
       </w:pPr>
       <w:r>
         <w:rPr>
@@ -8684,6 +9557,210 @@
           <w:sz w:val="24"/>
         </w:rPr>
         <w:t>Storage Split</w:t>
+      </w:r>
+    </w:p>
+    <w:p>
+      <w:pPr>
+        <w:pStyle w:val="ListBullet"/>
+        <w:ind w:left="720" w:hanging="360"/>
+        <w:jc w:val="left"/>
+        <w:shd w:val="clear" w:color="auto" w:fill="EFF6FF"/>
+        <w:pBdr>
+          <w:left w:val="single" w:sz="18" w:space="6" w:color="1155cc"/>
+        </w:pBdr>
+        <w:ind w:left="0"/>
+      </w:pPr>
+      <w:r>
+        <w:rPr>
+          <w:rFonts w:ascii="Arial" w:hAnsi="Arial"/>
+          <w:b/>
+          <w:i w:val="0"/>
+          <w:color w:val="000000"/>
+          <w:sz w:val="22"/>
+        </w:rPr>
+        <w:t>Payouts stores:</w:t>
+      </w:r>
+      <w:r>
+        <w:rPr>
+          <w:rFonts w:ascii="Arial" w:hAnsi="Arial"/>
+          <w:b w:val="0"/>
+          <w:i w:val="0"/>
+          <w:color w:val="000000"/>
+          <w:sz w:val="22"/>
+        </w:rPr>
+        <w:t xml:space="preserve"> Primitive fields only — </w:t>
+      </w:r>
+      <w:r>
+        <w:rPr>
+          <w:rFonts w:ascii="Courier New" w:hAnsi="Courier New"/>
+          <w:b w:val="0"/>
+          <w:i w:val="0"/>
+          <w:color w:val="000000"/>
+          <w:sz w:val="22"/>
+        </w:rPr>
+        <w:t>tds_amount</w:t>
+      </w:r>
+      <w:r>
+        <w:rPr>
+          <w:rFonts w:ascii="Arial" w:hAnsi="Arial"/>
+          <w:b w:val="0"/>
+          <w:i w:val="0"/>
+          <w:color w:val="000000"/>
+          <w:sz w:val="22"/>
+        </w:rPr>
+        <w:t xml:space="preserve">, </w:t>
+      </w:r>
+      <w:r>
+        <w:rPr>
+          <w:rFonts w:ascii="Courier New" w:hAnsi="Courier New"/>
+          <w:b w:val="0"/>
+          <w:i w:val="0"/>
+          <w:color w:val="000000"/>
+          <w:sz w:val="22"/>
+        </w:rPr>
+        <w:t>tds_rate</w:t>
+      </w:r>
+      <w:r>
+        <w:rPr>
+          <w:rFonts w:ascii="Arial" w:hAnsi="Arial"/>
+          <w:b w:val="0"/>
+          <w:i w:val="0"/>
+          <w:color w:val="000000"/>
+          <w:sz w:val="22"/>
+        </w:rPr>
+        <w:t xml:space="preserve">, </w:t>
+      </w:r>
+      <w:r>
+        <w:rPr>
+          <w:rFonts w:ascii="Courier New" w:hAnsi="Courier New"/>
+          <w:b w:val="0"/>
+          <w:i w:val="0"/>
+          <w:color w:val="000000"/>
+          <w:sz w:val="22"/>
+        </w:rPr>
+        <w:t>tds_category</w:t>
+      </w:r>
+      <w:r>
+        <w:rPr>
+          <w:rFonts w:ascii="Arial" w:hAnsi="Arial"/>
+          <w:b w:val="0"/>
+          <w:i w:val="0"/>
+          <w:color w:val="000000"/>
+          <w:sz w:val="22"/>
+        </w:rPr>
+        <w:t xml:space="preserve">, </w:t>
+      </w:r>
+      <w:r>
+        <w:rPr>
+          <w:rFonts w:ascii="Courier New" w:hAnsi="Courier New"/>
+          <w:b w:val="0"/>
+          <w:i w:val="0"/>
+          <w:color w:val="000000"/>
+          <w:sz w:val="22"/>
+        </w:rPr>
+        <w:t>payee_pan</w:t>
+      </w:r>
+      <w:r>
+        <w:rPr>
+          <w:rFonts w:ascii="Arial" w:hAnsi="Arial"/>
+          <w:b w:val="0"/>
+          <w:i w:val="0"/>
+          <w:color w:val="000000"/>
+          <w:sz w:val="22"/>
+        </w:rPr>
+        <w:t xml:space="preserve">, </w:t>
+      </w:r>
+      <w:r>
+        <w:rPr>
+          <w:rFonts w:ascii="Courier New" w:hAnsi="Courier New"/>
+          <w:b w:val="0"/>
+          <w:i w:val="0"/>
+          <w:color w:val="000000"/>
+          <w:sz w:val="22"/>
+        </w:rPr>
+        <w:t>source</w:t>
+      </w:r>
+      <w:r>
+        <w:rPr>
+          <w:rFonts w:ascii="Arial" w:hAnsi="Arial"/>
+          <w:b w:val="0"/>
+          <w:i w:val="0"/>
+          <w:color w:val="000000"/>
+          <w:sz w:val="22"/>
+        </w:rPr>
+        <w:t xml:space="preserve"> added to </w:t>
+      </w:r>
+      <w:r>
+        <w:rPr>
+          <w:rFonts w:ascii="Courier New" w:hAnsi="Courier New"/>
+          <w:b w:val="0"/>
+          <w:i w:val="0"/>
+          <w:color w:val="000000"/>
+          <w:sz w:val="22"/>
+        </w:rPr>
+        <w:t>payout_details</w:t>
+      </w:r>
+      <w:r>
+        <w:rPr>
+          <w:rFonts w:ascii="Arial" w:hAnsi="Arial"/>
+          <w:b w:val="0"/>
+          <w:i w:val="0"/>
+          <w:color w:val="000000"/>
+          <w:sz w:val="22"/>
+        </w:rPr>
+        <w:t xml:space="preserve"> JSON. No new entity, no Tax-Compliance call at creation time.</w:t>
+      </w:r>
+    </w:p>
+    <w:p>
+      <w:pPr>
+        <w:pStyle w:val="ListBullet"/>
+        <w:ind w:left="720" w:hanging="360"/>
+        <w:jc w:val="left"/>
+        <w:shd w:val="clear" w:color="auto" w:fill="EFF6FF"/>
+        <w:pBdr>
+          <w:left w:val="single" w:sz="18" w:space="6" w:color="1155cc"/>
+        </w:pBdr>
+        <w:ind w:left="0"/>
+      </w:pPr>
+      <w:r>
+        <w:rPr>
+          <w:rFonts w:ascii="Arial" w:hAnsi="Arial"/>
+          <w:b/>
+          <w:i w:val="0"/>
+          <w:color w:val="000000"/>
+          <w:sz w:val="22"/>
+        </w:rPr>
+        <w:t>Tax-Compliance stores:</w:t>
+      </w:r>
+      <w:r>
+        <w:rPr>
+          <w:rFonts w:ascii="Arial" w:hAnsi="Arial"/>
+          <w:b w:val="0"/>
+          <w:i w:val="0"/>
+          <w:color w:val="000000"/>
+          <w:sz w:val="22"/>
+        </w:rPr>
+        <w:t xml:space="preserve"> Full </w:t>
+      </w:r>
+      <w:r>
+        <w:rPr>
+          <w:rFonts w:ascii="Courier New" w:hAnsi="Courier New"/>
+          <w:b w:val="0"/>
+          <w:i w:val="0"/>
+          <w:color w:val="000000"/>
+          <w:sz w:val="22"/>
+        </w:rPr>
+        <w:t>tds_payments</w:t>
+      </w:r>
+      <w:r>
+        <w:rPr>
+          <w:rFonts w:ascii="Arial" w:hAnsi="Arial"/>
+          <w:b w:val="0"/>
+          <w:i w:val="0"/>
+          <w:color w:val="000000"/>
+          <w:sz w:val="22"/>
+        </w:rPr>
+        <w:t xml:space="preserve"> entity created asynchronously from the Kafka event after payout completion. All audit fields carried in the Kafka message.</w:t>
       </w:r>
     </w:p>
     <w:tbl>
@@ -9438,6 +10515,8 @@
     <w:p>
       <w:pPr>
         <w:spacing w:after="160" w:line="276" w:lineRule="auto"/>
+        <w:ind w:left="0" w:firstLine="0"/>
+        <w:jc w:val="left"/>
       </w:pPr>
       <w:r>
         <w:rPr>
@@ -9472,11 +10551,13 @@
     </w:p>
     <w:p>
       <w:pPr>
+        <w:ind w:left="0" w:firstLine="0"/>
+        <w:jc w:val="left"/>
         <w:shd w:val="clear" w:color="auto" w:fill="EFF6FF"/>
         <w:pBdr>
           <w:left w:val="single" w:sz="18" w:space="6" w:color="1155cc"/>
         </w:pBdr>
-        <w:ind w:left="120"/>
+        <w:ind w:left="0"/>
       </w:pPr>
       <w:r>
         <w:rPr>
@@ -9487,6 +10568,226 @@
           <w:sz w:val="24"/>
         </w:rPr>
         <w:t>Enrichment Flow in Payout Creation Handler</w:t>
+      </w:r>
+    </w:p>
+    <w:p>
+      <w:pPr>
+        <w:pStyle w:val="ListNumber"/>
+        <w:ind w:left="720" w:hanging="360"/>
+        <w:jc w:val="left"/>
+        <w:shd w:val="clear" w:color="auto" w:fill="EFF6FF"/>
+        <w:pBdr>
+          <w:left w:val="single" w:sz="18" w:space="6" w:color="1155cc"/>
+        </w:pBdr>
+        <w:ind w:left="0"/>
+      </w:pPr>
+      <w:r>
+        <w:rPr>
+          <w:rFonts w:ascii="Arial" w:hAnsi="Arial"/>
+          <w:b/>
+          <w:i w:val="0"/>
+          <w:color w:val="000000"/>
+          <w:sz w:val="22"/>
+        </w:rPr>
+        <w:t>Check for TDS fields:</w:t>
+      </w:r>
+      <w:r>
+        <w:rPr>
+          <w:rFonts w:ascii="Arial" w:hAnsi="Arial"/>
+          <w:b w:val="0"/>
+          <w:i w:val="0"/>
+          <w:color w:val="000000"/>
+          <w:sz w:val="22"/>
+        </w:rPr>
+        <w:t xml:space="preserve"> If request contains </w:t>
+      </w:r>
+      <w:r>
+        <w:rPr>
+          <w:rFonts w:ascii="Courier New" w:hAnsi="Courier New"/>
+          <w:b w:val="0"/>
+          <w:i w:val="0"/>
+          <w:color w:val="000000"/>
+          <w:sz w:val="22"/>
+        </w:rPr>
+        <w:t>tds_category_id</w:t>
+      </w:r>
+      <w:r>
+        <w:rPr>
+          <w:rFonts w:ascii="Arial" w:hAnsi="Arial"/>
+          <w:b w:val="0"/>
+          <w:i w:val="0"/>
+          <w:color w:val="000000"/>
+          <w:sz w:val="22"/>
+        </w:rPr>
+        <w:t xml:space="preserve"> and </w:t>
+      </w:r>
+      <w:r>
+        <w:rPr>
+          <w:rFonts w:ascii="Courier New" w:hAnsi="Courier New"/>
+          <w:b w:val="0"/>
+          <w:i w:val="0"/>
+          <w:color w:val="000000"/>
+          <w:sz w:val="22"/>
+        </w:rPr>
+        <w:t>amount</w:t>
+      </w:r>
+      <w:r>
+        <w:rPr>
+          <w:rFonts w:ascii="Arial" w:hAnsi="Arial"/>
+          <w:b w:val="0"/>
+          <w:i w:val="0"/>
+          <w:color w:val="000000"/>
+          <w:sz w:val="22"/>
+        </w:rPr>
+        <w:t>, trigger enrichment</w:t>
+      </w:r>
+    </w:p>
+    <w:p>
+      <w:pPr>
+        <w:pStyle w:val="ListNumber"/>
+        <w:ind w:left="720" w:hanging="360"/>
+        <w:jc w:val="left"/>
+        <w:shd w:val="clear" w:color="auto" w:fill="EFF6FF"/>
+        <w:pBdr>
+          <w:left w:val="single" w:sz="18" w:space="6" w:color="1155cc"/>
+        </w:pBdr>
+        <w:ind w:left="0"/>
+      </w:pPr>
+      <w:r>
+        <w:rPr>
+          <w:rFonts w:ascii="Arial" w:hAnsi="Arial"/>
+          <w:b/>
+          <w:i w:val="0"/>
+          <w:color w:val="000000"/>
+          <w:sz w:val="22"/>
+        </w:rPr>
+        <w:t>Call Tax-Compliance:</w:t>
+      </w:r>
+      <w:r>
+        <w:rPr>
+          <w:rFonts w:ascii="Arial" w:hAnsi="Arial"/>
+          <w:b w:val="0"/>
+          <w:i w:val="0"/>
+          <w:color w:val="000000"/>
+          <w:sz w:val="22"/>
+        </w:rPr>
+        <w:t xml:space="preserve"> Sync HTTP call to </w:t>
+      </w:r>
+      <w:r>
+        <w:rPr>
+          <w:rFonts w:ascii="Courier New" w:hAnsi="Courier New"/>
+          <w:b w:val="0"/>
+          <w:i w:val="0"/>
+          <w:color w:val="000000"/>
+          <w:sz w:val="22"/>
+        </w:rPr>
+        <w:t>/internal/tds/enrich</w:t>
+      </w:r>
+      <w:r>
+        <w:rPr>
+          <w:rFonts w:ascii="Arial" w:hAnsi="Arial"/>
+          <w:b w:val="0"/>
+          <w:i w:val="0"/>
+          <w:color w:val="000000"/>
+          <w:sz w:val="22"/>
+        </w:rPr>
+        <w:t xml:space="preserve"> with contact_id, gross_amount, category_id, apply_ldc</w:t>
+      </w:r>
+    </w:p>
+    <w:p>
+      <w:pPr>
+        <w:pStyle w:val="ListNumber"/>
+        <w:ind w:left="720" w:hanging="360"/>
+        <w:jc w:val="left"/>
+        <w:shd w:val="clear" w:color="auto" w:fill="EFF6FF"/>
+        <w:pBdr>
+          <w:left w:val="single" w:sz="18" w:space="6" w:color="1155cc"/>
+        </w:pBdr>
+        <w:ind w:left="0"/>
+      </w:pPr>
+      <w:r>
+        <w:rPr>
+          <w:rFonts w:ascii="Arial" w:hAnsi="Arial"/>
+          <w:b/>
+          <w:i w:val="0"/>
+          <w:color w:val="000000"/>
+          <w:sz w:val="22"/>
+        </w:rPr>
+        <w:t>Receive enriched data:</w:t>
+      </w:r>
+      <w:r>
+        <w:rPr>
+          <w:rFonts w:ascii="Arial" w:hAnsi="Arial"/>
+          <w:b w:val="0"/>
+          <w:i w:val="0"/>
+          <w:color w:val="000000"/>
+          <w:sz w:val="22"/>
+        </w:rPr>
+        <w:t xml:space="preserve"> Tax-Compliance returns {net_amount, tds_amount, rate, tds_payment_id}</w:t>
+      </w:r>
+    </w:p>
+    <w:p>
+      <w:pPr>
+        <w:pStyle w:val="ListNumber"/>
+        <w:ind w:left="720" w:hanging="360"/>
+        <w:jc w:val="left"/>
+        <w:shd w:val="clear" w:color="auto" w:fill="EFF6FF"/>
+        <w:pBdr>
+          <w:left w:val="single" w:sz="18" w:space="6" w:color="1155cc"/>
+        </w:pBdr>
+        <w:ind w:left="0"/>
+      </w:pPr>
+      <w:r>
+        <w:rPr>
+          <w:rFonts w:ascii="Arial" w:hAnsi="Arial"/>
+          <w:b/>
+          <w:i w:val="0"/>
+          <w:color w:val="000000"/>
+          <w:sz w:val="22"/>
+        </w:rPr>
+        <w:t>Create payout:</w:t>
+      </w:r>
+      <w:r>
+        <w:rPr>
+          <w:rFonts w:ascii="Arial" w:hAnsi="Arial"/>
+          <w:b w:val="0"/>
+          <w:i w:val="0"/>
+          <w:color w:val="000000"/>
+          <w:sz w:val="22"/>
+        </w:rPr>
+        <w:t xml:space="preserve"> Use enriched net_amount as the payout amount; store TDS metadata</w:t>
+      </w:r>
+    </w:p>
+    <w:p>
+      <w:pPr>
+        <w:pStyle w:val="ListNumber"/>
+        <w:ind w:left="720" w:hanging="360"/>
+        <w:jc w:val="left"/>
+        <w:shd w:val="clear" w:color="auto" w:fill="EFF6FF"/>
+        <w:pBdr>
+          <w:left w:val="single" w:sz="18" w:space="6" w:color="1155cc"/>
+        </w:pBdr>
+        <w:ind w:left="0"/>
+      </w:pPr>
+      <w:r>
+        <w:rPr>
+          <w:rFonts w:ascii="Arial" w:hAnsi="Arial"/>
+          <w:b/>
+          <w:i w:val="0"/>
+          <w:color w:val="000000"/>
+          <w:sz w:val="22"/>
+        </w:rPr>
+        <w:t>Emit events:</w:t>
+      </w:r>
+      <w:r>
+        <w:rPr>
+          <w:rFonts w:ascii="Arial" w:hAnsi="Arial"/>
+          <w:b w:val="0"/>
+          <w:i w:val="0"/>
+          <w:color w:val="000000"/>
+          <w:sz w:val="22"/>
+        </w:rPr>
+        <w:t xml:space="preserve"> Standard payout status events (Tax-Compliance listens and updates tds_payments entity)</w:t>
       </w:r>
     </w:p>
     <w:tbl>
@@ -9898,11 +11199,13 @@
     </w:tbl>
     <w:p>
       <w:pPr>
+        <w:ind w:left="0" w:firstLine="0"/>
+        <w:jc w:val="left"/>
         <w:shd w:val="clear" w:color="auto" w:fill="EFF6FF"/>
         <w:pBdr>
           <w:left w:val="single" w:sz="18" w:space="6" w:color="1155cc"/>
         </w:pBdr>
-        <w:ind w:left="120"/>
+        <w:ind w:left="0"/>
       </w:pPr>
       <w:r>
         <w:rPr>
@@ -9917,11 +11220,181 @@
     </w:p>
     <w:p>
       <w:pPr>
+        <w:pStyle w:val="ListBullet"/>
+        <w:ind w:left="720" w:hanging="360"/>
+        <w:jc w:val="left"/>
+        <w:shd w:val="clear" w:color="auto" w:fill="EFF6FF"/>
+        <w:pBdr>
+          <w:left w:val="single" w:sz="18" w:space="6" w:color="1155cc"/>
+        </w:pBdr>
+        <w:ind w:left="0"/>
+      </w:pPr>
+      <w:r>
+        <w:rPr>
+          <w:rFonts w:ascii="Arial" w:hAnsi="Arial"/>
+          <w:b w:val="0"/>
+          <w:i w:val="0"/>
+          <w:color w:val="000000"/>
+          <w:sz w:val="22"/>
+        </w:rPr>
+        <w:t xml:space="preserve">Payouts </w:t>
+      </w:r>
+      <w:r>
+        <w:rPr>
+          <w:rFonts w:ascii="Arial" w:hAnsi="Arial"/>
+          <w:b/>
+          <w:i w:val="0"/>
+          <w:color w:val="000000"/>
+          <w:sz w:val="22"/>
+        </w:rPr>
+        <w:t>calls Tax-Compliance /internal/tds/enrich</w:t>
+      </w:r>
+      <w:r>
+        <w:rPr>
+          <w:rFonts w:ascii="Arial" w:hAnsi="Arial"/>
+          <w:b w:val="0"/>
+          <w:i w:val="0"/>
+          <w:color w:val="000000"/>
+          <w:sz w:val="22"/>
+        </w:rPr>
+        <w:t xml:space="preserve"> synchronously (~50-100ms) if TDS fields present</w:t>
+      </w:r>
+    </w:p>
+    <w:p>
+      <w:pPr>
+        <w:pStyle w:val="ListBullet"/>
+        <w:ind w:left="720" w:hanging="360"/>
+        <w:jc w:val="left"/>
+        <w:shd w:val="clear" w:color="auto" w:fill="EFF6FF"/>
+        <w:pBdr>
+          <w:left w:val="single" w:sz="18" w:space="6" w:color="1155cc"/>
+        </w:pBdr>
+        <w:ind w:left="0"/>
+      </w:pPr>
+      <w:r>
+        <w:rPr>
+          <w:rFonts w:ascii="Arial" w:hAnsi="Arial"/>
+          <w:b w:val="0"/>
+          <w:i w:val="0"/>
+          <w:color w:val="000000"/>
+          <w:sz w:val="22"/>
+        </w:rPr>
+        <w:t xml:space="preserve">Payouts </w:t>
+      </w:r>
+      <w:r>
+        <w:rPr>
+          <w:rFonts w:ascii="Arial" w:hAnsi="Arial"/>
+          <w:b/>
+          <w:i w:val="0"/>
+          <w:color w:val="000000"/>
+          <w:sz w:val="22"/>
+        </w:rPr>
+        <w:t>uses enriched net_amount</w:t>
+      </w:r>
+      <w:r>
+        <w:rPr>
+          <w:rFonts w:ascii="Arial" w:hAnsi="Arial"/>
+          <w:b w:val="0"/>
+          <w:i w:val="0"/>
+          <w:color w:val="000000"/>
+          <w:sz w:val="22"/>
+        </w:rPr>
+        <w:t xml:space="preserve"> from Tax-Compliance for payout creation</w:t>
+      </w:r>
+    </w:p>
+    <w:p>
+      <w:pPr>
+        <w:pStyle w:val="ListBullet"/>
+        <w:ind w:left="720" w:hanging="360"/>
+        <w:jc w:val="left"/>
+        <w:shd w:val="clear" w:color="auto" w:fill="EFF6FF"/>
+        <w:pBdr>
+          <w:left w:val="single" w:sz="18" w:space="6" w:color="1155cc"/>
+        </w:pBdr>
+        <w:ind w:left="0"/>
+      </w:pPr>
+      <w:r>
+        <w:rPr>
+          <w:rFonts w:ascii="Arial" w:hAnsi="Arial"/>
+          <w:b w:val="0"/>
+          <w:i w:val="0"/>
+          <w:color w:val="000000"/>
+          <w:sz w:val="22"/>
+        </w:rPr>
+        <w:t xml:space="preserve">Payouts </w:t>
+      </w:r>
+      <w:r>
+        <w:rPr>
+          <w:rFonts w:ascii="Arial" w:hAnsi="Arial"/>
+          <w:b/>
+          <w:i w:val="0"/>
+          <w:color w:val="000000"/>
+          <w:sz w:val="22"/>
+        </w:rPr>
+        <w:t>stores TDS metadata</w:t>
+      </w:r>
+      <w:r>
+        <w:rPr>
+          <w:rFonts w:ascii="Arial" w:hAnsi="Arial"/>
+          <w:b w:val="0"/>
+          <w:i w:val="0"/>
+          <w:color w:val="000000"/>
+          <w:sz w:val="22"/>
+        </w:rPr>
+        <w:t xml:space="preserve"> (tds_payment_id, tds_amount, rate) in payout_details</w:t>
+      </w:r>
+    </w:p>
+    <w:p>
+      <w:pPr>
+        <w:pStyle w:val="ListBullet"/>
+        <w:ind w:left="720" w:hanging="360"/>
+        <w:jc w:val="left"/>
+        <w:shd w:val="clear" w:color="auto" w:fill="EFF6FF"/>
+        <w:pBdr>
+          <w:left w:val="single" w:sz="18" w:space="6" w:color="1155cc"/>
+        </w:pBdr>
+        <w:ind w:left="0"/>
+      </w:pPr>
+      <w:r>
+        <w:rPr>
+          <w:rFonts w:ascii="Arial" w:hAnsi="Arial"/>
+          <w:b w:val="0"/>
+          <w:i w:val="0"/>
+          <w:color w:val="000000"/>
+          <w:sz w:val="22"/>
+        </w:rPr>
+        <w:t xml:space="preserve">Payouts </w:t>
+      </w:r>
+      <w:r>
+        <w:rPr>
+          <w:rFonts w:ascii="Arial" w:hAnsi="Arial"/>
+          <w:b/>
+          <w:i w:val="0"/>
+          <w:color w:val="000000"/>
+          <w:sz w:val="22"/>
+        </w:rPr>
+        <w:t>emits standard status events</w:t>
+      </w:r>
+      <w:r>
+        <w:rPr>
+          <w:rFonts w:ascii="Arial" w:hAnsi="Arial"/>
+          <w:b w:val="0"/>
+          <w:i w:val="0"/>
+          <w:color w:val="000000"/>
+          <w:sz w:val="22"/>
+        </w:rPr>
+        <w:t xml:space="preserve"> that Tax-Compliance consumes to update tds_payments entity</w:t>
+      </w:r>
+    </w:p>
+    <w:p>
+      <w:pPr>
+        <w:ind w:left="0" w:firstLine="0"/>
+        <w:jc w:val="left"/>
         <w:shd w:val="clear" w:color="auto" w:fill="FFFBEB"/>
         <w:pBdr>
           <w:left w:val="single" w:sz="18" w:space="6" w:color="1155cc"/>
         </w:pBdr>
-        <w:ind w:left="120"/>
+        <w:ind w:left="0"/>
       </w:pPr>
       <w:r>
         <w:rPr>
@@ -9932,6 +11405,174 @@
           <w:sz w:val="24"/>
         </w:rPr>
         <w:t>What Payouts Does NOT Do</w:t>
+      </w:r>
+    </w:p>
+    <w:p>
+      <w:pPr>
+        <w:pStyle w:val="ListBullet"/>
+        <w:ind w:left="720" w:hanging="360"/>
+        <w:jc w:val="left"/>
+        <w:shd w:val="clear" w:color="auto" w:fill="FFFBEB"/>
+        <w:pBdr>
+          <w:left w:val="single" w:sz="18" w:space="6" w:color="1155cc"/>
+        </w:pBdr>
+        <w:ind w:left="0"/>
+      </w:pPr>
+      <w:r>
+        <w:rPr>
+          <w:rFonts w:ascii="Arial" w:hAnsi="Arial"/>
+          <w:b w:val="0"/>
+          <w:i w:val="0"/>
+          <w:color w:val="000000"/>
+          <w:sz w:val="22"/>
+        </w:rPr>
+        <w:t xml:space="preserve">Payouts does </w:t>
+      </w:r>
+      <w:r>
+        <w:rPr>
+          <w:rFonts w:ascii="Arial" w:hAnsi="Arial"/>
+          <w:b/>
+          <w:i w:val="0"/>
+          <w:color w:val="000000"/>
+          <w:sz w:val="22"/>
+        </w:rPr>
+        <w:t>not</w:t>
+      </w:r>
+      <w:r>
+        <w:rPr>
+          <w:rFonts w:ascii="Arial" w:hAnsi="Arial"/>
+          <w:b w:val="0"/>
+          <w:i w:val="0"/>
+          <w:color w:val="000000"/>
+          <w:sz w:val="22"/>
+        </w:rPr>
+        <w:t xml:space="preserve"> compute TDS — Tax-Compliance handles all computation logic</w:t>
+      </w:r>
+    </w:p>
+    <w:p>
+      <w:pPr>
+        <w:pStyle w:val="ListBullet"/>
+        <w:ind w:left="720" w:hanging="360"/>
+        <w:jc w:val="left"/>
+        <w:shd w:val="clear" w:color="auto" w:fill="FFFBEB"/>
+        <w:pBdr>
+          <w:left w:val="single" w:sz="18" w:space="6" w:color="1155cc"/>
+        </w:pBdr>
+        <w:ind w:left="0"/>
+      </w:pPr>
+      <w:r>
+        <w:rPr>
+          <w:rFonts w:ascii="Arial" w:hAnsi="Arial"/>
+          <w:b w:val="0"/>
+          <w:i w:val="0"/>
+          <w:color w:val="000000"/>
+          <w:sz w:val="22"/>
+        </w:rPr>
+        <w:t xml:space="preserve">Payouts does </w:t>
+      </w:r>
+      <w:r>
+        <w:rPr>
+          <w:rFonts w:ascii="Arial" w:hAnsi="Arial"/>
+          <w:b/>
+          <w:i w:val="0"/>
+          <w:color w:val="000000"/>
+          <w:sz w:val="22"/>
+        </w:rPr>
+        <w:t>not</w:t>
+      </w:r>
+      <w:r>
+        <w:rPr>
+          <w:rFonts w:ascii="Arial" w:hAnsi="Arial"/>
+          <w:b w:val="0"/>
+          <w:i w:val="0"/>
+          <w:color w:val="000000"/>
+          <w:sz w:val="22"/>
+        </w:rPr>
+        <w:t xml:space="preserve"> validate TDS category rules — Tax-Compliance validates and returns errors if invalid</w:t>
+      </w:r>
+    </w:p>
+    <w:p>
+      <w:pPr>
+        <w:pStyle w:val="ListBullet"/>
+        <w:ind w:left="720" w:hanging="360"/>
+        <w:jc w:val="left"/>
+        <w:shd w:val="clear" w:color="auto" w:fill="FFFBEB"/>
+        <w:pBdr>
+          <w:left w:val="single" w:sz="18" w:space="6" w:color="1155cc"/>
+        </w:pBdr>
+        <w:ind w:left="0"/>
+      </w:pPr>
+      <w:r>
+        <w:rPr>
+          <w:rFonts w:ascii="Arial" w:hAnsi="Arial"/>
+          <w:b w:val="0"/>
+          <w:i w:val="0"/>
+          <w:color w:val="000000"/>
+          <w:sz w:val="22"/>
+        </w:rPr>
+        <w:t xml:space="preserve">Payouts does </w:t>
+      </w:r>
+      <w:r>
+        <w:rPr>
+          <w:rFonts w:ascii="Arial" w:hAnsi="Arial"/>
+          <w:b/>
+          <w:i w:val="0"/>
+          <w:color w:val="000000"/>
+          <w:sz w:val="22"/>
+        </w:rPr>
+        <w:t>not</w:t>
+      </w:r>
+      <w:r>
+        <w:rPr>
+          <w:rFonts w:ascii="Arial" w:hAnsi="Arial"/>
+          <w:b w:val="0"/>
+          <w:i w:val="0"/>
+          <w:color w:val="000000"/>
+          <w:sz w:val="22"/>
+        </w:rPr>
+        <w:t xml:space="preserve"> create tds_payments entity — Tax-Compliance creates it during enrichment call</w:t>
+      </w:r>
+    </w:p>
+    <w:p>
+      <w:pPr>
+        <w:pStyle w:val="ListBullet"/>
+        <w:ind w:left="720" w:hanging="360"/>
+        <w:jc w:val="left"/>
+        <w:shd w:val="clear" w:color="auto" w:fill="FFFBEB"/>
+        <w:pBdr>
+          <w:left w:val="single" w:sz="18" w:space="6" w:color="1155cc"/>
+        </w:pBdr>
+        <w:ind w:left="0"/>
+      </w:pPr>
+      <w:r>
+        <w:rPr>
+          <w:rFonts w:ascii="Arial" w:hAnsi="Arial"/>
+          <w:b w:val="0"/>
+          <w:i w:val="0"/>
+          <w:color w:val="000000"/>
+          <w:sz w:val="22"/>
+        </w:rPr>
+        <w:t xml:space="preserve">Payouts does </w:t>
+      </w:r>
+      <w:r>
+        <w:rPr>
+          <w:rFonts w:ascii="Arial" w:hAnsi="Arial"/>
+          <w:b/>
+          <w:i w:val="0"/>
+          <w:color w:val="000000"/>
+          <w:sz w:val="22"/>
+        </w:rPr>
+        <w:t>not</w:t>
+      </w:r>
+      <w:r>
+        <w:rPr>
+          <w:rFonts w:ascii="Arial" w:hAnsi="Arial"/>
+          <w:b w:val="0"/>
+          <w:i w:val="0"/>
+          <w:color w:val="000000"/>
+          <w:sz w:val="22"/>
+        </w:rPr>
+        <w:t xml:space="preserve"> have domain knowledge of TDS — zero domain leak; Payouts is a thin orchestrator</w:t>
       </w:r>
     </w:p>
     <w:p>
@@ -9953,11 +11594,13 @@
     </w:p>
     <w:p>
       <w:pPr>
+        <w:ind w:left="0" w:firstLine="0"/>
+        <w:jc w:val="left"/>
         <w:shd w:val="clear" w:color="auto" w:fill="F0FDF4"/>
         <w:pBdr>
           <w:left w:val="single" w:sz="18" w:space="6" w:color="1155cc"/>
         </w:pBdr>
-        <w:ind w:left="120"/>
+        <w:ind w:left="0"/>
       </w:pPr>
       <w:r>
         <w:rPr>
@@ -9972,11 +11615,13 @@
     </w:p>
     <w:p>
       <w:pPr>
+        <w:ind w:left="0" w:firstLine="0"/>
+        <w:jc w:val="left"/>
         <w:shd w:val="clear" w:color="auto" w:fill="F0FDF4"/>
         <w:pBdr>
           <w:left w:val="single" w:sz="18" w:space="6" w:color="1155cc"/>
         </w:pBdr>
-        <w:ind w:left="120"/>
+        <w:ind w:left="0"/>
       </w:pPr>
       <w:r>
         <w:rPr>
@@ -9991,11 +11636,13 @@
     </w:p>
     <w:p>
       <w:pPr>
+        <w:ind w:left="0" w:firstLine="0"/>
+        <w:jc w:val="left"/>
         <w:shd w:val="clear" w:color="auto" w:fill="F0FDF4"/>
         <w:pBdr>
           <w:left w:val="single" w:sz="18" w:space="6" w:color="1155cc"/>
         </w:pBdr>
-        <w:ind w:left="120"/>
+        <w:ind w:left="0"/>
       </w:pPr>
       <w:r>
         <w:rPr>
@@ -10006,6 +11653,294 @@
           <w:sz w:val="24"/>
         </w:rPr>
         <w:t>Key Reasons:</w:t>
+      </w:r>
+    </w:p>
+    <w:p>
+      <w:pPr>
+        <w:pStyle w:val="ListBullet"/>
+        <w:ind w:left="720" w:hanging="360"/>
+        <w:jc w:val="left"/>
+        <w:shd w:val="clear" w:color="auto" w:fill="F0FDF4"/>
+        <w:pBdr>
+          <w:left w:val="single" w:sz="18" w:space="6" w:color="1155cc"/>
+        </w:pBdr>
+        <w:ind w:left="0"/>
+      </w:pPr>
+      <w:r>
+        <w:rPr>
+          <w:rFonts w:ascii="Arial" w:hAnsi="Arial"/>
+          <w:b/>
+          <w:i w:val="0"/>
+          <w:color w:val="000000"/>
+          <w:sz w:val="22"/>
+        </w:rPr>
+        <w:t>One-stop solution:</w:t>
+      </w:r>
+      <w:r>
+        <w:rPr>
+          <w:rFonts w:ascii="Arial" w:hAnsi="Arial"/>
+          <w:b w:val="0"/>
+          <w:i w:val="0"/>
+          <w:color w:val="000000"/>
+          <w:sz w:val="22"/>
+        </w:rPr>
+        <w:t xml:space="preserve"> Merchants make single API call to Payouts; enrichment happens internally</w:t>
+      </w:r>
+    </w:p>
+    <w:p>
+      <w:pPr>
+        <w:pStyle w:val="ListBullet"/>
+        <w:ind w:left="720" w:hanging="360"/>
+        <w:jc w:val="left"/>
+        <w:shd w:val="clear" w:color="auto" w:fill="F0FDF4"/>
+        <w:pBdr>
+          <w:left w:val="single" w:sz="18" w:space="6" w:color="1155cc"/>
+        </w:pBdr>
+        <w:ind w:left="0"/>
+      </w:pPr>
+      <w:r>
+        <w:rPr>
+          <w:rFonts w:ascii="Arial" w:hAnsi="Arial"/>
+          <w:b/>
+          <w:i w:val="0"/>
+          <w:color w:val="000000"/>
+          <w:sz w:val="22"/>
+        </w:rPr>
+        <w:t>Minimal Payouts changes:</w:t>
+      </w:r>
+      <w:r>
+        <w:rPr>
+          <w:rFonts w:ascii="Arial" w:hAnsi="Arial"/>
+          <w:b w:val="0"/>
+          <w:i w:val="0"/>
+          <w:color w:val="000000"/>
+          <w:sz w:val="22"/>
+        </w:rPr>
+        <w:t xml:space="preserve"> ~20 LOC enrichment hook; feature-flagged; isolated code path</w:t>
+      </w:r>
+    </w:p>
+    <w:p>
+      <w:pPr>
+        <w:pStyle w:val="ListBullet"/>
+        <w:ind w:left="720" w:hanging="360"/>
+        <w:jc w:val="left"/>
+        <w:shd w:val="clear" w:color="auto" w:fill="F0FDF4"/>
+        <w:pBdr>
+          <w:left w:val="single" w:sz="18" w:space="6" w:color="1155cc"/>
+        </w:pBdr>
+        <w:ind w:left="0"/>
+      </w:pPr>
+      <w:r>
+        <w:rPr>
+          <w:rFonts w:ascii="Arial" w:hAnsi="Arial"/>
+          <w:b/>
+          <w:i w:val="0"/>
+          <w:color w:val="000000"/>
+          <w:sz w:val="22"/>
+        </w:rPr>
+        <w:t>Clean domain separation:</w:t>
+      </w:r>
+      <w:r>
+        <w:rPr>
+          <w:rFonts w:ascii="Arial" w:hAnsi="Arial"/>
+          <w:b w:val="0"/>
+          <w:i w:val="0"/>
+          <w:color w:val="000000"/>
+          <w:sz w:val="22"/>
+        </w:rPr>
+        <w:t xml:space="preserve"> Payouts doesn't own TDS logic; just calls enrichment service</w:t>
+      </w:r>
+    </w:p>
+    <w:p>
+      <w:pPr>
+        <w:pStyle w:val="ListBullet"/>
+        <w:ind w:left="720" w:hanging="360"/>
+        <w:jc w:val="left"/>
+        <w:shd w:val="clear" w:color="auto" w:fill="F0FDF4"/>
+        <w:pBdr>
+          <w:left w:val="single" w:sz="18" w:space="6" w:color="1155cc"/>
+        </w:pBdr>
+        <w:ind w:left="0"/>
+      </w:pPr>
+      <w:r>
+        <w:rPr>
+          <w:rFonts w:ascii="Arial" w:hAnsi="Arial"/>
+          <w:b/>
+          <w:i w:val="0"/>
+          <w:color w:val="000000"/>
+          <w:sz w:val="22"/>
+        </w:rPr>
+        <w:t>Works for all payout types:</w:t>
+      </w:r>
+      <w:r>
+        <w:rPr>
+          <w:rFonts w:ascii="Arial" w:hAnsi="Arial"/>
+          <w:b w:val="0"/>
+          <w:i w:val="0"/>
+          <w:color w:val="000000"/>
+          <w:sz w:val="22"/>
+        </w:rPr>
+        <w:t xml:space="preserve"> Dashboard, Bulk, API - unified approach</w:t>
+      </w:r>
+    </w:p>
+    <w:p>
+      <w:pPr>
+        <w:pStyle w:val="ListBullet"/>
+        <w:ind w:left="720" w:hanging="360"/>
+        <w:jc w:val="left"/>
+        <w:shd w:val="clear" w:color="auto" w:fill="F0FDF4"/>
+        <w:pBdr>
+          <w:left w:val="single" w:sz="18" w:space="6" w:color="1155cc"/>
+        </w:pBdr>
+        <w:ind w:left="0"/>
+      </w:pPr>
+      <w:r>
+        <w:rPr>
+          <w:rFonts w:ascii="Arial" w:hAnsi="Arial"/>
+          <w:b/>
+          <w:i w:val="0"/>
+          <w:color w:val="000000"/>
+          <w:sz w:val="22"/>
+        </w:rPr>
+        <w:t>TDS entity available immediately:</w:t>
+      </w:r>
+      <w:r>
+        <w:rPr>
+          <w:rFonts w:ascii="Arial" w:hAnsi="Arial"/>
+          <w:b w:val="0"/>
+          <w:i w:val="0"/>
+          <w:color w:val="000000"/>
+          <w:sz w:val="22"/>
+        </w:rPr>
+        <w:t xml:space="preserve"> Created synchronously during enrichment; returned in response</w:t>
+      </w:r>
+    </w:p>
+    <w:p>
+      <w:pPr>
+        <w:pStyle w:val="ListBullet"/>
+        <w:ind w:left="720" w:hanging="360"/>
+        <w:jc w:val="left"/>
+        <w:shd w:val="clear" w:color="auto" w:fill="F0FDF4"/>
+        <w:pBdr>
+          <w:left w:val="single" w:sz="18" w:space="6" w:color="1155cc"/>
+        </w:pBdr>
+        <w:ind w:left="0"/>
+      </w:pPr>
+      <w:r>
+        <w:rPr>
+          <w:rFonts w:ascii="Arial" w:hAnsi="Arial"/>
+          <w:b/>
+          <w:i w:val="0"/>
+          <w:color w:val="000000"/>
+          <w:sz w:val="22"/>
+        </w:rPr>
+        <w:t>Clean failure handling:</w:t>
+      </w:r>
+      <w:r>
+        <w:rPr>
+          <w:rFonts w:ascii="Arial" w:hAnsi="Arial"/>
+          <w:b w:val="0"/>
+          <w:i w:val="0"/>
+          <w:color w:val="000000"/>
+          <w:sz w:val="22"/>
+        </w:rPr>
+        <w:t xml:space="preserve"> Fail fast if enrichment fails; no partial state</w:t>
+      </w:r>
+    </w:p>
+    <w:p>
+      <w:pPr>
+        <w:pStyle w:val="ListBullet"/>
+        <w:ind w:left="720" w:hanging="360"/>
+        <w:jc w:val="left"/>
+        <w:shd w:val="clear" w:color="auto" w:fill="F0FDF4"/>
+        <w:pBdr>
+          <w:left w:val="single" w:sz="18" w:space="6" w:color="1155cc"/>
+        </w:pBdr>
+        <w:ind w:left="0"/>
+      </w:pPr>
+      <w:r>
+        <w:rPr>
+          <w:rFonts w:ascii="Arial" w:hAnsi="Arial"/>
+          <w:b/>
+          <w:i w:val="0"/>
+          <w:color w:val="000000"/>
+          <w:sz w:val="22"/>
+        </w:rPr>
+        <w:t>Low risk:</w:t>
+      </w:r>
+      <w:r>
+        <w:rPr>
+          <w:rFonts w:ascii="Arial" w:hAnsi="Arial"/>
+          <w:b w:val="0"/>
+          <w:i w:val="0"/>
+          <w:color w:val="000000"/>
+          <w:sz w:val="22"/>
+        </w:rPr>
+        <w:t xml:space="preserve"> Feature-flagged; zero impact on non-TDS payouts; can be rolled out gradually</w:t>
+      </w:r>
+    </w:p>
+    <w:p>
+      <w:pPr>
+        <w:pStyle w:val="ListBullet"/>
+        <w:ind w:left="720" w:hanging="360"/>
+        <w:jc w:val="left"/>
+        <w:shd w:val="clear" w:color="auto" w:fill="F0FDF4"/>
+        <w:pBdr>
+          <w:left w:val="single" w:sz="18" w:space="6" w:color="1155cc"/>
+        </w:pBdr>
+        <w:ind w:left="0"/>
+      </w:pPr>
+      <w:r>
+        <w:rPr>
+          <w:rFonts w:ascii="Arial" w:hAnsi="Arial"/>
+          <w:b/>
+          <w:i w:val="0"/>
+          <w:color w:val="000000"/>
+          <w:sz w:val="22"/>
+        </w:rPr>
+        <w:t>Scalable:</w:t>
+      </w:r>
+      <w:r>
+        <w:rPr>
+          <w:rFonts w:ascii="Arial" w:hAnsi="Arial"/>
+          <w:b w:val="0"/>
+          <w:i w:val="0"/>
+          <w:color w:val="000000"/>
+          <w:sz w:val="22"/>
+        </w:rPr>
+        <w:t xml:space="preserve"> Tax-Compliance enrichment is lightweight and can be horizontally scaled</w:t>
+      </w:r>
+    </w:p>
+    <w:p>
+      <w:pPr>
+        <w:pStyle w:val="ListBullet"/>
+        <w:ind w:left="720" w:hanging="360"/>
+        <w:jc w:val="left"/>
+        <w:shd w:val="clear" w:color="auto" w:fill="F0FDF4"/>
+        <w:pBdr>
+          <w:left w:val="single" w:sz="18" w:space="6" w:color="1155cc"/>
+        </w:pBdr>
+        <w:ind w:left="0"/>
+      </w:pPr>
+      <w:r>
+        <w:rPr>
+          <w:rFonts w:ascii="Arial" w:hAnsi="Arial"/>
+          <w:b/>
+          <w:i w:val="0"/>
+          <w:color w:val="000000"/>
+          <w:sz w:val="22"/>
+        </w:rPr>
+        <w:t>Backward compatible:</w:t>
+      </w:r>
+      <w:r>
+        <w:rPr>
+          <w:rFonts w:ascii="Arial" w:hAnsi="Arial"/>
+          <w:b w:val="0"/>
+          <w:i w:val="0"/>
+          <w:color w:val="000000"/>
+          <w:sz w:val="22"/>
+        </w:rPr>
+        <w:t xml:space="preserve"> All TDS fields are optional; no API version change needed</w:t>
       </w:r>
     </w:p>
     <w:p>
@@ -10551,30 +12486,12 @@
     <w:p>
       <w:pPr>
         <w:spacing w:before="240" w:after="240"/>
-        <w:pBdr>
-          <w:bottom w:val="single" w:sz="6" w:space="1" w:color="CCCCCC"/>
-        </w:pBdr>
       </w:pPr>
     </w:p>
     <w:p>
       <w:pPr>
         <w:spacing w:before="240" w:after="240"/>
-        <w:pBdr>
-          <w:bottom w:val="single" w:sz="6" w:space="1" w:color="CCCCCC"/>
-        </w:pBdr>
-      </w:pPr>
-    </w:p>
-    <w:p>
-      <w:r>
-        <w:rPr>
-          <w:rFonts w:ascii="Arial" w:hAnsi="Arial"/>
-          <w:b w:val="0"/>
-          <w:i w:val="0"/>
-          <w:color w:val="000000"/>
-          <w:sz w:val="22"/>
-        </w:rPr>
-        <w:t>═══════════════════════════════════════════════════════════════════════</w:t>
-      </w:r>
+      </w:pPr>
     </w:p>
     <w:p>
       <w:pPr>
@@ -11222,22 +13139,7 @@
     <w:p>
       <w:pPr>
         <w:spacing w:before="240" w:after="240"/>
-        <w:pBdr>
-          <w:bottom w:val="single" w:sz="6" w:space="1" w:color="CCCCCC"/>
-        </w:pBdr>
-      </w:pPr>
-    </w:p>
-    <w:p>
-      <w:r>
-        <w:rPr>
-          <w:rFonts w:ascii="Arial" w:hAnsi="Arial"/>
-          <w:b w:val="0"/>
-          <w:i w:val="0"/>
-          <w:color w:val="000000"/>
-          <w:sz w:val="22"/>
-        </w:rPr>
-        <w:t>═══════════════════════════════════════════════════════════════════════</w:t>
-      </w:r>
+      </w:pPr>
     </w:p>
     <w:p>
       <w:pPr>
@@ -11286,6 +13188,8 @@
     <w:p>
       <w:pPr>
         <w:spacing w:after="160" w:line="276" w:lineRule="auto"/>
+        <w:ind w:left="0" w:firstLine="0"/>
+        <w:jc w:val="left"/>
       </w:pPr>
       <w:r>
         <w:rPr>
@@ -11536,6 +13440,8 @@
     <w:p>
       <w:pPr>
         <w:spacing w:after="160" w:line="276" w:lineRule="auto"/>
+        <w:ind w:left="0" w:firstLine="0"/>
+        <w:jc w:val="left"/>
       </w:pPr>
       <w:r>
         <w:rPr>
@@ -12118,6 +14024,8 @@
     <w:p>
       <w:pPr>
         <w:spacing w:after="160" w:line="276" w:lineRule="auto"/>
+        <w:ind w:left="0" w:firstLine="0"/>
+        <w:jc w:val="left"/>
       </w:pPr>
       <w:r>
         <w:rPr>
@@ -12153,22 +14061,7 @@
     <w:p>
       <w:pPr>
         <w:spacing w:before="240" w:after="240"/>
-        <w:pBdr>
-          <w:bottom w:val="single" w:sz="6" w:space="1" w:color="CCCCCC"/>
-        </w:pBdr>
-      </w:pPr>
-    </w:p>
-    <w:p>
-      <w:r>
-        <w:rPr>
-          <w:rFonts w:ascii="Arial" w:hAnsi="Arial"/>
-          <w:b w:val="0"/>
-          <w:i w:val="0"/>
-          <w:color w:val="000000"/>
-          <w:sz w:val="22"/>
-        </w:rPr>
-        <w:t>═══════════════════════════════════════════════════════════════════════</w:t>
-      </w:r>
+      </w:pPr>
     </w:p>
     <w:p>
       <w:pPr>
@@ -12885,22 +14778,7 @@
     <w:p>
       <w:pPr>
         <w:spacing w:before="240" w:after="240"/>
-        <w:pBdr>
-          <w:bottom w:val="single" w:sz="6" w:space="1" w:color="CCCCCC"/>
-        </w:pBdr>
-      </w:pPr>
-    </w:p>
-    <w:p>
-      <w:r>
-        <w:rPr>
-          <w:rFonts w:ascii="Arial" w:hAnsi="Arial"/>
-          <w:b w:val="0"/>
-          <w:i w:val="0"/>
-          <w:color w:val="000000"/>
-          <w:sz w:val="22"/>
-        </w:rPr>
-        <w:t>═══════════════════════════════════════════════════════════════════════</w:t>
-      </w:r>
+      </w:pPr>
     </w:p>
     <w:p>
       <w:pPr>
@@ -13111,6 +14989,8 @@
     <w:p>
       <w:pPr>
         <w:spacing w:after="160" w:line="276" w:lineRule="auto"/>
+        <w:ind w:left="0" w:firstLine="0"/>
+        <w:jc w:val="left"/>
       </w:pPr>
       <w:r>
         <w:rPr>
@@ -13208,22 +15088,7 @@
     <w:p>
       <w:pPr>
         <w:spacing w:before="240" w:after="240"/>
-        <w:pBdr>
-          <w:bottom w:val="single" w:sz="6" w:space="1" w:color="CCCCCC"/>
-        </w:pBdr>
-      </w:pPr>
-    </w:p>
-    <w:p>
-      <w:r>
-        <w:rPr>
-          <w:rFonts w:ascii="Arial" w:hAnsi="Arial"/>
-          <w:b w:val="0"/>
-          <w:i w:val="0"/>
-          <w:color w:val="000000"/>
-          <w:sz w:val="22"/>
-        </w:rPr>
-        <w:t>═══════════════════════════════════════════════════════════════════════</w:t>
-      </w:r>
+      </w:pPr>
     </w:p>
     <w:p>
       <w:pPr>
@@ -13765,11 +15630,13 @@
     </w:tbl>
     <w:p>
       <w:pPr>
+        <w:ind w:left="0" w:firstLine="0"/>
+        <w:jc w:val="left"/>
         <w:shd w:val="clear" w:color="auto" w:fill="EFF6FF"/>
         <w:pBdr>
           <w:left w:val="single" w:sz="18" w:space="6" w:color="1155cc"/>
         </w:pBdr>
-        <w:ind w:left="120"/>
+        <w:ind w:left="0"/>
       </w:pPr>
       <w:r>
         <w:rPr>
@@ -13784,11 +15651,13 @@
     </w:p>
     <w:p>
       <w:pPr>
+        <w:ind w:left="0" w:firstLine="0"/>
+        <w:jc w:val="left"/>
         <w:shd w:val="clear" w:color="auto" w:fill="EFF6FF"/>
         <w:pBdr>
           <w:left w:val="single" w:sz="18" w:space="6" w:color="1155cc"/>
         </w:pBdr>
-        <w:ind w:left="120"/>
+        <w:ind w:left="0"/>
       </w:pPr>
       <w:r>
         <w:rPr>
@@ -13841,6 +15710,8 @@
     <w:p>
       <w:pPr>
         <w:spacing w:after="160" w:line="276" w:lineRule="auto"/>
+        <w:ind w:left="0" w:firstLine="0"/>
+        <w:jc w:val="left"/>
       </w:pPr>
       <w:r>
         <w:rPr>
@@ -13958,22 +15829,7 @@
     <w:p>
       <w:pPr>
         <w:spacing w:before="240" w:after="240"/>
-        <w:pBdr>
-          <w:bottom w:val="single" w:sz="6" w:space="1" w:color="CCCCCC"/>
-        </w:pBdr>
-      </w:pPr>
-    </w:p>
-    <w:p>
-      <w:r>
-        <w:rPr>
-          <w:rFonts w:ascii="Arial" w:hAnsi="Arial"/>
-          <w:b w:val="0"/>
-          <w:i w:val="0"/>
-          <w:color w:val="000000"/>
-          <w:sz w:val="22"/>
-        </w:rPr>
-        <w:t>═══════════════════════════════════════════════════════════════════════</w:t>
-      </w:r>
+      </w:pPr>
     </w:p>
     <w:p>
       <w:pPr>
@@ -14137,22 +15993,7 @@
     <w:p>
       <w:pPr>
         <w:spacing w:before="240" w:after="240"/>
-        <w:pBdr>
-          <w:bottom w:val="single" w:sz="6" w:space="1" w:color="CCCCCC"/>
-        </w:pBdr>
-      </w:pPr>
-    </w:p>
-    <w:p>
-      <w:r>
-        <w:rPr>
-          <w:rFonts w:ascii="Arial" w:hAnsi="Arial"/>
-          <w:b w:val="0"/>
-          <w:i w:val="0"/>
-          <w:color w:val="000000"/>
-          <w:sz w:val="22"/>
-        </w:rPr>
-        <w:t>═══════════════════════════════════════════════════════════════════════</w:t>
-      </w:r>
+      </w:pPr>
     </w:p>
     <w:p>
       <w:pPr>
@@ -14514,22 +16355,7 @@
     <w:p>
       <w:pPr>
         <w:spacing w:before="240" w:after="240"/>
-        <w:pBdr>
-          <w:bottom w:val="single" w:sz="6" w:space="1" w:color="CCCCCC"/>
-        </w:pBdr>
-      </w:pPr>
-    </w:p>
-    <w:p>
-      <w:r>
-        <w:rPr>
-          <w:rFonts w:ascii="Arial" w:hAnsi="Arial"/>
-          <w:b w:val="0"/>
-          <w:i w:val="0"/>
-          <w:color w:val="000000"/>
-          <w:sz w:val="22"/>
-        </w:rPr>
-        <w:t>═══════════════════════════════════════════════════════════════════════</w:t>
-      </w:r>
+      </w:pPr>
     </w:p>
     <w:p>
       <w:pPr>
@@ -14987,22 +16813,7 @@
     <w:p>
       <w:pPr>
         <w:spacing w:before="240" w:after="240"/>
-        <w:pBdr>
-          <w:bottom w:val="single" w:sz="6" w:space="1" w:color="CCCCCC"/>
-        </w:pBdr>
-      </w:pPr>
-    </w:p>
-    <w:p>
-      <w:r>
-        <w:rPr>
-          <w:rFonts w:ascii="Arial" w:hAnsi="Arial"/>
-          <w:b w:val="0"/>
-          <w:i w:val="0"/>
-          <w:color w:val="000000"/>
-          <w:sz w:val="22"/>
-        </w:rPr>
-        <w:t>═══════════════════════════════════════════════════════════════════════</w:t>
-      </w:r>
+      </w:pPr>
     </w:p>
     <w:p>
       <w:pPr>
@@ -15067,11 +16878,13 @@
     </w:p>
     <w:p>
       <w:pPr>
+        <w:ind w:left="0" w:firstLine="0"/>
+        <w:jc w:val="left"/>
         <w:shd w:val="clear" w:color="auto" w:fill="EFF6FF"/>
         <w:pBdr>
           <w:left w:val="single" w:sz="18" w:space="6" w:color="1155cc"/>
         </w:pBdr>
-        <w:ind w:left="120"/>
+        <w:ind w:left="0"/>
       </w:pPr>
       <w:r>
         <w:rPr>
@@ -15086,11 +16899,13 @@
     </w:p>
     <w:p>
       <w:pPr>
+        <w:ind w:left="0" w:firstLine="0"/>
+        <w:jc w:val="left"/>
         <w:shd w:val="clear" w:color="auto" w:fill="EFF6FF"/>
         <w:pBdr>
           <w:left w:val="single" w:sz="18" w:space="6" w:color="1155cc"/>
         </w:pBdr>
-        <w:ind w:left="120"/>
+        <w:ind w:left="0"/>
       </w:pPr>
       <w:r>
         <w:rPr>

</xml_diff>